<commit_message>
Add List of Non-Identical Provisions after the identical-provisions list
29-entry summary table in the same style as the identical-provisions
table, fulfilling the document's stated three-section structure.

Co-Authored-By: Claude Fable 5 <noreply@anthropic.com>
Claude-Session: https://claude.ai/code/session_01JPzxLJCqu7ynMjqaCPY5Jt
</commit_message>
<xml_diff>
--- a/Comparative Between MAS Guidelines on Outsourcing For Banks Against Financial Institutions.docx
+++ b/Comparative Between MAS Guidelines on Outsourcing For Banks Against Financial Institutions.docx
@@ -1679,6 +1679,2321 @@
                 <w:szCs w:val="18"/>
               </w:rPr>
               <w:t>Annex 5</w:t>
+            </w:r>
+          </w:p>
+        </w:tc>
+      </w:tr>
+    </w:tbl>
+    <w:p>
+      <w:pPr>
+        <w:pStyle w:val="BodyText1"/>
+        <w:ind w:left="0"/>
+      </w:pPr>
+    </w:p>
+    <w:p>
+      <w:pPr>
+        <w:pStyle w:val="Level1Heading"/>
+        <w:rPr>
+          <w:rFonts w:asciiTheme="majorHAnsi" w:hAnsiTheme="majorHAnsi" w:cstheme="majorHAnsi"/>
+          <w:iCs/>
+          <w:sz w:val="18"/>
+          <w:szCs w:val="18"/>
+        </w:rPr>
+      </w:pPr>
+      <w:r>
+        <w:rPr>
+          <w:rFonts w:asciiTheme="majorHAnsi" w:hAnsiTheme="majorHAnsi" w:cstheme="majorHAnsi"/>
+          <w:iCs/>
+          <w:sz w:val="18"/>
+          <w:szCs w:val="18"/>
+        </w:rPr>
+        <w:lastRenderedPageBreak/>
+        <w:t xml:space="preserve">List of Non-Identical Provisions</w:t>
+      </w:r>
+    </w:p>
+    <w:p>
+      <w:pPr>
+        <w:pStyle w:val="BodyText1"/>
+        <w:ind w:left="0"/>
+      </w:pPr>
+      <w:r>
+        <w:t xml:space="preserve">The provisions in this section differ in substance between the two documents, or appear in only one of them. The precise differences are set out in the comparative table below.</w:t>
+      </w:r>
+    </w:p>
+    <w:tbl>
+      <w:tblPr>
+        <w:tblStyle w:val="TableGrid"/>
+        <w:tblW w:w="6841" w:type="dxa"/>
+        <w:tblLayout w:type="fixed"/>
+        <w:tblLook w:val="04A0" w:firstRow="1" w:lastRow="0" w:firstColumn="1" w:lastColumn="0" w:noHBand="0" w:noVBand="1"/>
+      </w:tblPr>
+      <w:tblGrid>
+        <w:gridCol w:w="2127"/>
+        <w:gridCol w:w="2357"/>
+        <w:gridCol w:w="2357"/>
+      </w:tblGrid>
+      <w:tr>
+        <w:trPr>
+          <w:trHeight w:val="664"/>
+          <w:tblHeader/>
+        </w:trPr>
+        <w:tc>
+          <w:tcPr>
+            <w:tcW w:w="2127" w:type="dxa"/>
+            <w:shd w:val="clear" w:color="auto" w:fill="808080" w:themeFill="background1" w:themeFillShade="80"/>
+          </w:tcPr>
+          <w:p>
+            <w:pPr>
+              <w:spacing w:before="60" w:after="60"/>
+              <w:jc w:val="center"/>
+              <w:rPr>
+                <w:rFonts w:asciiTheme="majorHAnsi" w:hAnsiTheme="majorHAnsi" w:cstheme="majorHAnsi"/>
+                <w:b/>
+                <w:color w:val="FFFFFF" w:themeColor="background1"/>
+                <w:sz w:val="18"/>
+                <w:szCs w:val="18"/>
+              </w:rPr>
+            </w:pPr>
+            <w:r>
+              <w:rPr>
+                <w:rFonts w:asciiTheme="majorHAnsi" w:hAnsiTheme="majorHAnsi" w:cstheme="majorHAnsi"/>
+                <w:b/>
+                <w:color w:val="FFFFFF" w:themeColor="background1"/>
+                <w:sz w:val="18"/>
+                <w:szCs w:val="18"/>
+              </w:rPr>
+              <w:t>Purpose of Provision</w:t>
+            </w:r>
+          </w:p>
+        </w:tc>
+        <w:tc>
+          <w:tcPr>
+            <w:tcW w:w="2357" w:type="dxa"/>
+            <w:shd w:val="clear" w:color="auto" w:fill="808080" w:themeFill="background1" w:themeFillShade="80"/>
+          </w:tcPr>
+          <w:p>
+            <w:pPr>
+              <w:spacing w:before="60" w:after="60"/>
+              <w:rPr>
+                <w:rFonts w:asciiTheme="majorHAnsi" w:hAnsiTheme="majorHAnsi" w:cstheme="majorHAnsi"/>
+                <w:b/>
+                <w:color w:val="FFFFFF" w:themeColor="background1"/>
+                <w:sz w:val="18"/>
+                <w:szCs w:val="18"/>
+              </w:rPr>
+            </w:pPr>
+            <w:r>
+              <w:rPr>
+                <w:rFonts w:asciiTheme="majorHAnsi" w:hAnsiTheme="majorHAnsi" w:cstheme="majorHAnsi"/>
+                <w:b/>
+                <w:color w:val="FFFFFF" w:themeColor="background1"/>
+                <w:sz w:val="18"/>
+                <w:szCs w:val="18"/>
+              </w:rPr>
+              <w:t>Relevant Section in Bank Guideline</w:t>
+            </w:r>
+          </w:p>
+        </w:tc>
+        <w:tc>
+          <w:tcPr>
+            <w:tcW w:w="2357" w:type="dxa"/>
+            <w:shd w:val="clear" w:color="auto" w:fill="808080" w:themeFill="background1" w:themeFillShade="80"/>
+          </w:tcPr>
+          <w:p>
+            <w:pPr>
+              <w:spacing w:before="60" w:after="60"/>
+              <w:rPr>
+                <w:rFonts w:asciiTheme="majorHAnsi" w:hAnsiTheme="majorHAnsi" w:cstheme="majorHAnsi"/>
+                <w:b/>
+                <w:color w:val="FFFFFF" w:themeColor="background1"/>
+                <w:sz w:val="18"/>
+                <w:szCs w:val="18"/>
+              </w:rPr>
+            </w:pPr>
+            <w:r>
+              <w:rPr>
+                <w:rFonts w:asciiTheme="majorHAnsi" w:hAnsiTheme="majorHAnsi" w:cstheme="majorHAnsi"/>
+                <w:b/>
+                <w:color w:val="FFFFFF" w:themeColor="background1"/>
+                <w:sz w:val="18"/>
+                <w:szCs w:val="18"/>
+              </w:rPr>
+              <w:t>Relevant Section in FI Guideline</w:t>
+            </w:r>
+          </w:p>
+        </w:tc>
+      </w:tr>
+      <w:tr>
+        <w:trPr>
+          <w:trHeight w:val="377"/>
+        </w:trPr>
+        <w:tc>
+          <w:tcPr>
+            <w:tcW w:w="2127" w:type="dxa"/>
+          </w:tcPr>
+          <w:p>
+            <w:pPr>
+              <w:spacing w:line="276" w:lineRule="auto"/>
+              <w:rPr>
+                <w:rFonts w:asciiTheme="majorHAnsi" w:hAnsiTheme="majorHAnsi" w:cstheme="majorHAnsi"/>
+                <w:sz w:val="18"/>
+                <w:szCs w:val="18"/>
+                <w:lang w:val="en-US"/>
+              </w:rPr>
+            </w:pPr>
+            <w:r>
+              <w:rPr>
+                <w:rFonts w:asciiTheme="majorHAnsi" w:hAnsiTheme="majorHAnsi" w:cstheme="majorHAnsi"/>
+                <w:sz w:val="18"/>
+                <w:szCs w:val="18"/>
+              </w:rPr>
+              <w:t xml:space="preserve">Scope – definition of “outsourcing arrangement”</w:t>
+            </w:r>
+          </w:p>
+        </w:tc>
+        <w:tc>
+          <w:tcPr>
+            <w:tcW w:w="2357" w:type="dxa"/>
+          </w:tcPr>
+          <w:p>
+            <w:pPr>
+              <w:pStyle w:val="BodyText"/>
+              <w:rPr>
+                <w:rFonts w:asciiTheme="majorHAnsi" w:hAnsiTheme="majorHAnsi" w:cstheme="majorHAnsi"/>
+                <w:sz w:val="18"/>
+                <w:szCs w:val="18"/>
+              </w:rPr>
+            </w:pPr>
+            <w:r>
+              <w:rPr>
+                <w:rFonts w:asciiTheme="majorHAnsi" w:hAnsiTheme="majorHAnsi" w:cstheme="majorHAnsi"/>
+                <w:sz w:val="18"/>
+                <w:szCs w:val="18"/>
+              </w:rPr>
+              <w:t xml:space="preserve">1.2 (via the Notices; disjunctive test with a more-than-12-month “ongoing” threshold)</w:t>
+            </w:r>
+          </w:p>
+        </w:tc>
+        <w:tc>
+          <w:tcPr>
+            <w:tcW w:w="2357" w:type="dxa"/>
+          </w:tcPr>
+          <w:p>
+            <w:pPr>
+              <w:pStyle w:val="BodyText"/>
+              <w:rPr>
+                <w:rFonts w:asciiTheme="majorHAnsi" w:hAnsiTheme="majorHAnsi" w:cstheme="majorHAnsi"/>
+                <w:sz w:val="18"/>
+                <w:szCs w:val="18"/>
+              </w:rPr>
+            </w:pPr>
+            <w:r>
+              <w:rPr>
+                <w:rFonts w:asciiTheme="majorHAnsi" w:hAnsiTheme="majorHAnsi" w:cstheme="majorHAnsi"/>
+                <w:sz w:val="18"/>
+                <w:szCs w:val="18"/>
+              </w:rPr>
+              <w:t xml:space="preserve">1.2 and Section 3 (conjunctive test; no duration threshold)</w:t>
+            </w:r>
+          </w:p>
+        </w:tc>
+      </w:tr>
+      <w:tr>
+        <w:trPr>
+          <w:trHeight w:val="377"/>
+        </w:trPr>
+        <w:tc>
+          <w:tcPr>
+            <w:tcW w:w="2127" w:type="dxa"/>
+          </w:tcPr>
+          <w:p>
+            <w:pPr>
+              <w:spacing w:line="276" w:lineRule="auto"/>
+              <w:rPr>
+                <w:rFonts w:asciiTheme="majorHAnsi" w:hAnsiTheme="majorHAnsi" w:cstheme="majorHAnsi"/>
+                <w:sz w:val="18"/>
+                <w:szCs w:val="18"/>
+                <w:lang w:val="en-US"/>
+              </w:rPr>
+            </w:pPr>
+            <w:r>
+              <w:rPr>
+                <w:rFonts w:asciiTheme="majorHAnsi" w:hAnsiTheme="majorHAnsi" w:cstheme="majorHAnsi"/>
+                <w:sz w:val="18"/>
+                <w:szCs w:val="18"/>
+              </w:rPr>
+              <w:t xml:space="preserve">Definitions</w:t>
+            </w:r>
+          </w:p>
+        </w:tc>
+        <w:tc>
+          <w:tcPr>
+            <w:tcW w:w="2357" w:type="dxa"/>
+          </w:tcPr>
+          <w:p>
+            <w:pPr>
+              <w:pStyle w:val="BodyText"/>
+              <w:rPr>
+                <w:rFonts w:asciiTheme="majorHAnsi" w:hAnsiTheme="majorHAnsi" w:cstheme="majorHAnsi"/>
+                <w:sz w:val="18"/>
+                <w:szCs w:val="18"/>
+              </w:rPr>
+            </w:pPr>
+            <w:r>
+              <w:rPr>
+                <w:rFonts w:asciiTheme="majorHAnsi" w:hAnsiTheme="majorHAnsi" w:cstheme="majorHAnsi"/>
+                <w:sz w:val="18"/>
+                <w:szCs w:val="18"/>
+              </w:rPr>
+              <w:t xml:space="preserve">None (definitions are in the Notices)</w:t>
+            </w:r>
+          </w:p>
+        </w:tc>
+        <w:tc>
+          <w:tcPr>
+            <w:tcW w:w="2357" w:type="dxa"/>
+          </w:tcPr>
+          <w:p>
+            <w:pPr>
+              <w:pStyle w:val="BodyText"/>
+              <w:rPr>
+                <w:rFonts w:asciiTheme="majorHAnsi" w:hAnsiTheme="majorHAnsi" w:cstheme="majorHAnsi"/>
+                <w:sz w:val="18"/>
+                <w:szCs w:val="18"/>
+              </w:rPr>
+            </w:pPr>
+            <w:r>
+              <w:rPr>
+                <w:rFonts w:asciiTheme="majorHAnsi" w:hAnsiTheme="majorHAnsi" w:cstheme="majorHAnsi"/>
+                <w:sz w:val="18"/>
+                <w:szCs w:val="18"/>
+              </w:rPr>
+              <w:t xml:space="preserve">Section 3</w:t>
+            </w:r>
+          </w:p>
+        </w:tc>
+      </w:tr>
+      <w:tr>
+        <w:trPr>
+          <w:trHeight w:val="377"/>
+        </w:trPr>
+        <w:tc>
+          <w:tcPr>
+            <w:tcW w:w="2127" w:type="dxa"/>
+          </w:tcPr>
+          <w:p>
+            <w:pPr>
+              <w:spacing w:line="276" w:lineRule="auto"/>
+              <w:rPr>
+                <w:rFonts w:asciiTheme="majorHAnsi" w:hAnsiTheme="majorHAnsi" w:cstheme="majorHAnsi"/>
+                <w:sz w:val="18"/>
+                <w:szCs w:val="18"/>
+                <w:lang w:val="en-US"/>
+              </w:rPr>
+            </w:pPr>
+            <w:r>
+              <w:rPr>
+                <w:rFonts w:asciiTheme="majorHAnsi" w:hAnsiTheme="majorHAnsi" w:cstheme="majorHAnsi"/>
+                <w:sz w:val="18"/>
+                <w:szCs w:val="18"/>
+              </w:rPr>
+              <w:t xml:space="preserve">Group-wide observance duty</w:t>
+            </w:r>
+          </w:p>
+        </w:tc>
+        <w:tc>
+          <w:tcPr>
+            <w:tcW w:w="2357" w:type="dxa"/>
+          </w:tcPr>
+          <w:p>
+            <w:pPr>
+              <w:pStyle w:val="BodyText"/>
+              <w:rPr>
+                <w:rFonts w:asciiTheme="majorHAnsi" w:hAnsiTheme="majorHAnsi" w:cstheme="majorHAnsi"/>
+                <w:sz w:val="18"/>
+                <w:szCs w:val="18"/>
+              </w:rPr>
+            </w:pPr>
+            <w:r>
+              <w:rPr>
+                <w:rFonts w:asciiTheme="majorHAnsi" w:hAnsiTheme="majorHAnsi" w:cstheme="majorHAnsi"/>
+                <w:sz w:val="18"/>
+                <w:szCs w:val="18"/>
+              </w:rPr>
+              <w:t xml:space="preserve">None</w:t>
+            </w:r>
+          </w:p>
+        </w:tc>
+        <w:tc>
+          <w:tcPr>
+            <w:tcW w:w="2357" w:type="dxa"/>
+          </w:tcPr>
+          <w:p>
+            <w:pPr>
+              <w:pStyle w:val="BodyText"/>
+              <w:rPr>
+                <w:rFonts w:asciiTheme="majorHAnsi" w:hAnsiTheme="majorHAnsi" w:cstheme="majorHAnsi"/>
+                <w:sz w:val="18"/>
+                <w:szCs w:val="18"/>
+              </w:rPr>
+            </w:pPr>
+            <w:r>
+              <w:rPr>
+                <w:rFonts w:asciiTheme="majorHAnsi" w:hAnsiTheme="majorHAnsi" w:cstheme="majorHAnsi"/>
+                <w:sz w:val="18"/>
+                <w:szCs w:val="18"/>
+              </w:rPr>
+              <w:t xml:space="preserve">2.3</w:t>
+            </w:r>
+          </w:p>
+        </w:tc>
+      </w:tr>
+      <w:tr>
+        <w:trPr>
+          <w:trHeight w:val="377"/>
+        </w:trPr>
+        <w:tc>
+          <w:tcPr>
+            <w:tcW w:w="2127" w:type="dxa"/>
+          </w:tcPr>
+          <w:p>
+            <w:pPr>
+              <w:spacing w:line="276" w:lineRule="auto"/>
+              <w:rPr>
+                <w:rFonts w:asciiTheme="majorHAnsi" w:hAnsiTheme="majorHAnsi" w:cstheme="majorHAnsi"/>
+                <w:sz w:val="18"/>
+                <w:szCs w:val="18"/>
+                <w:lang w:val="en-US"/>
+              </w:rPr>
+            </w:pPr>
+            <w:r>
+              <w:rPr>
+                <w:rFonts w:asciiTheme="majorHAnsi" w:hAnsiTheme="majorHAnsi" w:cstheme="majorHAnsi"/>
+                <w:sz w:val="18"/>
+                <w:szCs w:val="18"/>
+              </w:rPr>
+              <w:t xml:space="preserve">Reference to the MAS Information Paper on third-party arrangements</w:t>
+            </w:r>
+          </w:p>
+        </w:tc>
+        <w:tc>
+          <w:tcPr>
+            <w:tcW w:w="2357" w:type="dxa"/>
+          </w:tcPr>
+          <w:p>
+            <w:pPr>
+              <w:pStyle w:val="BodyText"/>
+              <w:rPr>
+                <w:rFonts w:asciiTheme="majorHAnsi" w:hAnsiTheme="majorHAnsi" w:cstheme="majorHAnsi"/>
+                <w:sz w:val="18"/>
+                <w:szCs w:val="18"/>
+              </w:rPr>
+            </w:pPr>
+            <w:r>
+              <w:rPr>
+                <w:rFonts w:asciiTheme="majorHAnsi" w:hAnsiTheme="majorHAnsi" w:cstheme="majorHAnsi"/>
+                <w:sz w:val="18"/>
+                <w:szCs w:val="18"/>
+              </w:rPr>
+              <w:t xml:space="preserve">Footnote 3 to 1.5</w:t>
+            </w:r>
+          </w:p>
+        </w:tc>
+        <w:tc>
+          <w:tcPr>
+            <w:tcW w:w="2357" w:type="dxa"/>
+          </w:tcPr>
+          <w:p>
+            <w:pPr>
+              <w:pStyle w:val="BodyText"/>
+              <w:rPr>
+                <w:rFonts w:asciiTheme="majorHAnsi" w:hAnsiTheme="majorHAnsi" w:cstheme="majorHAnsi"/>
+                <w:sz w:val="18"/>
+                <w:szCs w:val="18"/>
+              </w:rPr>
+            </w:pPr>
+            <w:r>
+              <w:rPr>
+                <w:rFonts w:asciiTheme="majorHAnsi" w:hAnsiTheme="majorHAnsi" w:cstheme="majorHAnsi"/>
+                <w:sz w:val="18"/>
+                <w:szCs w:val="18"/>
+              </w:rPr>
+              <w:t xml:space="preserve">None</w:t>
+            </w:r>
+          </w:p>
+        </w:tc>
+      </w:tr>
+      <w:tr>
+        <w:trPr>
+          <w:trHeight w:val="377"/>
+        </w:trPr>
+        <w:tc>
+          <w:tcPr>
+            <w:tcW w:w="2127" w:type="dxa"/>
+          </w:tcPr>
+          <w:p>
+            <w:pPr>
+              <w:spacing w:line="276" w:lineRule="auto"/>
+              <w:rPr>
+                <w:rFonts w:asciiTheme="majorHAnsi" w:hAnsiTheme="majorHAnsi" w:cstheme="majorHAnsi"/>
+                <w:sz w:val="18"/>
+                <w:szCs w:val="18"/>
+                <w:lang w:val="en-US"/>
+              </w:rPr>
+            </w:pPr>
+            <w:r>
+              <w:rPr>
+                <w:rFonts w:asciiTheme="majorHAnsi" w:hAnsiTheme="majorHAnsi" w:cstheme="majorHAnsi"/>
+                <w:sz w:val="18"/>
+                <w:szCs w:val="18"/>
+              </w:rPr>
+              <w:t xml:space="preserve">Register submission to MAS</w:t>
+            </w:r>
+          </w:p>
+        </w:tc>
+        <w:tc>
+          <w:tcPr>
+            <w:tcW w:w="2357" w:type="dxa"/>
+          </w:tcPr>
+          <w:p>
+            <w:pPr>
+              <w:pStyle w:val="BodyText"/>
+              <w:rPr>
+                <w:rFonts w:asciiTheme="majorHAnsi" w:hAnsiTheme="majorHAnsi" w:cstheme="majorHAnsi"/>
+                <w:sz w:val="18"/>
+                <w:szCs w:val="18"/>
+              </w:rPr>
+            </w:pPr>
+            <w:r>
+              <w:rPr>
+                <w:rFonts w:asciiTheme="majorHAnsi" w:hAnsiTheme="majorHAnsi" w:cstheme="majorHAnsi"/>
+                <w:sz w:val="18"/>
+                <w:szCs w:val="18"/>
+              </w:rPr>
+              <w:t xml:space="preserve">Footnote 21 to 3.8.2(a) (template link; no stated frequency)</w:t>
+            </w:r>
+          </w:p>
+        </w:tc>
+        <w:tc>
+          <w:tcPr>
+            <w:tcW w:w="2357" w:type="dxa"/>
+          </w:tcPr>
+          <w:p>
+            <w:pPr>
+              <w:pStyle w:val="BodyText"/>
+              <w:rPr>
+                <w:rFonts w:asciiTheme="majorHAnsi" w:hAnsiTheme="majorHAnsi" w:cstheme="majorHAnsi"/>
+                <w:sz w:val="18"/>
+                <w:szCs w:val="18"/>
+              </w:rPr>
+            </w:pPr>
+            <w:r>
+              <w:rPr>
+                <w:rFonts w:asciiTheme="majorHAnsi" w:hAnsiTheme="majorHAnsi" w:cstheme="majorHAnsi"/>
+                <w:sz w:val="18"/>
+                <w:szCs w:val="18"/>
+              </w:rPr>
+              <w:t xml:space="preserve">4.1.1 and Annex 4 (at least annually or upon request)</w:t>
+            </w:r>
+          </w:p>
+        </w:tc>
+      </w:tr>
+      <w:tr>
+        <w:trPr>
+          <w:trHeight w:val="377"/>
+        </w:trPr>
+        <w:tc>
+          <w:tcPr>
+            <w:tcW w:w="2127" w:type="dxa"/>
+          </w:tcPr>
+          <w:p>
+            <w:pPr>
+              <w:spacing w:line="276" w:lineRule="auto"/>
+              <w:rPr>
+                <w:rFonts w:asciiTheme="majorHAnsi" w:hAnsiTheme="majorHAnsi" w:cstheme="majorHAnsi"/>
+                <w:sz w:val="18"/>
+                <w:szCs w:val="18"/>
+                <w:lang w:val="en-US"/>
+              </w:rPr>
+            </w:pPr>
+            <w:r>
+              <w:rPr>
+                <w:rFonts w:asciiTheme="majorHAnsi" w:hAnsiTheme="majorHAnsi" w:cstheme="majorHAnsi"/>
+                <w:sz w:val="18"/>
+                <w:szCs w:val="18"/>
+              </w:rPr>
+              <w:t xml:space="preserve">MAS powers over a live arrangement</w:t>
+            </w:r>
+          </w:p>
+        </w:tc>
+        <w:tc>
+          <w:tcPr>
+            <w:tcW w:w="2357" w:type="dxa"/>
+          </w:tcPr>
+          <w:p>
+            <w:pPr>
+              <w:pStyle w:val="BodyText"/>
+              <w:rPr>
+                <w:rFonts w:asciiTheme="majorHAnsi" w:hAnsiTheme="majorHAnsi" w:cstheme="majorHAnsi"/>
+                <w:sz w:val="18"/>
+                <w:szCs w:val="18"/>
+              </w:rPr>
+            </w:pPr>
+            <w:r>
+              <w:rPr>
+                <w:rFonts w:asciiTheme="majorHAnsi" w:hAnsiTheme="majorHAnsi" w:cstheme="majorHAnsi"/>
+                <w:sz w:val="18"/>
+                <w:szCs w:val="18"/>
+              </w:rPr>
+              <w:t xml:space="preserve">3.4.5 – 3.4.6 (MAS-directed termination)</w:t>
+            </w:r>
+          </w:p>
+        </w:tc>
+        <w:tc>
+          <w:tcPr>
+            <w:tcW w:w="2357" w:type="dxa"/>
+          </w:tcPr>
+          <w:p>
+            <w:pPr>
+              <w:pStyle w:val="BodyText"/>
+              <w:rPr>
+                <w:rFonts w:asciiTheme="majorHAnsi" w:hAnsiTheme="majorHAnsi" w:cstheme="majorHAnsi"/>
+                <w:sz w:val="18"/>
+                <w:szCs w:val="18"/>
+              </w:rPr>
+            </w:pPr>
+            <w:r>
+              <w:rPr>
+                <w:rFonts w:asciiTheme="majorHAnsi" w:hAnsiTheme="majorHAnsi" w:cstheme="majorHAnsi"/>
+                <w:sz w:val="18"/>
+                <w:szCs w:val="18"/>
+              </w:rPr>
+              <w:t xml:space="preserve">4.1.3 (modify, alternative arrangements or re-integration)</w:t>
+            </w:r>
+          </w:p>
+        </w:tc>
+      </w:tr>
+      <w:tr>
+        <w:trPr>
+          <w:trHeight w:val="377"/>
+        </w:trPr>
+        <w:tc>
+          <w:tcPr>
+            <w:tcW w:w="2127" w:type="dxa"/>
+          </w:tcPr>
+          <w:p>
+            <w:pPr>
+              <w:spacing w:line="276" w:lineRule="auto"/>
+              <w:rPr>
+                <w:rFonts w:asciiTheme="majorHAnsi" w:hAnsiTheme="majorHAnsi" w:cstheme="majorHAnsi"/>
+                <w:sz w:val="18"/>
+                <w:szCs w:val="18"/>
+                <w:lang w:val="en-US"/>
+              </w:rPr>
+            </w:pPr>
+            <w:r>
+              <w:rPr>
+                <w:rFonts w:asciiTheme="majorHAnsi" w:hAnsiTheme="majorHAnsi" w:cstheme="majorHAnsi"/>
+                <w:sz w:val="18"/>
+                <w:szCs w:val="18"/>
+              </w:rPr>
+              <w:t xml:space="preserve">Supervisory overview</w:t>
+            </w:r>
+          </w:p>
+        </w:tc>
+        <w:tc>
+          <w:tcPr>
+            <w:tcW w:w="2357" w:type="dxa"/>
+          </w:tcPr>
+          <w:p>
+            <w:pPr>
+              <w:pStyle w:val="BodyText"/>
+              <w:rPr>
+                <w:rFonts w:asciiTheme="majorHAnsi" w:hAnsiTheme="majorHAnsi" w:cstheme="majorHAnsi"/>
+                <w:sz w:val="18"/>
+                <w:szCs w:val="18"/>
+              </w:rPr>
+            </w:pPr>
+            <w:r>
+              <w:rPr>
+                <w:rFonts w:asciiTheme="majorHAnsi" w:hAnsiTheme="majorHAnsi" w:cstheme="majorHAnsi"/>
+                <w:sz w:val="18"/>
+                <w:szCs w:val="18"/>
+              </w:rPr>
+              <w:t xml:space="preserve">None</w:t>
+            </w:r>
+          </w:p>
+        </w:tc>
+        <w:tc>
+          <w:tcPr>
+            <w:tcW w:w="2357" w:type="dxa"/>
+          </w:tcPr>
+          <w:p>
+            <w:pPr>
+              <w:pStyle w:val="BodyText"/>
+              <w:rPr>
+                <w:rFonts w:asciiTheme="majorHAnsi" w:hAnsiTheme="majorHAnsi" w:cstheme="majorHAnsi"/>
+                <w:sz w:val="18"/>
+                <w:szCs w:val="18"/>
+              </w:rPr>
+            </w:pPr>
+            <w:r>
+              <w:rPr>
+                <w:rFonts w:asciiTheme="majorHAnsi" w:hAnsiTheme="majorHAnsi" w:cstheme="majorHAnsi"/>
+                <w:sz w:val="18"/>
+                <w:szCs w:val="18"/>
+              </w:rPr>
+              <w:t xml:space="preserve">5.1.1</w:t>
+            </w:r>
+          </w:p>
+        </w:tc>
+      </w:tr>
+      <w:tr>
+        <w:trPr>
+          <w:trHeight w:val="377"/>
+        </w:trPr>
+        <w:tc>
+          <w:tcPr>
+            <w:tcW w:w="2127" w:type="dxa"/>
+          </w:tcPr>
+          <w:p>
+            <w:pPr>
+              <w:spacing w:line="276" w:lineRule="auto"/>
+              <w:rPr>
+                <w:rFonts w:asciiTheme="majorHAnsi" w:hAnsiTheme="majorHAnsi" w:cstheme="majorHAnsi"/>
+                <w:sz w:val="18"/>
+                <w:szCs w:val="18"/>
+                <w:lang w:val="en-US"/>
+              </w:rPr>
+            </w:pPr>
+            <w:r>
+              <w:rPr>
+                <w:rFonts w:asciiTheme="majorHAnsi" w:hAnsiTheme="majorHAnsi" w:cstheme="majorHAnsi"/>
+                <w:sz w:val="18"/>
+                <w:szCs w:val="18"/>
+              </w:rPr>
+              <w:t xml:space="preserve">Delegation of board functions for foreign-incorporated institutions</w:t>
+            </w:r>
+          </w:p>
+        </w:tc>
+        <w:tc>
+          <w:tcPr>
+            <w:tcW w:w="2357" w:type="dxa"/>
+          </w:tcPr>
+          <w:p>
+            <w:pPr>
+              <w:pStyle w:val="BodyText"/>
+              <w:rPr>
+                <w:rFonts w:asciiTheme="majorHAnsi" w:hAnsiTheme="majorHAnsi" w:cstheme="majorHAnsi"/>
+                <w:sz w:val="18"/>
+                <w:szCs w:val="18"/>
+              </w:rPr>
+            </w:pPr>
+            <w:r>
+              <w:rPr>
+                <w:rFonts w:asciiTheme="majorHAnsi" w:hAnsiTheme="majorHAnsi" w:cstheme="majorHAnsi"/>
+                <w:sz w:val="18"/>
+                <w:szCs w:val="18"/>
+              </w:rPr>
+              <w:t xml:space="preserve">None</w:t>
+            </w:r>
+          </w:p>
+        </w:tc>
+        <w:tc>
+          <w:tcPr>
+            <w:tcW w:w="2357" w:type="dxa"/>
+          </w:tcPr>
+          <w:p>
+            <w:pPr>
+              <w:pStyle w:val="BodyText"/>
+              <w:rPr>
+                <w:rFonts w:asciiTheme="majorHAnsi" w:hAnsiTheme="majorHAnsi" w:cstheme="majorHAnsi"/>
+                <w:sz w:val="18"/>
+                <w:szCs w:val="18"/>
+              </w:rPr>
+            </w:pPr>
+            <w:r>
+              <w:rPr>
+                <w:rFonts w:asciiTheme="majorHAnsi" w:hAnsiTheme="majorHAnsi" w:cstheme="majorHAnsi"/>
+                <w:sz w:val="18"/>
+                <w:szCs w:val="18"/>
+              </w:rPr>
+              <w:t xml:space="preserve">5.2.5 (opening sentence) and the Section 3 definition of “board”</w:t>
+            </w:r>
+          </w:p>
+        </w:tc>
+      </w:tr>
+      <w:tr>
+        <w:trPr>
+          <w:trHeight w:val="377"/>
+        </w:trPr>
+        <w:tc>
+          <w:tcPr>
+            <w:tcW w:w="2127" w:type="dxa"/>
+          </w:tcPr>
+          <w:p>
+            <w:pPr>
+              <w:spacing w:line="276" w:lineRule="auto"/>
+              <w:rPr>
+                <w:rFonts w:asciiTheme="majorHAnsi" w:hAnsiTheme="majorHAnsi" w:cstheme="majorHAnsi"/>
+                <w:sz w:val="18"/>
+                <w:szCs w:val="18"/>
+                <w:lang w:val="en-US"/>
+              </w:rPr>
+            </w:pPr>
+            <w:r>
+              <w:rPr>
+                <w:rFonts w:asciiTheme="majorHAnsi" w:hAnsiTheme="majorHAnsi" w:cstheme="majorHAnsi"/>
+                <w:sz w:val="18"/>
+                <w:szCs w:val="18"/>
+              </w:rPr>
+              <w:t xml:space="preserve">Legal advice on overseas disclosure of customer information</w:t>
+            </w:r>
+          </w:p>
+        </w:tc>
+        <w:tc>
+          <w:tcPr>
+            <w:tcW w:w="2357" w:type="dxa"/>
+          </w:tcPr>
+          <w:p>
+            <w:pPr>
+              <w:pStyle w:val="BodyText"/>
+              <w:rPr>
+                <w:rFonts w:asciiTheme="majorHAnsi" w:hAnsiTheme="majorHAnsi" w:cstheme="majorHAnsi"/>
+                <w:sz w:val="18"/>
+                <w:szCs w:val="18"/>
+              </w:rPr>
+            </w:pPr>
+            <w:r>
+              <w:rPr>
+                <w:rFonts w:asciiTheme="majorHAnsi" w:hAnsiTheme="majorHAnsi" w:cstheme="majorHAnsi"/>
+                <w:sz w:val="18"/>
+                <w:szCs w:val="18"/>
+              </w:rPr>
+              <w:t xml:space="preserve">3.2.3</w:t>
+            </w:r>
+          </w:p>
+        </w:tc>
+        <w:tc>
+          <w:tcPr>
+            <w:tcW w:w="2357" w:type="dxa"/>
+          </w:tcPr>
+          <w:p>
+            <w:pPr>
+              <w:pStyle w:val="BodyText"/>
+              <w:rPr>
+                <w:rFonts w:asciiTheme="majorHAnsi" w:hAnsiTheme="majorHAnsi" w:cstheme="majorHAnsi"/>
+                <w:sz w:val="18"/>
+                <w:szCs w:val="18"/>
+              </w:rPr>
+            </w:pPr>
+            <w:r>
+              <w:rPr>
+                <w:rFonts w:asciiTheme="majorHAnsi" w:hAnsiTheme="majorHAnsi" w:cstheme="majorHAnsi"/>
+                <w:sz w:val="18"/>
+                <w:szCs w:val="18"/>
+              </w:rPr>
+              <w:t xml:space="preserve">None</w:t>
+            </w:r>
+          </w:p>
+        </w:tc>
+      </w:tr>
+      <w:tr>
+        <w:trPr>
+          <w:trHeight w:val="377"/>
+        </w:trPr>
+        <w:tc>
+          <w:tcPr>
+            <w:tcW w:w="2127" w:type="dxa"/>
+          </w:tcPr>
+          <w:p>
+            <w:pPr>
+              <w:spacing w:line="276" w:lineRule="auto"/>
+              <w:rPr>
+                <w:rFonts w:asciiTheme="majorHAnsi" w:hAnsiTheme="majorHAnsi" w:cstheme="majorHAnsi"/>
+                <w:sz w:val="18"/>
+                <w:szCs w:val="18"/>
+                <w:lang w:val="en-US"/>
+              </w:rPr>
+            </w:pPr>
+            <w:r>
+              <w:rPr>
+                <w:rFonts w:asciiTheme="majorHAnsi" w:hAnsiTheme="majorHAnsi" w:cstheme="majorHAnsi"/>
+                <w:sz w:val="18"/>
+                <w:szCs w:val="18"/>
+              </w:rPr>
+              <w:t xml:space="preserve">Policies on frequency of checks</w:t>
+            </w:r>
+          </w:p>
+        </w:tc>
+        <w:tc>
+          <w:tcPr>
+            <w:tcW w:w="2357" w:type="dxa"/>
+          </w:tcPr>
+          <w:p>
+            <w:pPr>
+              <w:pStyle w:val="BodyText"/>
+              <w:rPr>
+                <w:rFonts w:asciiTheme="majorHAnsi" w:hAnsiTheme="majorHAnsi" w:cstheme="majorHAnsi"/>
+                <w:sz w:val="18"/>
+                <w:szCs w:val="18"/>
+              </w:rPr>
+            </w:pPr>
+            <w:r>
+              <w:rPr>
+                <w:rFonts w:asciiTheme="majorHAnsi" w:hAnsiTheme="majorHAnsi" w:cstheme="majorHAnsi"/>
+                <w:sz w:val="18"/>
+                <w:szCs w:val="18"/>
+              </w:rPr>
+              <w:t xml:space="preserve">3.3.6</w:t>
+            </w:r>
+          </w:p>
+        </w:tc>
+        <w:tc>
+          <w:tcPr>
+            <w:tcW w:w="2357" w:type="dxa"/>
+          </w:tcPr>
+          <w:p>
+            <w:pPr>
+              <w:pStyle w:val="BodyText"/>
+              <w:rPr>
+                <w:rFonts w:asciiTheme="majorHAnsi" w:hAnsiTheme="majorHAnsi" w:cstheme="majorHAnsi"/>
+                <w:sz w:val="18"/>
+                <w:szCs w:val="18"/>
+              </w:rPr>
+            </w:pPr>
+            <w:r>
+              <w:rPr>
+                <w:rFonts w:asciiTheme="majorHAnsi" w:hAnsiTheme="majorHAnsi" w:cstheme="majorHAnsi"/>
+                <w:sz w:val="18"/>
+                <w:szCs w:val="18"/>
+              </w:rPr>
+              <w:t xml:space="preserve">None (cf. 5.8.2(d))</w:t>
+            </w:r>
+          </w:p>
+        </w:tc>
+      </w:tr>
+      <w:tr>
+        <w:trPr>
+          <w:trHeight w:val="377"/>
+        </w:trPr>
+        <w:tc>
+          <w:tcPr>
+            <w:tcW w:w="2127" w:type="dxa"/>
+          </w:tcPr>
+          <w:p>
+            <w:pPr>
+              <w:spacing w:line="276" w:lineRule="auto"/>
+              <w:rPr>
+                <w:rFonts w:asciiTheme="majorHAnsi" w:hAnsiTheme="majorHAnsi" w:cstheme="majorHAnsi"/>
+                <w:sz w:val="18"/>
+                <w:szCs w:val="18"/>
+                <w:lang w:val="en-US"/>
+              </w:rPr>
+            </w:pPr>
+            <w:r>
+              <w:rPr>
+                <w:rFonts w:asciiTheme="majorHAnsi" w:hAnsiTheme="majorHAnsi" w:cstheme="majorHAnsi"/>
+                <w:sz w:val="18"/>
+                <w:szCs w:val="18"/>
+              </w:rPr>
+              <w:t xml:space="preserve">Outsourcing agreement checklist</w:t>
+            </w:r>
+          </w:p>
+        </w:tc>
+        <w:tc>
+          <w:tcPr>
+            <w:tcW w:w="2357" w:type="dxa"/>
+          </w:tcPr>
+          <w:p>
+            <w:pPr>
+              <w:pStyle w:val="BodyText"/>
+              <w:rPr>
+                <w:rFonts w:asciiTheme="majorHAnsi" w:hAnsiTheme="majorHAnsi" w:cstheme="majorHAnsi"/>
+                <w:sz w:val="18"/>
+                <w:szCs w:val="18"/>
+              </w:rPr>
+            </w:pPr>
+            <w:r>
+              <w:rPr>
+                <w:rFonts w:asciiTheme="majorHAnsi" w:hAnsiTheme="majorHAnsi" w:cstheme="majorHAnsi"/>
+                <w:sz w:val="18"/>
+                <w:szCs w:val="18"/>
+              </w:rPr>
+              <w:t xml:space="preserve">3.4.2 (ten items; Notices 7.1 requirements via footnotes 9 and 12)</w:t>
+            </w:r>
+          </w:p>
+        </w:tc>
+        <w:tc>
+          <w:tcPr>
+            <w:tcW w:w="2357" w:type="dxa"/>
+          </w:tcPr>
+          <w:p>
+            <w:pPr>
+              <w:pStyle w:val="BodyText"/>
+              <w:rPr>
+                <w:rFonts w:asciiTheme="majorHAnsi" w:hAnsiTheme="majorHAnsi" w:cstheme="majorHAnsi"/>
+                <w:sz w:val="18"/>
+                <w:szCs w:val="18"/>
+              </w:rPr>
+            </w:pPr>
+            <w:r>
+              <w:rPr>
+                <w:rFonts w:asciiTheme="majorHAnsi" w:hAnsiTheme="majorHAnsi" w:cstheme="majorHAnsi"/>
+                <w:sz w:val="18"/>
+                <w:szCs w:val="18"/>
+              </w:rPr>
+              <w:t xml:space="preserve">5.5.2 (eleven items, including (j) sub-contracting)</w:t>
+            </w:r>
+          </w:p>
+        </w:tc>
+      </w:tr>
+      <w:tr>
+        <w:trPr>
+          <w:trHeight w:val="377"/>
+        </w:trPr>
+        <w:tc>
+          <w:tcPr>
+            <w:tcW w:w="2127" w:type="dxa"/>
+          </w:tcPr>
+          <w:p>
+            <w:pPr>
+              <w:spacing w:line="276" w:lineRule="auto"/>
+              <w:rPr>
+                <w:rFonts w:asciiTheme="majorHAnsi" w:hAnsiTheme="majorHAnsi" w:cstheme="majorHAnsi"/>
+                <w:sz w:val="18"/>
+                <w:szCs w:val="18"/>
+                <w:lang w:val="en-US"/>
+              </w:rPr>
+            </w:pPr>
+            <w:r>
+              <w:rPr>
+                <w:rFonts w:asciiTheme="majorHAnsi" w:hAnsiTheme="majorHAnsi" w:cstheme="majorHAnsi"/>
+                <w:sz w:val="18"/>
+                <w:szCs w:val="18"/>
+              </w:rPr>
+              <w:t xml:space="preserve">Contractual termination triggers</w:t>
+            </w:r>
+          </w:p>
+        </w:tc>
+        <w:tc>
+          <w:tcPr>
+            <w:tcW w:w="2357" w:type="dxa"/>
+          </w:tcPr>
+          <w:p>
+            <w:pPr>
+              <w:pStyle w:val="BodyText"/>
+              <w:rPr>
+                <w:rFonts w:asciiTheme="majorHAnsi" w:hAnsiTheme="majorHAnsi" w:cstheme="majorHAnsi"/>
+                <w:sz w:val="18"/>
+                <w:szCs w:val="18"/>
+              </w:rPr>
+            </w:pPr>
+            <w:r>
+              <w:rPr>
+                <w:rFonts w:asciiTheme="majorHAnsi" w:hAnsiTheme="majorHAnsi" w:cstheme="majorHAnsi"/>
+                <w:sz w:val="18"/>
+                <w:szCs w:val="18"/>
+              </w:rPr>
+              <w:t xml:space="preserve">3.4.3 (confidentiality-centred; termination by reasonable notice)</w:t>
+            </w:r>
+          </w:p>
+        </w:tc>
+        <w:tc>
+          <w:tcPr>
+            <w:tcW w:w="2357" w:type="dxa"/>
+          </w:tcPr>
+          <w:p>
+            <w:pPr>
+              <w:pStyle w:val="BodyText"/>
+              <w:rPr>
+                <w:rFonts w:asciiTheme="majorHAnsi" w:hAnsiTheme="majorHAnsi" w:cstheme="majorHAnsi"/>
+                <w:sz w:val="18"/>
+                <w:szCs w:val="18"/>
+              </w:rPr>
+            </w:pPr>
+            <w:r>
+              <w:rPr>
+                <w:rFonts w:asciiTheme="majorHAnsi" w:hAnsiTheme="majorHAnsi" w:cstheme="majorHAnsi"/>
+                <w:sz w:val="18"/>
+                <w:szCs w:val="18"/>
+              </w:rPr>
+              <w:t xml:space="preserve">5.5.2(i) (change of ownership, insolvency, receivership or judicial management, breach, performance deterioration)</w:t>
+            </w:r>
+          </w:p>
+        </w:tc>
+      </w:tr>
+      <w:tr>
+        <w:trPr>
+          <w:trHeight w:val="377"/>
+        </w:trPr>
+        <w:tc>
+          <w:tcPr>
+            <w:tcW w:w="2127" w:type="dxa"/>
+          </w:tcPr>
+          <w:p>
+            <w:pPr>
+              <w:spacing w:line="276" w:lineRule="auto"/>
+              <w:rPr>
+                <w:rFonts w:asciiTheme="majorHAnsi" w:hAnsiTheme="majorHAnsi" w:cstheme="majorHAnsi"/>
+                <w:sz w:val="18"/>
+                <w:szCs w:val="18"/>
+                <w:lang w:val="en-US"/>
+              </w:rPr>
+            </w:pPr>
+            <w:r>
+              <w:rPr>
+                <w:rFonts w:asciiTheme="majorHAnsi" w:hAnsiTheme="majorHAnsi" w:cstheme="majorHAnsi"/>
+                <w:sz w:val="18"/>
+                <w:szCs w:val="18"/>
+              </w:rPr>
+              <w:t xml:space="preserve">Deletion of information on termination</w:t>
+            </w:r>
+          </w:p>
+        </w:tc>
+        <w:tc>
+          <w:tcPr>
+            <w:tcW w:w="2357" w:type="dxa"/>
+          </w:tcPr>
+          <w:p>
+            <w:pPr>
+              <w:pStyle w:val="BodyText"/>
+              <w:rPr>
+                <w:rFonts w:asciiTheme="majorHAnsi" w:hAnsiTheme="majorHAnsi" w:cstheme="majorHAnsi"/>
+                <w:sz w:val="18"/>
+                <w:szCs w:val="18"/>
+              </w:rPr>
+            </w:pPr>
+            <w:r>
+              <w:rPr>
+                <w:rFonts w:asciiTheme="majorHAnsi" w:hAnsiTheme="majorHAnsi" w:cstheme="majorHAnsi"/>
+                <w:sz w:val="18"/>
+                <w:szCs w:val="18"/>
+              </w:rPr>
+              <w:t xml:space="preserve">3.4.7 (extends to non-customer information)</w:t>
+            </w:r>
+          </w:p>
+        </w:tc>
+        <w:tc>
+          <w:tcPr>
+            <w:tcW w:w="2357" w:type="dxa"/>
+          </w:tcPr>
+          <w:p>
+            <w:pPr>
+              <w:pStyle w:val="BodyText"/>
+              <w:rPr>
+                <w:rFonts w:asciiTheme="majorHAnsi" w:hAnsiTheme="majorHAnsi" w:cstheme="majorHAnsi"/>
+                <w:sz w:val="18"/>
+                <w:szCs w:val="18"/>
+              </w:rPr>
+            </w:pPr>
+            <w:r>
+              <w:rPr>
+                <w:rFonts w:asciiTheme="majorHAnsi" w:hAnsiTheme="majorHAnsi" w:cstheme="majorHAnsi"/>
+                <w:sz w:val="18"/>
+                <w:szCs w:val="18"/>
+              </w:rPr>
+              <w:t xml:space="preserve">5.7.2(c) only</w:t>
+            </w:r>
+          </w:p>
+        </w:tc>
+      </w:tr>
+      <w:tr>
+        <w:trPr>
+          <w:trHeight w:val="377"/>
+        </w:trPr>
+        <w:tc>
+          <w:tcPr>
+            <w:tcW w:w="2127" w:type="dxa"/>
+          </w:tcPr>
+          <w:p>
+            <w:pPr>
+              <w:spacing w:line="276" w:lineRule="auto"/>
+              <w:rPr>
+                <w:rFonts w:asciiTheme="majorHAnsi" w:hAnsiTheme="majorHAnsi" w:cstheme="majorHAnsi"/>
+                <w:sz w:val="18"/>
+                <w:szCs w:val="18"/>
+                <w:lang w:val="en-US"/>
+              </w:rPr>
+            </w:pPr>
+            <w:r>
+              <w:rPr>
+                <w:rFonts w:asciiTheme="majorHAnsi" w:hAnsiTheme="majorHAnsi" w:cstheme="majorHAnsi"/>
+                <w:sz w:val="18"/>
+                <w:szCs w:val="18"/>
+              </w:rPr>
+              <w:t xml:space="preserve">Customer consent before sub-contracting</w:t>
+            </w:r>
+          </w:p>
+        </w:tc>
+        <w:tc>
+          <w:tcPr>
+            <w:tcW w:w="2357" w:type="dxa"/>
+          </w:tcPr>
+          <w:p>
+            <w:pPr>
+              <w:pStyle w:val="BodyText"/>
+              <w:rPr>
+                <w:rFonts w:asciiTheme="majorHAnsi" w:hAnsiTheme="majorHAnsi" w:cstheme="majorHAnsi"/>
+                <w:sz w:val="18"/>
+                <w:szCs w:val="18"/>
+              </w:rPr>
+            </w:pPr>
+            <w:r>
+              <w:rPr>
+                <w:rFonts w:asciiTheme="majorHAnsi" w:hAnsiTheme="majorHAnsi" w:cstheme="majorHAnsi"/>
+                <w:sz w:val="18"/>
+                <w:szCs w:val="18"/>
+              </w:rPr>
+              <w:t xml:space="preserve">3.5.2</w:t>
+            </w:r>
+          </w:p>
+        </w:tc>
+        <w:tc>
+          <w:tcPr>
+            <w:tcW w:w="2357" w:type="dxa"/>
+          </w:tcPr>
+          <w:p>
+            <w:pPr>
+              <w:pStyle w:val="BodyText"/>
+              <w:rPr>
+                <w:rFonts w:asciiTheme="majorHAnsi" w:hAnsiTheme="majorHAnsi" w:cstheme="majorHAnsi"/>
+                <w:sz w:val="18"/>
+                <w:szCs w:val="18"/>
+              </w:rPr>
+            </w:pPr>
+            <w:r>
+              <w:rPr>
+                <w:rFonts w:asciiTheme="majorHAnsi" w:hAnsiTheme="majorHAnsi" w:cstheme="majorHAnsi"/>
+                <w:sz w:val="18"/>
+                <w:szCs w:val="18"/>
+              </w:rPr>
+              <w:t xml:space="preserve">None</w:t>
+            </w:r>
+          </w:p>
+        </w:tc>
+      </w:tr>
+      <w:tr>
+        <w:trPr>
+          <w:trHeight w:val="377"/>
+        </w:trPr>
+        <w:tc>
+          <w:tcPr>
+            <w:tcW w:w="2127" w:type="dxa"/>
+          </w:tcPr>
+          <w:p>
+            <w:pPr>
+              <w:spacing w:line="276" w:lineRule="auto"/>
+              <w:rPr>
+                <w:rFonts w:asciiTheme="majorHAnsi" w:hAnsiTheme="majorHAnsi" w:cstheme="majorHAnsi"/>
+                <w:sz w:val="18"/>
+                <w:szCs w:val="18"/>
+                <w:lang w:val="en-US"/>
+              </w:rPr>
+            </w:pPr>
+            <w:r>
+              <w:rPr>
+                <w:rFonts w:asciiTheme="majorHAnsi" w:hAnsiTheme="majorHAnsi" w:cstheme="majorHAnsi"/>
+                <w:sz w:val="18"/>
+                <w:szCs w:val="18"/>
+              </w:rPr>
+              <w:t xml:space="preserve">Prescribed contents of the sub-contract</w:t>
+            </w:r>
+          </w:p>
+        </w:tc>
+        <w:tc>
+          <w:tcPr>
+            <w:tcW w:w="2357" w:type="dxa"/>
+          </w:tcPr>
+          <w:p>
+            <w:pPr>
+              <w:pStyle w:val="BodyText"/>
+              <w:rPr>
+                <w:rFonts w:asciiTheme="majorHAnsi" w:hAnsiTheme="majorHAnsi" w:cstheme="majorHAnsi"/>
+                <w:sz w:val="18"/>
+                <w:szCs w:val="18"/>
+              </w:rPr>
+            </w:pPr>
+            <w:r>
+              <w:rPr>
+                <w:rFonts w:asciiTheme="majorHAnsi" w:hAnsiTheme="majorHAnsi" w:cstheme="majorHAnsi"/>
+                <w:sz w:val="18"/>
+                <w:szCs w:val="18"/>
+              </w:rPr>
+              <w:t xml:space="preserve">3.5.3</w:t>
+            </w:r>
+          </w:p>
+        </w:tc>
+        <w:tc>
+          <w:tcPr>
+            <w:tcW w:w="2357" w:type="dxa"/>
+          </w:tcPr>
+          <w:p>
+            <w:pPr>
+              <w:pStyle w:val="BodyText"/>
+              <w:rPr>
+                <w:rFonts w:asciiTheme="majorHAnsi" w:hAnsiTheme="majorHAnsi" w:cstheme="majorHAnsi"/>
+                <w:sz w:val="18"/>
+                <w:szCs w:val="18"/>
+              </w:rPr>
+            </w:pPr>
+            <w:r>
+              <w:rPr>
+                <w:rFonts w:asciiTheme="majorHAnsi" w:hAnsiTheme="majorHAnsi" w:cstheme="majorHAnsi"/>
+                <w:sz w:val="18"/>
+                <w:szCs w:val="18"/>
+              </w:rPr>
+              <w:t xml:space="preserve">None</w:t>
+            </w:r>
+          </w:p>
+        </w:tc>
+      </w:tr>
+      <w:tr>
+        <w:trPr>
+          <w:trHeight w:val="377"/>
+        </w:trPr>
+        <w:tc>
+          <w:tcPr>
+            <w:tcW w:w="2127" w:type="dxa"/>
+          </w:tcPr>
+          <w:p>
+            <w:pPr>
+              <w:spacing w:line="276" w:lineRule="auto"/>
+              <w:rPr>
+                <w:rFonts w:asciiTheme="majorHAnsi" w:hAnsiTheme="majorHAnsi" w:cstheme="majorHAnsi"/>
+                <w:sz w:val="18"/>
+                <w:szCs w:val="18"/>
+                <w:lang w:val="en-US"/>
+              </w:rPr>
+            </w:pPr>
+            <w:r>
+              <w:rPr>
+                <w:rFonts w:asciiTheme="majorHAnsi" w:hAnsiTheme="majorHAnsi" w:cstheme="majorHAnsi"/>
+                <w:sz w:val="18"/>
+                <w:szCs w:val="18"/>
+              </w:rPr>
+              <w:t xml:space="preserve">Notification of sub-contractor engagement (30 days)</w:t>
+            </w:r>
+          </w:p>
+        </w:tc>
+        <w:tc>
+          <w:tcPr>
+            <w:tcW w:w="2357" w:type="dxa"/>
+          </w:tcPr>
+          <w:p>
+            <w:pPr>
+              <w:pStyle w:val="BodyText"/>
+              <w:rPr>
+                <w:rFonts w:asciiTheme="majorHAnsi" w:hAnsiTheme="majorHAnsi" w:cstheme="majorHAnsi"/>
+                <w:sz w:val="18"/>
+                <w:szCs w:val="18"/>
+              </w:rPr>
+            </w:pPr>
+            <w:r>
+              <w:rPr>
+                <w:rFonts w:asciiTheme="majorHAnsi" w:hAnsiTheme="majorHAnsi" w:cstheme="majorHAnsi"/>
+                <w:sz w:val="18"/>
+                <w:szCs w:val="18"/>
+              </w:rPr>
+              <w:t xml:space="preserve">3.5.4</w:t>
+            </w:r>
+          </w:p>
+        </w:tc>
+        <w:tc>
+          <w:tcPr>
+            <w:tcW w:w="2357" w:type="dxa"/>
+          </w:tcPr>
+          <w:p>
+            <w:pPr>
+              <w:pStyle w:val="BodyText"/>
+              <w:rPr>
+                <w:rFonts w:asciiTheme="majorHAnsi" w:hAnsiTheme="majorHAnsi" w:cstheme="majorHAnsi"/>
+                <w:sz w:val="18"/>
+                <w:szCs w:val="18"/>
+              </w:rPr>
+            </w:pPr>
+            <w:r>
+              <w:rPr>
+                <w:rFonts w:asciiTheme="majorHAnsi" w:hAnsiTheme="majorHAnsi" w:cstheme="majorHAnsi"/>
+                <w:sz w:val="18"/>
+                <w:szCs w:val="18"/>
+              </w:rPr>
+              <w:t xml:space="preserve">None</w:t>
+            </w:r>
+          </w:p>
+        </w:tc>
+      </w:tr>
+      <w:tr>
+        <w:trPr>
+          <w:trHeight w:val="377"/>
+        </w:trPr>
+        <w:tc>
+          <w:tcPr>
+            <w:tcW w:w="2127" w:type="dxa"/>
+          </w:tcPr>
+          <w:p>
+            <w:pPr>
+              <w:spacing w:line="276" w:lineRule="auto"/>
+              <w:rPr>
+                <w:rFonts w:asciiTheme="majorHAnsi" w:hAnsiTheme="majorHAnsi" w:cstheme="majorHAnsi"/>
+                <w:sz w:val="18"/>
+                <w:szCs w:val="18"/>
+                <w:lang w:val="en-US"/>
+              </w:rPr>
+            </w:pPr>
+            <w:r>
+              <w:rPr>
+                <w:rFonts w:asciiTheme="majorHAnsi" w:hAnsiTheme="majorHAnsi" w:cstheme="majorHAnsi"/>
+                <w:sz w:val="18"/>
+                <w:szCs w:val="18"/>
+              </w:rPr>
+              <w:t xml:space="preserve">Annual review of material outsourcing arrangements</w:t>
+            </w:r>
+          </w:p>
+        </w:tc>
+        <w:tc>
+          <w:tcPr>
+            <w:tcW w:w="2357" w:type="dxa"/>
+          </w:tcPr>
+          <w:p>
+            <w:pPr>
+              <w:pStyle w:val="BodyText"/>
+              <w:rPr>
+                <w:rFonts w:asciiTheme="majorHAnsi" w:hAnsiTheme="majorHAnsi" w:cstheme="majorHAnsi"/>
+                <w:sz w:val="18"/>
+                <w:szCs w:val="18"/>
+              </w:rPr>
+            </w:pPr>
+            <w:r>
+              <w:rPr>
+                <w:rFonts w:asciiTheme="majorHAnsi" w:hAnsiTheme="majorHAnsi" w:cstheme="majorHAnsi"/>
+                <w:sz w:val="18"/>
+                <w:szCs w:val="18"/>
+              </w:rPr>
+              <w:t xml:space="preserve">None (periodic-review obligations are in the Notices)</w:t>
+            </w:r>
+          </w:p>
+        </w:tc>
+        <w:tc>
+          <w:tcPr>
+            <w:tcW w:w="2357" w:type="dxa"/>
+          </w:tcPr>
+          <w:p>
+            <w:pPr>
+              <w:pStyle w:val="BodyText"/>
+              <w:rPr>
+                <w:rFonts w:asciiTheme="majorHAnsi" w:hAnsiTheme="majorHAnsi" w:cstheme="majorHAnsi"/>
+                <w:sz w:val="18"/>
+                <w:szCs w:val="18"/>
+              </w:rPr>
+            </w:pPr>
+            <w:r>
+              <w:rPr>
+                <w:rFonts w:asciiTheme="majorHAnsi" w:hAnsiTheme="majorHAnsi" w:cstheme="majorHAnsi"/>
+                <w:sz w:val="18"/>
+                <w:szCs w:val="18"/>
+              </w:rPr>
+              <w:t xml:space="preserve">5.8.2(d)</w:t>
+            </w:r>
+          </w:p>
+        </w:tc>
+      </w:tr>
+      <w:tr>
+        <w:trPr>
+          <w:trHeight w:val="377"/>
+        </w:trPr>
+        <w:tc>
+          <w:tcPr>
+            <w:tcW w:w="2127" w:type="dxa"/>
+          </w:tcPr>
+          <w:p>
+            <w:pPr>
+              <w:spacing w:line="276" w:lineRule="auto"/>
+              <w:rPr>
+                <w:rFonts w:asciiTheme="majorHAnsi" w:hAnsiTheme="majorHAnsi" w:cstheme="majorHAnsi"/>
+                <w:sz w:val="18"/>
+                <w:szCs w:val="18"/>
+                <w:lang w:val="en-US"/>
+              </w:rPr>
+            </w:pPr>
+            <w:r>
+              <w:rPr>
+                <w:rFonts w:asciiTheme="majorHAnsi" w:hAnsiTheme="majorHAnsi" w:cstheme="majorHAnsi"/>
+                <w:sz w:val="18"/>
+                <w:szCs w:val="18"/>
+              </w:rPr>
+              <w:t xml:space="preserve">MAS access to service providers</w:t>
+            </w:r>
+          </w:p>
+        </w:tc>
+        <w:tc>
+          <w:tcPr>
+            <w:tcW w:w="2357" w:type="dxa"/>
+          </w:tcPr>
+          <w:p>
+            <w:pPr>
+              <w:pStyle w:val="BodyText"/>
+              <w:rPr>
+                <w:rFonts w:asciiTheme="majorHAnsi" w:hAnsiTheme="majorHAnsi" w:cstheme="majorHAnsi"/>
+                <w:sz w:val="18"/>
+                <w:szCs w:val="18"/>
+              </w:rPr>
+            </w:pPr>
+            <w:r>
+              <w:rPr>
+                <w:rFonts w:asciiTheme="majorHAnsi" w:hAnsiTheme="majorHAnsi" w:cstheme="majorHAnsi"/>
+                <w:sz w:val="18"/>
+                <w:szCs w:val="18"/>
+              </w:rPr>
+              <w:t xml:space="preserve">Statutory – section 47A(10) of the Banking Act (see 3.4.5(f))</w:t>
+            </w:r>
+          </w:p>
+        </w:tc>
+        <w:tc>
+          <w:tcPr>
+            <w:tcW w:w="2357" w:type="dxa"/>
+          </w:tcPr>
+          <w:p>
+            <w:pPr>
+              <w:pStyle w:val="BodyText"/>
+              <w:rPr>
+                <w:rFonts w:asciiTheme="majorHAnsi" w:hAnsiTheme="majorHAnsi" w:cstheme="majorHAnsi"/>
+                <w:sz w:val="18"/>
+                <w:szCs w:val="18"/>
+              </w:rPr>
+            </w:pPr>
+            <w:r>
+              <w:rPr>
+                <w:rFonts w:asciiTheme="majorHAnsi" w:hAnsiTheme="majorHAnsi" w:cstheme="majorHAnsi"/>
+                <w:sz w:val="18"/>
+                <w:szCs w:val="18"/>
+              </w:rPr>
+              <w:t xml:space="preserve">Contractual – 5.9.2(b)</w:t>
+            </w:r>
+          </w:p>
+        </w:tc>
+      </w:tr>
+      <w:tr>
+        <w:trPr>
+          <w:trHeight w:val="377"/>
+        </w:trPr>
+        <w:tc>
+          <w:tcPr>
+            <w:tcW w:w="2127" w:type="dxa"/>
+          </w:tcPr>
+          <w:p>
+            <w:pPr>
+              <w:spacing w:line="276" w:lineRule="auto"/>
+              <w:rPr>
+                <w:rFonts w:asciiTheme="majorHAnsi" w:hAnsiTheme="majorHAnsi" w:cstheme="majorHAnsi"/>
+                <w:sz w:val="18"/>
+                <w:szCs w:val="18"/>
+                <w:lang w:val="en-US"/>
+              </w:rPr>
+            </w:pPr>
+            <w:r>
+              <w:rPr>
+                <w:rFonts w:asciiTheme="majorHAnsi" w:hAnsiTheme="majorHAnsi" w:cstheme="majorHAnsi"/>
+                <w:sz w:val="18"/>
+                <w:szCs w:val="18"/>
+              </w:rPr>
+              <w:t xml:space="preserve">Service provider reports to MAS</w:t>
+            </w:r>
+          </w:p>
+        </w:tc>
+        <w:tc>
+          <w:tcPr>
+            <w:tcW w:w="2357" w:type="dxa"/>
+          </w:tcPr>
+          <w:p>
+            <w:pPr>
+              <w:pStyle w:val="BodyText"/>
+              <w:rPr>
+                <w:rFonts w:asciiTheme="majorHAnsi" w:hAnsiTheme="majorHAnsi" w:cstheme="majorHAnsi"/>
+                <w:sz w:val="18"/>
+                <w:szCs w:val="18"/>
+              </w:rPr>
+            </w:pPr>
+            <w:r>
+              <w:rPr>
+                <w:rFonts w:asciiTheme="majorHAnsi" w:hAnsiTheme="majorHAnsi" w:cstheme="majorHAnsi"/>
+                <w:sz w:val="18"/>
+                <w:szCs w:val="18"/>
+              </w:rPr>
+              <w:t xml:space="preserve">None</w:t>
+            </w:r>
+          </w:p>
+        </w:tc>
+        <w:tc>
+          <w:tcPr>
+            <w:tcW w:w="2357" w:type="dxa"/>
+          </w:tcPr>
+          <w:p>
+            <w:pPr>
+              <w:pStyle w:val="BodyText"/>
+              <w:rPr>
+                <w:rFonts w:asciiTheme="majorHAnsi" w:hAnsiTheme="majorHAnsi" w:cstheme="majorHAnsi"/>
+                <w:sz w:val="18"/>
+                <w:szCs w:val="18"/>
+              </w:rPr>
+            </w:pPr>
+            <w:r>
+              <w:rPr>
+                <w:rFonts w:asciiTheme="majorHAnsi" w:hAnsiTheme="majorHAnsi" w:cstheme="majorHAnsi"/>
+                <w:sz w:val="18"/>
+                <w:szCs w:val="18"/>
+              </w:rPr>
+              <w:t xml:space="preserve">5.9.3</w:t>
+            </w:r>
+          </w:p>
+        </w:tc>
+      </w:tr>
+      <w:tr>
+        <w:trPr>
+          <w:trHeight w:val="377"/>
+        </w:trPr>
+        <w:tc>
+          <w:tcPr>
+            <w:tcW w:w="2127" w:type="dxa"/>
+          </w:tcPr>
+          <w:p>
+            <w:pPr>
+              <w:spacing w:line="276" w:lineRule="auto"/>
+              <w:rPr>
+                <w:rFonts w:asciiTheme="majorHAnsi" w:hAnsiTheme="majorHAnsi" w:cstheme="majorHAnsi"/>
+                <w:sz w:val="18"/>
+                <w:szCs w:val="18"/>
+                <w:lang w:val="en-US"/>
+              </w:rPr>
+            </w:pPr>
+            <w:r>
+              <w:rPr>
+                <w:rFonts w:asciiTheme="majorHAnsi" w:hAnsiTheme="majorHAnsi" w:cstheme="majorHAnsi"/>
+                <w:sz w:val="18"/>
+                <w:szCs w:val="18"/>
+              </w:rPr>
+              <w:t xml:space="preserve">Sub-contractor audit coverage</w:t>
+            </w:r>
+          </w:p>
+        </w:tc>
+        <w:tc>
+          <w:tcPr>
+            <w:tcW w:w="2357" w:type="dxa"/>
+          </w:tcPr>
+          <w:p>
+            <w:pPr>
+              <w:pStyle w:val="BodyText"/>
+              <w:rPr>
+                <w:rFonts w:asciiTheme="majorHAnsi" w:hAnsiTheme="majorHAnsi" w:cstheme="majorHAnsi"/>
+                <w:sz w:val="18"/>
+                <w:szCs w:val="18"/>
+              </w:rPr>
+            </w:pPr>
+            <w:r>
+              <w:rPr>
+                <w:rFonts w:asciiTheme="majorHAnsi" w:hAnsiTheme="majorHAnsi" w:cstheme="majorHAnsi"/>
+                <w:sz w:val="18"/>
+                <w:szCs w:val="18"/>
+              </w:rPr>
+              <w:t xml:space="preserve">3.9.3 (“endeavour to subject”)</w:t>
+            </w:r>
+          </w:p>
+        </w:tc>
+        <w:tc>
+          <w:tcPr>
+            <w:tcW w:w="2357" w:type="dxa"/>
+          </w:tcPr>
+          <w:p>
+            <w:pPr>
+              <w:pStyle w:val="BodyText"/>
+              <w:rPr>
+                <w:rFonts w:asciiTheme="majorHAnsi" w:hAnsiTheme="majorHAnsi" w:cstheme="majorHAnsi"/>
+                <w:sz w:val="18"/>
+                <w:szCs w:val="18"/>
+              </w:rPr>
+            </w:pPr>
+            <w:r>
+              <w:rPr>
+                <w:rFonts w:asciiTheme="majorHAnsi" w:hAnsiTheme="majorHAnsi" w:cstheme="majorHAnsi"/>
+                <w:sz w:val="18"/>
+                <w:szCs w:val="18"/>
+              </w:rPr>
+              <w:t xml:space="preserve">5.9.4 (“ensure that these expectations are met”)</w:t>
+            </w:r>
+          </w:p>
+        </w:tc>
+      </w:tr>
+      <w:tr>
+        <w:trPr>
+          <w:trHeight w:val="377"/>
+        </w:trPr>
+        <w:tc>
+          <w:tcPr>
+            <w:tcW w:w="2127" w:type="dxa"/>
+          </w:tcPr>
+          <w:p>
+            <w:pPr>
+              <w:spacing w:line="276" w:lineRule="auto"/>
+              <w:rPr>
+                <w:rFonts w:asciiTheme="majorHAnsi" w:hAnsiTheme="majorHAnsi" w:cstheme="majorHAnsi"/>
+                <w:sz w:val="18"/>
+                <w:szCs w:val="18"/>
+                <w:lang w:val="en-US"/>
+              </w:rPr>
+            </w:pPr>
+            <w:r>
+              <w:rPr>
+                <w:rFonts w:asciiTheme="majorHAnsi" w:hAnsiTheme="majorHAnsi" w:cstheme="majorHAnsi"/>
+                <w:sz w:val="18"/>
+                <w:szCs w:val="18"/>
+              </w:rPr>
+              <w:t xml:space="preserve">Reliance on certifications and pooled audits</w:t>
+            </w:r>
+          </w:p>
+        </w:tc>
+        <w:tc>
+          <w:tcPr>
+            <w:tcW w:w="2357" w:type="dxa"/>
+          </w:tcPr>
+          <w:p>
+            <w:pPr>
+              <w:pStyle w:val="BodyText"/>
+              <w:rPr>
+                <w:rFonts w:asciiTheme="majorHAnsi" w:hAnsiTheme="majorHAnsi" w:cstheme="majorHAnsi"/>
+                <w:sz w:val="18"/>
+                <w:szCs w:val="18"/>
+              </w:rPr>
+            </w:pPr>
+            <w:r>
+              <w:rPr>
+                <w:rFonts w:asciiTheme="majorHAnsi" w:hAnsiTheme="majorHAnsi" w:cstheme="majorHAnsi"/>
+                <w:sz w:val="18"/>
+                <w:szCs w:val="18"/>
+              </w:rPr>
+              <w:t xml:space="preserve">3.9.8</w:t>
+            </w:r>
+          </w:p>
+        </w:tc>
+        <w:tc>
+          <w:tcPr>
+            <w:tcW w:w="2357" w:type="dxa"/>
+          </w:tcPr>
+          <w:p>
+            <w:pPr>
+              <w:pStyle w:val="BodyText"/>
+              <w:rPr>
+                <w:rFonts w:asciiTheme="majorHAnsi" w:hAnsiTheme="majorHAnsi" w:cstheme="majorHAnsi"/>
+                <w:sz w:val="18"/>
+                <w:szCs w:val="18"/>
+              </w:rPr>
+            </w:pPr>
+            <w:r>
+              <w:rPr>
+                <w:rFonts w:asciiTheme="majorHAnsi" w:hAnsiTheme="majorHAnsi" w:cstheme="majorHAnsi"/>
+                <w:sz w:val="18"/>
+                <w:szCs w:val="18"/>
+              </w:rPr>
+              <w:t xml:space="preserve">None</w:t>
+            </w:r>
+          </w:p>
+        </w:tc>
+      </w:tr>
+      <w:tr>
+        <w:trPr>
+          <w:trHeight w:val="377"/>
+        </w:trPr>
+        <w:tc>
+          <w:tcPr>
+            <w:tcW w:w="2127" w:type="dxa"/>
+          </w:tcPr>
+          <w:p>
+            <w:pPr>
+              <w:spacing w:line="276" w:lineRule="auto"/>
+              <w:rPr>
+                <w:rFonts w:asciiTheme="majorHAnsi" w:hAnsiTheme="majorHAnsi" w:cstheme="majorHAnsi"/>
+                <w:sz w:val="18"/>
+                <w:szCs w:val="18"/>
+                <w:lang w:val="en-US"/>
+              </w:rPr>
+            </w:pPr>
+            <w:r>
+              <w:rPr>
+                <w:rFonts w:asciiTheme="majorHAnsi" w:hAnsiTheme="majorHAnsi" w:cstheme="majorHAnsi"/>
+                <w:sz w:val="18"/>
+                <w:szCs w:val="18"/>
+              </w:rPr>
+              <w:t xml:space="preserve">Submission of audit reports to MAS</w:t>
+            </w:r>
+          </w:p>
+        </w:tc>
+        <w:tc>
+          <w:tcPr>
+            <w:tcW w:w="2357" w:type="dxa"/>
+          </w:tcPr>
+          <w:p>
+            <w:pPr>
+              <w:pStyle w:val="BodyText"/>
+              <w:rPr>
+                <w:rFonts w:asciiTheme="majorHAnsi" w:hAnsiTheme="majorHAnsi" w:cstheme="majorHAnsi"/>
+                <w:sz w:val="18"/>
+                <w:szCs w:val="18"/>
+              </w:rPr>
+            </w:pPr>
+            <w:r>
+              <w:rPr>
+                <w:rFonts w:asciiTheme="majorHAnsi" w:hAnsiTheme="majorHAnsi" w:cstheme="majorHAnsi"/>
+                <w:sz w:val="18"/>
+                <w:szCs w:val="18"/>
+              </w:rPr>
+              <w:t xml:space="preserve">3.9.7 (“upon request”)</w:t>
+            </w:r>
+          </w:p>
+        </w:tc>
+        <w:tc>
+          <w:tcPr>
+            <w:tcW w:w="2357" w:type="dxa"/>
+          </w:tcPr>
+          <w:p>
+            <w:pPr>
+              <w:pStyle w:val="BodyText"/>
+              <w:rPr>
+                <w:rFonts w:asciiTheme="majorHAnsi" w:hAnsiTheme="majorHAnsi" w:cstheme="majorHAnsi"/>
+                <w:sz w:val="18"/>
+                <w:szCs w:val="18"/>
+              </w:rPr>
+            </w:pPr>
+            <w:r>
+              <w:rPr>
+                <w:rFonts w:asciiTheme="majorHAnsi" w:hAnsiTheme="majorHAnsi" w:cstheme="majorHAnsi"/>
+                <w:sz w:val="18"/>
+                <w:szCs w:val="18"/>
+              </w:rPr>
+              <w:t xml:space="preserve">5.9.8 (no “upon request” for audit reports)</w:t>
+            </w:r>
+          </w:p>
+        </w:tc>
+      </w:tr>
+      <w:tr>
+        <w:trPr>
+          <w:trHeight w:val="377"/>
+        </w:trPr>
+        <w:tc>
+          <w:tcPr>
+            <w:tcW w:w="2127" w:type="dxa"/>
+          </w:tcPr>
+          <w:p>
+            <w:pPr>
+              <w:spacing w:line="276" w:lineRule="auto"/>
+              <w:rPr>
+                <w:rFonts w:asciiTheme="majorHAnsi" w:hAnsiTheme="majorHAnsi" w:cstheme="majorHAnsi"/>
+                <w:sz w:val="18"/>
+                <w:szCs w:val="18"/>
+                <w:lang w:val="en-US"/>
+              </w:rPr>
+            </w:pPr>
+            <w:r>
+              <w:rPr>
+                <w:rFonts w:asciiTheme="majorHAnsi" w:hAnsiTheme="majorHAnsi" w:cstheme="majorHAnsi"/>
+                <w:sz w:val="18"/>
+                <w:szCs w:val="18"/>
+              </w:rPr>
+              <w:t xml:space="preserve">Overseas outsourcing – confirmation and notification to MAS</w:t>
+            </w:r>
+          </w:p>
+        </w:tc>
+        <w:tc>
+          <w:tcPr>
+            <w:tcW w:w="2357" w:type="dxa"/>
+          </w:tcPr>
+          <w:p>
+            <w:pPr>
+              <w:pStyle w:val="BodyText"/>
+              <w:rPr>
+                <w:rFonts w:asciiTheme="majorHAnsi" w:hAnsiTheme="majorHAnsi" w:cstheme="majorHAnsi"/>
+                <w:sz w:val="18"/>
+                <w:szCs w:val="18"/>
+              </w:rPr>
+            </w:pPr>
+            <w:r>
+              <w:rPr>
+                <w:rFonts w:asciiTheme="majorHAnsi" w:hAnsiTheme="majorHAnsi" w:cstheme="majorHAnsi"/>
+                <w:sz w:val="18"/>
+                <w:szCs w:val="18"/>
+              </w:rPr>
+              <w:t xml:space="preserve">None</w:t>
+            </w:r>
+          </w:p>
+        </w:tc>
+        <w:tc>
+          <w:tcPr>
+            <w:tcW w:w="2357" w:type="dxa"/>
+          </w:tcPr>
+          <w:p>
+            <w:pPr>
+              <w:pStyle w:val="BodyText"/>
+              <w:rPr>
+                <w:rFonts w:asciiTheme="majorHAnsi" w:hAnsiTheme="majorHAnsi" w:cstheme="majorHAnsi"/>
+                <w:sz w:val="18"/>
+                <w:szCs w:val="18"/>
+              </w:rPr>
+            </w:pPr>
+            <w:r>
+              <w:rPr>
+                <w:rFonts w:asciiTheme="majorHAnsi" w:hAnsiTheme="majorHAnsi" w:cstheme="majorHAnsi"/>
+                <w:sz w:val="18"/>
+                <w:szCs w:val="18"/>
+              </w:rPr>
+              <w:t xml:space="preserve">5.10.2(b) (written confirmation) and 5.10.2(c) (notification)</w:t>
+            </w:r>
+          </w:p>
+        </w:tc>
+      </w:tr>
+      <w:tr>
+        <w:trPr>
+          <w:trHeight w:val="377"/>
+        </w:trPr>
+        <w:tc>
+          <w:tcPr>
+            <w:tcW w:w="2127" w:type="dxa"/>
+          </w:tcPr>
+          <w:p>
+            <w:pPr>
+              <w:spacing w:line="276" w:lineRule="auto"/>
+              <w:rPr>
+                <w:rFonts w:asciiTheme="majorHAnsi" w:hAnsiTheme="majorHAnsi" w:cstheme="majorHAnsi"/>
+                <w:sz w:val="18"/>
+                <w:szCs w:val="18"/>
+                <w:lang w:val="en-US"/>
+              </w:rPr>
+            </w:pPr>
+            <w:r>
+              <w:rPr>
+                <w:rFonts w:asciiTheme="majorHAnsi" w:hAnsiTheme="majorHAnsi" w:cstheme="majorHAnsi"/>
+                <w:sz w:val="18"/>
+                <w:szCs w:val="18"/>
+              </w:rPr>
+              <w:t xml:space="preserve">Outsourcing within a group – wording</w:t>
+            </w:r>
+          </w:p>
+        </w:tc>
+        <w:tc>
+          <w:tcPr>
+            <w:tcW w:w="2357" w:type="dxa"/>
+          </w:tcPr>
+          <w:p>
+            <w:pPr>
+              <w:pStyle w:val="BodyText"/>
+              <w:rPr>
+                <w:rFonts w:asciiTheme="majorHAnsi" w:hAnsiTheme="majorHAnsi" w:cstheme="majorHAnsi"/>
+                <w:sz w:val="18"/>
+                <w:szCs w:val="18"/>
+              </w:rPr>
+            </w:pPr>
+            <w:r>
+              <w:rPr>
+                <w:rFonts w:asciiTheme="majorHAnsi" w:hAnsiTheme="majorHAnsi" w:cstheme="majorHAnsi"/>
+                <w:sz w:val="18"/>
+                <w:szCs w:val="18"/>
+              </w:rPr>
+              <w:t xml:space="preserve">3.11.1 (“including subsidiaries of Singapore-incorporated banks”)</w:t>
+            </w:r>
+          </w:p>
+        </w:tc>
+        <w:tc>
+          <w:tcPr>
+            <w:tcW w:w="2357" w:type="dxa"/>
+          </w:tcPr>
+          <w:p>
+            <w:pPr>
+              <w:pStyle w:val="BodyText"/>
+              <w:rPr>
+                <w:rFonts w:asciiTheme="majorHAnsi" w:hAnsiTheme="majorHAnsi" w:cstheme="majorHAnsi"/>
+                <w:sz w:val="18"/>
+                <w:szCs w:val="18"/>
+              </w:rPr>
+            </w:pPr>
+            <w:r>
+              <w:rPr>
+                <w:rFonts w:asciiTheme="majorHAnsi" w:hAnsiTheme="majorHAnsi" w:cstheme="majorHAnsi"/>
+                <w:sz w:val="18"/>
+                <w:szCs w:val="18"/>
+              </w:rPr>
+              <w:t xml:space="preserve">5.11.1 (without that phrase; see also 2.3)</w:t>
+            </w:r>
+          </w:p>
+        </w:tc>
+      </w:tr>
+      <w:tr>
+        <w:trPr>
+          <w:trHeight w:val="377"/>
+        </w:trPr>
+        <w:tc>
+          <w:tcPr>
+            <w:tcW w:w="2127" w:type="dxa"/>
+          </w:tcPr>
+          <w:p>
+            <w:pPr>
+              <w:spacing w:line="276" w:lineRule="auto"/>
+              <w:rPr>
+                <w:rFonts w:asciiTheme="majorHAnsi" w:hAnsiTheme="majorHAnsi" w:cstheme="majorHAnsi"/>
+                <w:sz w:val="18"/>
+                <w:szCs w:val="18"/>
+                <w:lang w:val="en-US"/>
+              </w:rPr>
+            </w:pPr>
+            <w:r>
+              <w:rPr>
+                <w:rFonts w:asciiTheme="majorHAnsi" w:hAnsiTheme="majorHAnsi" w:cstheme="majorHAnsi"/>
+                <w:sz w:val="18"/>
+                <w:szCs w:val="18"/>
+              </w:rPr>
+              <w:t xml:space="preserve">Outsourcing internal audit – permitted departures</w:t>
+            </w:r>
+          </w:p>
+        </w:tc>
+        <w:tc>
+          <w:tcPr>
+            <w:tcW w:w="2357" w:type="dxa"/>
+          </w:tcPr>
+          <w:p>
+            <w:pPr>
+              <w:pStyle w:val="BodyText"/>
+              <w:rPr>
+                <w:rFonts w:asciiTheme="majorHAnsi" w:hAnsiTheme="majorHAnsi" w:cstheme="majorHAnsi"/>
+                <w:sz w:val="18"/>
+                <w:szCs w:val="18"/>
+              </w:rPr>
+            </w:pPr>
+            <w:r>
+              <w:rPr>
+                <w:rFonts w:asciiTheme="majorHAnsi" w:hAnsiTheme="majorHAnsi" w:cstheme="majorHAnsi"/>
+                <w:sz w:val="18"/>
+                <w:szCs w:val="18"/>
+              </w:rPr>
+              <w:t xml:space="preserve">Footnote 26 (no size limit)</w:t>
+            </w:r>
+          </w:p>
+        </w:tc>
+        <w:tc>
+          <w:tcPr>
+            <w:tcW w:w="2357" w:type="dxa"/>
+          </w:tcPr>
+          <w:p>
+            <w:pPr>
+              <w:pStyle w:val="BodyText"/>
+              <w:rPr>
+                <w:rFonts w:asciiTheme="majorHAnsi" w:hAnsiTheme="majorHAnsi" w:cstheme="majorHAnsi"/>
+                <w:sz w:val="18"/>
+                <w:szCs w:val="18"/>
+              </w:rPr>
+            </w:pPr>
+            <w:r>
+              <w:rPr>
+                <w:rFonts w:asciiTheme="majorHAnsi" w:hAnsiTheme="majorHAnsi" w:cstheme="majorHAnsi"/>
+                <w:sz w:val="18"/>
+                <w:szCs w:val="18"/>
+              </w:rPr>
+              <w:t xml:space="preserve">Footnote 20 (limited to small institutions)</w:t>
+            </w:r>
+          </w:p>
+        </w:tc>
+      </w:tr>
+      <w:tr>
+        <w:trPr>
+          <w:trHeight w:val="377"/>
+        </w:trPr>
+        <w:tc>
+          <w:tcPr>
+            <w:tcW w:w="2127" w:type="dxa"/>
+          </w:tcPr>
+          <w:p>
+            <w:pPr>
+              <w:spacing w:line="276" w:lineRule="auto"/>
+              <w:rPr>
+                <w:rFonts w:asciiTheme="majorHAnsi" w:hAnsiTheme="majorHAnsi" w:cstheme="majorHAnsi"/>
+                <w:sz w:val="18"/>
+                <w:szCs w:val="18"/>
+                <w:lang w:val="en-US"/>
+              </w:rPr>
+            </w:pPr>
+            <w:r>
+              <w:rPr>
+                <w:rFonts w:asciiTheme="majorHAnsi" w:hAnsiTheme="majorHAnsi" w:cstheme="majorHAnsi"/>
+                <w:sz w:val="18"/>
+                <w:szCs w:val="18"/>
+              </w:rPr>
+              <w:t xml:space="preserve">Exempted services</w:t>
+            </w:r>
+          </w:p>
+        </w:tc>
+        <w:tc>
+          <w:tcPr>
+            <w:tcW w:w="2357" w:type="dxa"/>
+          </w:tcPr>
+          <w:p>
+            <w:pPr>
+              <w:pStyle w:val="BodyText"/>
+              <w:rPr>
+                <w:rFonts w:asciiTheme="majorHAnsi" w:hAnsiTheme="majorHAnsi" w:cstheme="majorHAnsi"/>
+                <w:sz w:val="18"/>
+                <w:szCs w:val="18"/>
+              </w:rPr>
+            </w:pPr>
+            <w:r>
+              <w:rPr>
+                <w:rFonts w:asciiTheme="majorHAnsi" w:hAnsiTheme="majorHAnsi" w:cstheme="majorHAnsi"/>
+                <w:sz w:val="18"/>
+                <w:szCs w:val="18"/>
+              </w:rPr>
+              <w:t xml:space="preserve">Annex D of the Notices</w:t>
+            </w:r>
+          </w:p>
+        </w:tc>
+        <w:tc>
+          <w:tcPr>
+            <w:tcW w:w="2357" w:type="dxa"/>
+          </w:tcPr>
+          <w:p>
+            <w:pPr>
+              <w:pStyle w:val="BodyText"/>
+              <w:rPr>
+                <w:rFonts w:asciiTheme="majorHAnsi" w:hAnsiTheme="majorHAnsi" w:cstheme="majorHAnsi"/>
+                <w:sz w:val="18"/>
+                <w:szCs w:val="18"/>
+              </w:rPr>
+            </w:pPr>
+            <w:r>
+              <w:rPr>
+                <w:rFonts w:asciiTheme="majorHAnsi" w:hAnsiTheme="majorHAnsi" w:cstheme="majorHAnsi"/>
+                <w:sz w:val="18"/>
+                <w:szCs w:val="18"/>
+              </w:rPr>
+              <w:t xml:space="preserve">Annex 1</w:t>
+            </w:r>
+          </w:p>
+        </w:tc>
+      </w:tr>
+      <w:tr>
+        <w:trPr>
+          <w:trHeight w:val="377"/>
+        </w:trPr>
+        <w:tc>
+          <w:tcPr>
+            <w:tcW w:w="2127" w:type="dxa"/>
+          </w:tcPr>
+          <w:p>
+            <w:pPr>
+              <w:spacing w:line="276" w:lineRule="auto"/>
+              <w:rPr>
+                <w:rFonts w:asciiTheme="majorHAnsi" w:hAnsiTheme="majorHAnsi" w:cstheme="majorHAnsi"/>
+                <w:sz w:val="18"/>
+                <w:szCs w:val="18"/>
+                <w:lang w:val="en-US"/>
+              </w:rPr>
+            </w:pPr>
+            <w:r>
+              <w:rPr>
+                <w:rFonts w:asciiTheme="majorHAnsi" w:hAnsiTheme="majorHAnsi" w:cstheme="majorHAnsi"/>
+                <w:sz w:val="18"/>
+                <w:szCs w:val="18"/>
+              </w:rPr>
+              <w:t xml:space="preserve">Examples of outsourcing arrangements</w:t>
+            </w:r>
+          </w:p>
+        </w:tc>
+        <w:tc>
+          <w:tcPr>
+            <w:tcW w:w="2357" w:type="dxa"/>
+          </w:tcPr>
+          <w:p>
+            <w:pPr>
+              <w:pStyle w:val="BodyText"/>
+              <w:rPr>
+                <w:rFonts w:asciiTheme="majorHAnsi" w:hAnsiTheme="majorHAnsi" w:cstheme="majorHAnsi"/>
+                <w:sz w:val="18"/>
+                <w:szCs w:val="18"/>
+              </w:rPr>
+            </w:pPr>
+            <w:r>
+              <w:rPr>
+                <w:rFonts w:asciiTheme="majorHAnsi" w:hAnsiTheme="majorHAnsi" w:cstheme="majorHAnsi"/>
+                <w:sz w:val="18"/>
+                <w:szCs w:val="18"/>
+              </w:rPr>
+              <w:t xml:space="preserve">None (Notice 658 Annexes A – C)</w:t>
+            </w:r>
+          </w:p>
+        </w:tc>
+        <w:tc>
+          <w:tcPr>
+            <w:tcW w:w="2357" w:type="dxa"/>
+          </w:tcPr>
+          <w:p>
+            <w:pPr>
+              <w:pStyle w:val="BodyText"/>
+              <w:rPr>
+                <w:rFonts w:asciiTheme="majorHAnsi" w:hAnsiTheme="majorHAnsi" w:cstheme="majorHAnsi"/>
+                <w:sz w:val="18"/>
+                <w:szCs w:val="18"/>
+              </w:rPr>
+            </w:pPr>
+            <w:r>
+              <w:rPr>
+                <w:rFonts w:asciiTheme="majorHAnsi" w:hAnsiTheme="majorHAnsi" w:cstheme="majorHAnsi"/>
+                <w:sz w:val="18"/>
+                <w:szCs w:val="18"/>
+              </w:rPr>
+              <w:t xml:space="preserve">Annex 2</w:t>
+            </w:r>
+          </w:p>
+        </w:tc>
+      </w:tr>
+      <w:tr>
+        <w:trPr>
+          <w:trHeight w:val="377"/>
+        </w:trPr>
+        <w:tc>
+          <w:tcPr>
+            <w:tcW w:w="2127" w:type="dxa"/>
+          </w:tcPr>
+          <w:p>
+            <w:pPr>
+              <w:spacing w:line="276" w:lineRule="auto"/>
+              <w:rPr>
+                <w:rFonts w:asciiTheme="majorHAnsi" w:hAnsiTheme="majorHAnsi" w:cstheme="majorHAnsi"/>
+                <w:sz w:val="18"/>
+                <w:szCs w:val="18"/>
+                <w:lang w:val="en-US"/>
+              </w:rPr>
+            </w:pPr>
+            <w:r>
+              <w:rPr>
+                <w:rFonts w:asciiTheme="majorHAnsi" w:hAnsiTheme="majorHAnsi" w:cstheme="majorHAnsi"/>
+                <w:sz w:val="18"/>
+                <w:szCs w:val="18"/>
+              </w:rPr>
+              <w:t xml:space="preserve">Applicability framework by category of service</w:t>
+            </w:r>
+          </w:p>
+        </w:tc>
+        <w:tc>
+          <w:tcPr>
+            <w:tcW w:w="2357" w:type="dxa"/>
+          </w:tcPr>
+          <w:p>
+            <w:pPr>
+              <w:pStyle w:val="BodyText"/>
+              <w:rPr>
+                <w:rFonts w:asciiTheme="majorHAnsi" w:hAnsiTheme="majorHAnsi" w:cstheme="majorHAnsi"/>
+                <w:sz w:val="18"/>
+                <w:szCs w:val="18"/>
+              </w:rPr>
+            </w:pPr>
+            <w:r>
+              <w:rPr>
+                <w:rFonts w:asciiTheme="majorHAnsi" w:hAnsiTheme="majorHAnsi" w:cstheme="majorHAnsi"/>
+                <w:sz w:val="18"/>
+                <w:szCs w:val="18"/>
+              </w:rPr>
+              <w:t xml:space="preserve">Annex 3</w:t>
+            </w:r>
+          </w:p>
+        </w:tc>
+        <w:tc>
+          <w:tcPr>
+            <w:tcW w:w="2357" w:type="dxa"/>
+          </w:tcPr>
+          <w:p>
+            <w:pPr>
+              <w:pStyle w:val="BodyText"/>
+              <w:rPr>
+                <w:rFonts w:asciiTheme="majorHAnsi" w:hAnsiTheme="majorHAnsi" w:cstheme="majorHAnsi"/>
+                <w:sz w:val="18"/>
+                <w:szCs w:val="18"/>
+              </w:rPr>
+            </w:pPr>
+            <w:r>
+              <w:rPr>
+                <w:rFonts w:asciiTheme="majorHAnsi" w:hAnsiTheme="majorHAnsi" w:cstheme="majorHAnsi"/>
+                <w:sz w:val="18"/>
+                <w:szCs w:val="18"/>
+              </w:rPr>
+              <w:t xml:space="preserve">None</w:t>
+            </w:r>
+          </w:p>
+        </w:tc>
+      </w:tr>
+      <w:tr>
+        <w:trPr>
+          <w:trHeight w:val="377"/>
+        </w:trPr>
+        <w:tc>
+          <w:tcPr>
+            <w:tcW w:w="2127" w:type="dxa"/>
+          </w:tcPr>
+          <w:p>
+            <w:pPr>
+              <w:spacing w:line="276" w:lineRule="auto"/>
+              <w:rPr>
+                <w:rFonts w:asciiTheme="majorHAnsi" w:hAnsiTheme="majorHAnsi" w:cstheme="majorHAnsi"/>
+                <w:sz w:val="18"/>
+                <w:szCs w:val="18"/>
+                <w:lang w:val="en-US"/>
+              </w:rPr>
+            </w:pPr>
+            <w:r>
+              <w:rPr>
+                <w:rFonts w:asciiTheme="majorHAnsi" w:hAnsiTheme="majorHAnsi" w:cstheme="majorHAnsi"/>
+                <w:sz w:val="18"/>
+                <w:szCs w:val="18"/>
+              </w:rPr>
+              <w:t xml:space="preserve">Register template</w:t>
+            </w:r>
+          </w:p>
+        </w:tc>
+        <w:tc>
+          <w:tcPr>
+            <w:tcW w:w="2357" w:type="dxa"/>
+          </w:tcPr>
+          <w:p>
+            <w:pPr>
+              <w:pStyle w:val="BodyText"/>
+              <w:rPr>
+                <w:rFonts w:asciiTheme="majorHAnsi" w:hAnsiTheme="majorHAnsi" w:cstheme="majorHAnsi"/>
+                <w:sz w:val="18"/>
+                <w:szCs w:val="18"/>
+              </w:rPr>
+            </w:pPr>
+            <w:r>
+              <w:rPr>
+                <w:rFonts w:asciiTheme="majorHAnsi" w:hAnsiTheme="majorHAnsi" w:cstheme="majorHAnsi"/>
+                <w:sz w:val="18"/>
+                <w:szCs w:val="18"/>
+              </w:rPr>
+              <w:t xml:space="preserve">Footnote 21 link</w:t>
+            </w:r>
+          </w:p>
+        </w:tc>
+        <w:tc>
+          <w:tcPr>
+            <w:tcW w:w="2357" w:type="dxa"/>
+          </w:tcPr>
+          <w:p>
+            <w:pPr>
+              <w:pStyle w:val="BodyText"/>
+              <w:rPr>
+                <w:rFonts w:asciiTheme="majorHAnsi" w:hAnsiTheme="majorHAnsi" w:cstheme="majorHAnsi"/>
+                <w:sz w:val="18"/>
+                <w:szCs w:val="18"/>
+              </w:rPr>
+            </w:pPr>
+            <w:r>
+              <w:rPr>
+                <w:rFonts w:asciiTheme="majorHAnsi" w:hAnsiTheme="majorHAnsi" w:cstheme="majorHAnsi"/>
+                <w:sz w:val="18"/>
+                <w:szCs w:val="18"/>
+              </w:rPr>
+              <w:t xml:space="preserve">Annex 4</w:t>
             </w:r>
           </w:p>
         </w:tc>

</xml_diff>

<commit_message>
Apply agent-confirmed spec corrections to comparative document
- Rename 'List of Identical' -> 'Substantially Equivalent Provisions'; fix its
  written-agreements, termination, country-risk, control, audit and internal-audit rows
- Correct Bank 1.4 exemption analysis (Annex D of Notices; Bank Annexes 1-3; FI Annex 1)
- Recognise Bank Annex 1(3) periodic-review as the counterpart to FI 5.8.2(d)
- Restore Bank 3.4.2 footnotes 10 and 11; superscript all footnote markers
- Remove PDF artefacts (stray 'a', 3.3.2 page header, restore displaced fn 5 to 3.2.1)
- Re-align annex rows by subject (Bank Annex 1<->FI Annex 3; Bank Annex 2<->FI Annex 5; standalone rows for the rest)
- Rename FI-only section and add analogue caveats; restore FI 1.3

Co-Authored-By: Claude Fable 5 <noreply@anthropic.com>
Claude-Session: https://claude.ai/code/session_01JPzxLJCqu7ynMjqaCPY5Jt
</commit_message>
<xml_diff>
--- a/Comparative Between MAS Guidelines on Outsourcing For Banks Against Financial Institutions.docx
+++ b/Comparative Between MAS Guidelines on Outsourcing For Banks Against Financial Institutions.docx
@@ -210,7 +210,7 @@
         </w:numPr>
       </w:pPr>
       <w:r>
-        <w:t>A list of identical provisions;</w:t>
+        <w:t>A list of substantially equivalent provisions;</w:t>
       </w:r>
     </w:p>
     <w:p>
@@ -308,7 +308,7 @@
           <w:szCs w:val="18"/>
         </w:rPr>
         <w:lastRenderedPageBreak/>
-        <w:t>List of Identical Provisions</w:t>
+        <w:t>Substantially Equivalent Provisions</w:t>
       </w:r>
     </w:p>
     <w:p>
@@ -317,7 +317,7 @@
         <w:ind w:left="0"/>
       </w:pPr>
       <w:r>
-        <w:t>The provisions in this section are identical apart from the terms “bank” and “institution”, “MOORS” and “material outsourcing arrangement”.</w:t>
+        <w:t>The provisions in this section are substantially equivalent between the two sets of Guidelines, differing only in the terms “Bank”/“institution”, cross-references and similar drafting variations.</w:t>
       </w:r>
     </w:p>
     <w:tbl>
@@ -988,7 +988,7 @@
                 <w:sz w:val="18"/>
                 <w:szCs w:val="18"/>
               </w:rPr>
-              <w:t>3.4.4 and 5.5.2(i)</w:t>
+              <w:t xml:space="preserve">3.4.1</w:t>
             </w:r>
           </w:p>
         </w:tc>
@@ -1011,7 +1011,7 @@
                 <w:sz w:val="18"/>
                 <w:szCs w:val="18"/>
               </w:rPr>
-              <w:t>3.4.8 and 5.5.3</w:t>
+              <w:t xml:space="preserve">5.5.1</w:t>
             </w:r>
           </w:p>
         </w:tc>
@@ -1026,20 +1026,20 @@
           </w:tcPr>
           <w:p>
             <w:pPr>
-              <w:spacing w:line="276" w:lineRule="auto"/>
-              <w:rPr>
-                <w:rFonts w:asciiTheme="majorHAnsi" w:hAnsiTheme="majorHAnsi" w:cstheme="majorHAnsi"/>
-                <w:sz w:val="18"/>
-                <w:szCs w:val="18"/>
-              </w:rPr>
-            </w:pPr>
-            <w:r>
-              <w:rPr>
-                <w:rFonts w:asciiTheme="majorHAnsi" w:hAnsiTheme="majorHAnsi" w:cstheme="majorHAnsi"/>
-                <w:sz w:val="18"/>
-                <w:szCs w:val="18"/>
-              </w:rPr>
-              <w:t>Confidentiality and security</w:t>
+              <w:pStyle w:val="BodyText"/>
+              <w:rPr>
+                <w:rFonts w:asciiTheme="majorHAnsi" w:hAnsiTheme="majorHAnsi" w:cstheme="majorHAnsi"/>
+                <w:sz w:val="18"/>
+                <w:szCs w:val="18"/>
+              </w:rPr>
+            </w:pPr>
+            <w:r>
+              <w:rPr>
+                <w:rFonts w:asciiTheme="majorHAnsi" w:hAnsiTheme="majorHAnsi" w:cstheme="majorHAnsi"/>
+                <w:sz w:val="18"/>
+                <w:szCs w:val="18"/>
+              </w:rPr>
+              <w:t xml:space="preserve">Termination mechanics</w:t>
             </w:r>
           </w:p>
         </w:tc>
@@ -1062,7 +1062,7 @@
                 <w:sz w:val="18"/>
                 <w:szCs w:val="18"/>
               </w:rPr>
-              <w:t>3.6.1 – 3.6.2</w:t>
+              <w:t xml:space="preserve">3.4.4</w:t>
             </w:r>
           </w:p>
         </w:tc>
@@ -1085,7 +1085,7 @@
                 <w:sz w:val="18"/>
                 <w:szCs w:val="18"/>
               </w:rPr>
-              <w:t>5.6.1 – 5.6.2</w:t>
+              <w:t xml:space="preserve">5.5.2(i)</w:t>
             </w:r>
           </w:p>
         </w:tc>
@@ -1100,20 +1100,20 @@
           </w:tcPr>
           <w:p>
             <w:pPr>
-              <w:spacing w:line="276" w:lineRule="auto"/>
-              <w:rPr>
-                <w:rFonts w:asciiTheme="majorHAnsi" w:hAnsiTheme="majorHAnsi" w:cstheme="majorHAnsi"/>
-                <w:sz w:val="18"/>
-                <w:szCs w:val="18"/>
-              </w:rPr>
-            </w:pPr>
-            <w:r>
-              <w:rPr>
-                <w:rFonts w:asciiTheme="majorHAnsi" w:hAnsiTheme="majorHAnsi" w:cstheme="majorHAnsi"/>
-                <w:sz w:val="18"/>
-                <w:szCs w:val="18"/>
-              </w:rPr>
-              <w:t>Business continuity management</w:t>
+              <w:pStyle w:val="BodyText"/>
+              <w:rPr>
+                <w:rFonts w:asciiTheme="majorHAnsi" w:hAnsiTheme="majorHAnsi" w:cstheme="majorHAnsi"/>
+                <w:sz w:val="18"/>
+                <w:szCs w:val="18"/>
+              </w:rPr>
+            </w:pPr>
+            <w:r>
+              <w:rPr>
+                <w:rFonts w:asciiTheme="majorHAnsi" w:hAnsiTheme="majorHAnsi" w:cstheme="majorHAnsi"/>
+                <w:sz w:val="18"/>
+                <w:szCs w:val="18"/>
+              </w:rPr>
+              <w:t xml:space="preserve">Overseas outsourcing – country risk</w:t>
             </w:r>
           </w:p>
         </w:tc>
@@ -1136,7 +1136,7 @@
                 <w:sz w:val="18"/>
                 <w:szCs w:val="18"/>
               </w:rPr>
-              <w:t>3.7.1 – 3.7.4</w:t>
+              <w:t xml:space="preserve">3.4.8</w:t>
             </w:r>
           </w:p>
         </w:tc>
@@ -1159,7 +1159,7 @@
                 <w:sz w:val="18"/>
                 <w:szCs w:val="18"/>
               </w:rPr>
-              <w:t>5.7.1 – 5.7.4</w:t>
+              <w:t xml:space="preserve">5.5.3</w:t>
             </w:r>
           </w:p>
         </w:tc>
@@ -1187,7 +1187,7 @@
                 <w:sz w:val="18"/>
                 <w:szCs w:val="18"/>
               </w:rPr>
-              <w:t>Control structure</w:t>
+              <w:t>Confidentiality and security</w:t>
             </w:r>
           </w:p>
         </w:tc>
@@ -1210,7 +1210,7 @@
                 <w:sz w:val="18"/>
                 <w:szCs w:val="18"/>
               </w:rPr>
-              <w:t>3.8.1 – 3.8.2</w:t>
+              <w:t>3.6.1 – 3.6.2</w:t>
             </w:r>
           </w:p>
         </w:tc>
@@ -1233,7 +1233,7 @@
                 <w:sz w:val="18"/>
                 <w:szCs w:val="18"/>
               </w:rPr>
-              <w:t>5.8.1 – 5.8.2</w:t>
+              <w:t>5.6.1 – 5.6.2</w:t>
             </w:r>
           </w:p>
         </w:tc>
@@ -1261,7 +1261,7 @@
                 <w:sz w:val="18"/>
                 <w:szCs w:val="18"/>
               </w:rPr>
-              <w:t>Audit framework</w:t>
+              <w:t>Business continuity management</w:t>
             </w:r>
           </w:p>
         </w:tc>
@@ -1284,7 +1284,7 @@
                 <w:sz w:val="18"/>
                 <w:szCs w:val="18"/>
               </w:rPr>
-              <w:t>3.9.1 and 5.9.1</w:t>
+              <w:t>3.7.1 – 3.7.4</w:t>
             </w:r>
           </w:p>
         </w:tc>
@@ -1307,7 +1307,7 @@
                 <w:sz w:val="18"/>
                 <w:szCs w:val="18"/>
               </w:rPr>
-              <w:t>3.9.4 – 3.9.6 and 5.9.5 – 5.9.8</w:t>
+              <w:t>5.7.1 – 5.7.4</w:t>
             </w:r>
           </w:p>
         </w:tc>
@@ -1335,7 +1335,7 @@
                 <w:sz w:val="18"/>
                 <w:szCs w:val="18"/>
               </w:rPr>
-              <w:t>Due diligence for overseas outsourcing</w:t>
+              <w:t>Control structure</w:t>
             </w:r>
           </w:p>
         </w:tc>
@@ -1358,7 +1358,7 @@
                 <w:sz w:val="18"/>
                 <w:szCs w:val="18"/>
               </w:rPr>
-              <w:t>3.10.1</w:t>
+              <w:t xml:space="preserve">3.8.1</w:t>
             </w:r>
           </w:p>
         </w:tc>
@@ -1381,7 +1381,7 @@
                 <w:sz w:val="18"/>
                 <w:szCs w:val="18"/>
               </w:rPr>
-              <w:t>5.10.1</w:t>
+              <w:t xml:space="preserve">5.8.1</w:t>
             </w:r>
           </w:p>
         </w:tc>
@@ -1396,21 +1396,20 @@
           </w:tcPr>
           <w:p>
             <w:pPr>
-              <w:spacing w:line="276" w:lineRule="auto"/>
-              <w:rPr>
-                <w:rFonts w:asciiTheme="majorHAnsi" w:hAnsiTheme="majorHAnsi" w:cstheme="majorHAnsi"/>
-                <w:sz w:val="18"/>
-                <w:szCs w:val="18"/>
-              </w:rPr>
-            </w:pPr>
-            <w:r>
-              <w:rPr>
-                <w:rFonts w:asciiTheme="majorHAnsi" w:hAnsiTheme="majorHAnsi" w:cstheme="majorHAnsi"/>
-                <w:sz w:val="18"/>
-                <w:szCs w:val="18"/>
-              </w:rPr>
-              <w:lastRenderedPageBreak/>
-              <w:t>Outsourcing within a group</w:t>
+              <w:pStyle w:val="BodyText"/>
+              <w:rPr>
+                <w:rFonts w:asciiTheme="majorHAnsi" w:hAnsiTheme="majorHAnsi" w:cstheme="majorHAnsi"/>
+                <w:sz w:val="18"/>
+                <w:szCs w:val="18"/>
+              </w:rPr>
+            </w:pPr>
+            <w:r>
+              <w:rPr>
+                <w:rFonts w:asciiTheme="majorHAnsi" w:hAnsiTheme="majorHAnsi" w:cstheme="majorHAnsi"/>
+                <w:sz w:val="18"/>
+                <w:szCs w:val="18"/>
+              </w:rPr>
+              <w:t xml:space="preserve">Audit and inspection – principle</w:t>
             </w:r>
           </w:p>
         </w:tc>
@@ -1433,7 +1432,7 @@
                 <w:sz w:val="18"/>
                 <w:szCs w:val="18"/>
               </w:rPr>
-              <w:t>3.11.2 – 3.11.2</w:t>
+              <w:t xml:space="preserve">3.9.1</w:t>
             </w:r>
           </w:p>
         </w:tc>
@@ -1456,7 +1455,7 @@
                 <w:sz w:val="18"/>
                 <w:szCs w:val="18"/>
               </w:rPr>
-              <w:t>5.11.2 – 5.11.2</w:t>
+              <w:t xml:space="preserve">5.9.1</w:t>
             </w:r>
           </w:p>
         </w:tc>
@@ -1471,6 +1470,80 @@
           </w:tcPr>
           <w:p>
             <w:pPr>
+              <w:pStyle w:val="BodyText"/>
+              <w:rPr>
+                <w:rFonts w:asciiTheme="majorHAnsi" w:hAnsiTheme="majorHAnsi" w:cstheme="majorHAnsi"/>
+                <w:sz w:val="18"/>
+                <w:szCs w:val="18"/>
+              </w:rPr>
+            </w:pPr>
+            <w:r>
+              <w:rPr>
+                <w:rFonts w:asciiTheme="majorHAnsi" w:hAnsiTheme="majorHAnsi" w:cstheme="majorHAnsi"/>
+                <w:sz w:val="18"/>
+                <w:szCs w:val="18"/>
+              </w:rPr>
+              <w:t xml:space="preserve">Independent audits, remediation and escalation</w:t>
+            </w:r>
+          </w:p>
+        </w:tc>
+        <w:tc>
+          <w:tcPr>
+            <w:tcW w:w="2357" w:type="dxa"/>
+          </w:tcPr>
+          <w:p>
+            <w:pPr>
+              <w:pStyle w:val="BodyText"/>
+              <w:rPr>
+                <w:rFonts w:asciiTheme="majorHAnsi" w:hAnsiTheme="majorHAnsi" w:cstheme="majorHAnsi"/>
+                <w:sz w:val="18"/>
+                <w:szCs w:val="18"/>
+              </w:rPr>
+            </w:pPr>
+            <w:r>
+              <w:rPr>
+                <w:rFonts w:asciiTheme="majorHAnsi" w:hAnsiTheme="majorHAnsi" w:cstheme="majorHAnsi"/>
+                <w:sz w:val="18"/>
+                <w:szCs w:val="18"/>
+              </w:rPr>
+              <w:t xml:space="preserve">3.9.4 – 3.9.6</w:t>
+            </w:r>
+          </w:p>
+        </w:tc>
+        <w:tc>
+          <w:tcPr>
+            <w:tcW w:w="2357" w:type="dxa"/>
+          </w:tcPr>
+          <w:p>
+            <w:pPr>
+              <w:pStyle w:val="BodyText"/>
+              <w:rPr>
+                <w:rFonts w:asciiTheme="majorHAnsi" w:hAnsiTheme="majorHAnsi" w:cstheme="majorHAnsi"/>
+                <w:sz w:val="18"/>
+                <w:szCs w:val="18"/>
+              </w:rPr>
+            </w:pPr>
+            <w:r>
+              <w:rPr>
+                <w:rFonts w:asciiTheme="majorHAnsi" w:hAnsiTheme="majorHAnsi" w:cstheme="majorHAnsi"/>
+                <w:sz w:val="18"/>
+                <w:szCs w:val="18"/>
+              </w:rPr>
+              <w:t xml:space="preserve">5.9.5 – 5.9.7</w:t>
+            </w:r>
+          </w:p>
+        </w:tc>
+      </w:tr>
+      <w:tr>
+        <w:trPr>
+          <w:trHeight w:val="377"/>
+        </w:trPr>
+        <w:tc>
+          <w:tcPr>
+            <w:tcW w:w="2127" w:type="dxa"/>
+          </w:tcPr>
+          <w:p>
+            <w:pPr>
               <w:spacing w:line="276" w:lineRule="auto"/>
               <w:rPr>
                 <w:rFonts w:asciiTheme="majorHAnsi" w:hAnsiTheme="majorHAnsi" w:cstheme="majorHAnsi"/>
@@ -1484,6 +1557,155 @@
                 <w:sz w:val="18"/>
                 <w:szCs w:val="18"/>
               </w:rPr>
+              <w:t>Due diligence for overseas outsourcing</w:t>
+            </w:r>
+          </w:p>
+        </w:tc>
+        <w:tc>
+          <w:tcPr>
+            <w:tcW w:w="2357" w:type="dxa"/>
+          </w:tcPr>
+          <w:p>
+            <w:pPr>
+              <w:pStyle w:val="BodyText"/>
+              <w:rPr>
+                <w:rFonts w:asciiTheme="majorHAnsi" w:hAnsiTheme="majorHAnsi" w:cstheme="majorHAnsi"/>
+                <w:sz w:val="18"/>
+                <w:szCs w:val="18"/>
+              </w:rPr>
+            </w:pPr>
+            <w:r>
+              <w:rPr>
+                <w:rFonts w:asciiTheme="majorHAnsi" w:hAnsiTheme="majorHAnsi" w:cstheme="majorHAnsi"/>
+                <w:sz w:val="18"/>
+                <w:szCs w:val="18"/>
+              </w:rPr>
+              <w:t>3.10.1</w:t>
+            </w:r>
+          </w:p>
+        </w:tc>
+        <w:tc>
+          <w:tcPr>
+            <w:tcW w:w="2357" w:type="dxa"/>
+          </w:tcPr>
+          <w:p>
+            <w:pPr>
+              <w:pStyle w:val="BodyText"/>
+              <w:rPr>
+                <w:rFonts w:asciiTheme="majorHAnsi" w:hAnsiTheme="majorHAnsi" w:cstheme="majorHAnsi"/>
+                <w:sz w:val="18"/>
+                <w:szCs w:val="18"/>
+              </w:rPr>
+            </w:pPr>
+            <w:r>
+              <w:rPr>
+                <w:rFonts w:asciiTheme="majorHAnsi" w:hAnsiTheme="majorHAnsi" w:cstheme="majorHAnsi"/>
+                <w:sz w:val="18"/>
+                <w:szCs w:val="18"/>
+              </w:rPr>
+              <w:t>5.10.1</w:t>
+            </w:r>
+          </w:p>
+        </w:tc>
+      </w:tr>
+      <w:tr>
+        <w:trPr>
+          <w:trHeight w:val="377"/>
+        </w:trPr>
+        <w:tc>
+          <w:tcPr>
+            <w:tcW w:w="2127" w:type="dxa"/>
+          </w:tcPr>
+          <w:p>
+            <w:pPr>
+              <w:spacing w:line="276" w:lineRule="auto"/>
+              <w:rPr>
+                <w:rFonts w:asciiTheme="majorHAnsi" w:hAnsiTheme="majorHAnsi" w:cstheme="majorHAnsi"/>
+                <w:sz w:val="18"/>
+                <w:szCs w:val="18"/>
+              </w:rPr>
+            </w:pPr>
+            <w:r>
+              <w:rPr>
+                <w:rFonts w:asciiTheme="majorHAnsi" w:hAnsiTheme="majorHAnsi" w:cstheme="majorHAnsi"/>
+                <w:sz w:val="18"/>
+                <w:szCs w:val="18"/>
+              </w:rPr>
+              <w:lastRenderedPageBreak/>
+              <w:t>Outsourcing within a group</w:t>
+            </w:r>
+          </w:p>
+        </w:tc>
+        <w:tc>
+          <w:tcPr>
+            <w:tcW w:w="2357" w:type="dxa"/>
+          </w:tcPr>
+          <w:p>
+            <w:pPr>
+              <w:pStyle w:val="BodyText"/>
+              <w:rPr>
+                <w:rFonts w:asciiTheme="majorHAnsi" w:hAnsiTheme="majorHAnsi" w:cstheme="majorHAnsi"/>
+                <w:sz w:val="18"/>
+                <w:szCs w:val="18"/>
+              </w:rPr>
+            </w:pPr>
+            <w:r>
+              <w:rPr>
+                <w:rFonts w:asciiTheme="majorHAnsi" w:hAnsiTheme="majorHAnsi" w:cstheme="majorHAnsi"/>
+                <w:sz w:val="18"/>
+                <w:szCs w:val="18"/>
+              </w:rPr>
+              <w:t xml:space="preserve">3.11.2</w:t>
+            </w:r>
+          </w:p>
+        </w:tc>
+        <w:tc>
+          <w:tcPr>
+            <w:tcW w:w="2357" w:type="dxa"/>
+          </w:tcPr>
+          <w:p>
+            <w:pPr>
+              <w:pStyle w:val="BodyText"/>
+              <w:rPr>
+                <w:rFonts w:asciiTheme="majorHAnsi" w:hAnsiTheme="majorHAnsi" w:cstheme="majorHAnsi"/>
+                <w:sz w:val="18"/>
+                <w:szCs w:val="18"/>
+              </w:rPr>
+            </w:pPr>
+            <w:r>
+              <w:rPr>
+                <w:rFonts w:asciiTheme="majorHAnsi" w:hAnsiTheme="majorHAnsi" w:cstheme="majorHAnsi"/>
+                <w:sz w:val="18"/>
+                <w:szCs w:val="18"/>
+              </w:rPr>
+              <w:t xml:space="preserve">5.11.2</w:t>
+            </w:r>
+          </w:p>
+        </w:tc>
+      </w:tr>
+      <w:tr>
+        <w:trPr>
+          <w:trHeight w:val="377"/>
+        </w:trPr>
+        <w:tc>
+          <w:tcPr>
+            <w:tcW w:w="2127" w:type="dxa"/>
+          </w:tcPr>
+          <w:p>
+            <w:pPr>
+              <w:spacing w:line="276" w:lineRule="auto"/>
+              <w:rPr>
+                <w:rFonts w:asciiTheme="majorHAnsi" w:hAnsiTheme="majorHAnsi" w:cstheme="majorHAnsi"/>
+                <w:sz w:val="18"/>
+                <w:szCs w:val="18"/>
+              </w:rPr>
+            </w:pPr>
+            <w:r>
+              <w:rPr>
+                <w:rFonts w:asciiTheme="majorHAnsi" w:hAnsiTheme="majorHAnsi" w:cstheme="majorHAnsi"/>
+                <w:sz w:val="18"/>
+                <w:szCs w:val="18"/>
+              </w:rPr>
               <w:t>Outsourcing internal audits</w:t>
             </w:r>
           </w:p>
@@ -1507,7 +1729,7 @@
                 <w:sz w:val="18"/>
                 <w:szCs w:val="18"/>
               </w:rPr>
-              <w:t>3.12.1 – 3.12.3</w:t>
+              <w:t xml:space="preserve">3.12.2 – 3.12.3</w:t>
             </w:r>
           </w:p>
         </w:tc>
@@ -1530,7 +1752,7 @@
                 <w:sz w:val="18"/>
                 <w:szCs w:val="18"/>
               </w:rPr>
-              <w:t>5.12.1 – 5.12.3</w:t>
+              <w:t xml:space="preserve">5.12.2 – 5.12.3</w:t>
             </w:r>
           </w:p>
         </w:tc>
@@ -3070,7 +3292,7 @@
                 <w:sz w:val="18"/>
                 <w:szCs w:val="18"/>
               </w:rPr>
-              <w:t xml:space="preserve">None (periodic-review obligations are in the Notices)</w:t>
+              <w:t xml:space="preserve">Annex 1(3) – periodic reviews, no fixed minimum</w:t>
             </w:r>
           </w:p>
         </w:tc>
@@ -4991,54 +5213,20 @@
           </w:tcPr>
           <w:p>
             <w:pPr>
-              <w:pStyle w:val="ListParagraph"/>
-              <w:numPr>
-                <w:ilvl w:val="0"/>
-                <w:numId w:val="31"/>
-              </w:numPr>
-              <w:tabs>
-                <w:tab w:val="left" w:pos="360"/>
-              </w:tabs>
-              <w:spacing w:line="276" w:lineRule="auto"/>
-              <w:rPr>
-                <w:rFonts w:asciiTheme="majorHAnsi" w:hAnsiTheme="majorHAnsi" w:cstheme="majorHAnsi"/>
-                <w:sz w:val="18"/>
-                <w:szCs w:val="18"/>
-              </w:rPr>
-            </w:pPr>
-            <w:r>
-              <w:rPr>
-                <w:rFonts w:asciiTheme="majorHAnsi" w:hAnsiTheme="majorHAnsi" w:cstheme="majorHAnsi"/>
-                <w:sz w:val="18"/>
-                <w:szCs w:val="18"/>
-              </w:rPr>
-              <w:t>Bank Guidelines 1.4 is comparable to FI Guidelines 2.2. The two prescribe different sources for which services are exempt: for the Bank Guidelines, Annexes 1, 2, and 3; for the FI Guidelines, Annexes 1 – 5.</w:t>
-            </w:r>
-          </w:p>
-          <w:p>
-            <w:pPr>
-              <w:pStyle w:val="ListParagraph"/>
-              <w:numPr>
-                <w:ilvl w:val="0"/>
-                <w:numId w:val="31"/>
-              </w:numPr>
-              <w:tabs>
-                <w:tab w:val="left" w:pos="360"/>
-              </w:tabs>
-              <w:spacing w:line="276" w:lineRule="auto"/>
-              <w:rPr>
-                <w:rFonts w:asciiTheme="majorHAnsi" w:hAnsiTheme="majorHAnsi" w:cstheme="majorHAnsi"/>
-                <w:sz w:val="18"/>
-                <w:szCs w:val="18"/>
-              </w:rPr>
-            </w:pPr>
-            <w:r>
-              <w:rPr>
-                <w:rFonts w:asciiTheme="majorHAnsi" w:hAnsiTheme="majorHAnsi" w:cstheme="majorHAnsi"/>
-                <w:sz w:val="18"/>
-                <w:szCs w:val="18"/>
-              </w:rPr>
-              <w:t>FI Guidelines 1.4: The phrase “and last revised on 24 January 2025” is not found in 1.6.</w:t>
+              <w:pStyle w:val="BodyText"/>
+              <w:rPr>
+                <w:rFonts w:asciiTheme="majorHAnsi" w:hAnsiTheme="majorHAnsi" w:cstheme="majorHAnsi"/>
+                <w:sz w:val="18"/>
+                <w:szCs w:val="18"/>
+              </w:rPr>
+            </w:pPr>
+            <w:r>
+              <w:rPr>
+                <w:rFonts w:asciiTheme="majorHAnsi" w:hAnsiTheme="majorHAnsi" w:cstheme="majorHAnsi"/>
+                <w:sz w:val="18"/>
+                <w:szCs w:val="18"/>
+              </w:rPr>
+              <w:t xml:space="preserve">Bank Guidelines 1.4 is comparable to FI Guidelines 2.2. The location of exemptions differs: bank and merchant-bank exemptions are in Annex D of the applicable Notice (Notice 658 or Notice 1121); Bank Guideline Annexes 1–3 cover materiality, cloud computing and applicability to categories of relevant services. FI Guideline Annex 1 contains the exemption list; FI Annexes 2–5 concern examples, materiality, the register and cloud computing.</w:t>
             </w:r>
           </w:p>
         </w:tc>
@@ -7161,7 +7349,7 @@
                 <w:sz w:val="18"/>
                 <w:szCs w:val="18"/>
               </w:rPr>
-              <w:t xml:space="preserve">assessing management competencies for developing sound and responsive outsourcing risk management policies and procedures that are commensurate with the nature, scope and complexity of the outsourcing arrangements; a</w:t>
+              <w:t xml:space="preserve">assessing management competencies for developing sound and responsive outsourcing risk management policies and procedures that are commensurate with the nature, scope and complexity of the outsourcing arrangements;</w:t>
             </w:r>
           </w:p>
           <w:p>
@@ -8054,6 +8242,24 @@
               <w:t xml:space="preserve">(f) analysing the benefits of outsourcing against the risks that may arise, ranging from the impact of temporary disruption to service to that of a breach in security and confidentiality, and unexpected termination of the outsourcing arrangement, and whether for strategic and internal control reasons, the Bank should not enter into the outsourcing arrangement.</w:t>
             </w:r>
           </w:p>
+          <w:p>
+            <w:pPr>
+              <w:pStyle w:val="BodyText"/>
+              <w:rPr>
+                <w:rFonts w:asciiTheme="majorHAnsi" w:hAnsiTheme="majorHAnsi" w:cstheme="majorHAnsi"/>
+                <w:sz w:val="16"/>
+                <w:szCs w:val="16"/>
+              </w:rPr>
+            </w:pPr>
+            <w:r>
+              <w:rPr>
+                <w:rFonts w:asciiTheme="majorHAnsi" w:hAnsiTheme="majorHAnsi" w:cstheme="majorHAnsi"/>
+                <w:sz w:val="16"/>
+                <w:szCs w:val="16"/>
+              </w:rPr>
+              <w:t xml:space="preserve">5 – Please see paragraph 3.3 on assessment of service providers.</w:t>
+            </w:r>
+          </w:p>
         </w:tc>
         <w:tc>
           <w:tcPr>
@@ -8624,7 +8830,7 @@
                 <w:sz w:val="18"/>
                 <w:szCs w:val="18"/>
               </w:rPr>
-              <w:t xml:space="preserve">A Bank should assess all relevant aspects of the service provider, including its capability to employ a high standard of care in the performance of the outsourcing arrangement as if the service is performed by the Bank to meet its obligations as a regulated entity. The due diligence should also take into account the physical and IT security controls the service provider has in place, the business reputation and financial strength of the service provider, including the ethical and professional standards held by the service provider, and its ability to meet obligations under the outsourcing arrangement. Onsite visits to the service provider, and where possible, independent reviews and market feedback on the 5Please see paragraph 3.3 on assessment of service providers. Guidelines on Outsourcing (Banks) 11/12/2023 | 9 service provider, should also be obtained to supplement the Bank’s assessment. Onsite visits should be conducted by persons who possess the requisite knowledge and skills to conduct the assessment.</w:t>
+              <w:t xml:space="preserve">A Bank should assess all relevant aspects of the service provider, including its capability to employ a high standard of care in the performance of the outsourcing arrangement as if the service is performed by the Bank to meet its obligations as a regulated entity. The due diligence should also take into account the physical and IT security controls the service provider has in place, the business reputation and financial strength of the service provider, including the ethical and professional standards held by the service provider, and its ability to meet obligations under the outsourcing arrangement. Onsite visits to the service provider, and where possible, independent reviews and market feedback on the service provider, should also be obtained to supplement the Bank’s assessment. Onsite visits should be conducted by persons who possess the requisite knowledge and skills to conduct the assessment.</w:t>
             </w:r>
           </w:p>
         </w:tc>
@@ -9593,41 +9799,7 @@
                 <w:sz w:val="18"/>
                 <w:szCs w:val="18"/>
               </w:rPr>
-              <w:t xml:space="preserve">A Bank should ensure that every outsourcing agreement addresses the risks identified at the risk evaluation and due diligence stages. Each outsourcing agreement should allow for timely renegotiation and renewal to enable the Bank to retain an appropriate level of control over the outsourcing arrangement and the right to intervene with appropriate measures to meet its legal and regulatory obligations. It should at the very least, have provisions to address the following aspects of outsourcing: (a) scope of the outsourcing arrangement; (b) performance, operational, internal control and risk management standards; (c) confidentiality and security</w:t>
-            </w:r>
-            <w:r>
-              <w:rPr>
-                <w:rFonts w:asciiTheme="majorHAnsi" w:hAnsiTheme="majorHAnsi" w:cstheme="majorHAnsi"/>
-                <w:highlight w:val="yellow"/>
-                <w:sz w:val="18"/>
-                <w:szCs w:val="18"/>
-              </w:rPr>
-              <w:t xml:space="preserve">9</w:t>
-            </w:r>
-            <w:r>
-              <w:rPr>
-                <w:rFonts w:asciiTheme="majorHAnsi" w:hAnsiTheme="majorHAnsi" w:cstheme="majorHAnsi"/>
-                <w:sz w:val="18"/>
-                <w:szCs w:val="18"/>
-              </w:rPr>
-              <w:t xml:space="preserve">; (d) business continuity management; (e) monitoring and control; (f) audit and inspection</w:t>
-            </w:r>
-            <w:r>
-              <w:rPr>
-                <w:rFonts w:asciiTheme="majorHAnsi" w:hAnsiTheme="majorHAnsi" w:cstheme="majorHAnsi"/>
-                <w:highlight w:val="yellow"/>
-                <w:sz w:val="18"/>
-                <w:szCs w:val="18"/>
-              </w:rPr>
-              <w:t xml:space="preserve">12</w:t>
-            </w:r>
-            <w:r>
-              <w:rPr>
-                <w:rFonts w:asciiTheme="majorHAnsi" w:hAnsiTheme="majorHAnsi" w:cstheme="majorHAnsi"/>
-                <w:sz w:val="18"/>
-                <w:szCs w:val="18"/>
-              </w:rPr>
-              <w:t xml:space="preserve">; (g) notification of adverse developments — A Bank should specify in its outsourcing agreement the type of events and the circumstances under which the service provider should report to the Bank in order for the Bank to take prompt risk mitigation measures and notify MAS of such developments under paragraph 2.2; (h) dispute resolution — A Bank should specify in its outsourcing agreement the resolution process, events of default, and the indemnities, remedies and recourse of the respective parties in the agreement. The Bank should ensure that its contractual rights can be exercised in the event of a breach of the outsourcing agreement by the service provider; (i) default termination and early exit</w:t>
+              <w:t xml:space="preserve">A Bank should ensure that every outsourcing agreement addresses the risks identified at the risk evaluation and due diligence stages. Each outsourcing agreement should allow for timely renegotiation and renewal to enable the Bank to retain an appropriate level of control over the outsourcing arrangement and the right to intervene with appropriate measures to meet its legal and regulatory obligations. It should at the very least, have provisions to address the following aspects of outsourcing: (a) scope of the outsourcing arrangement; (b) performance, operational, internal control and risk management standards; (c) confidentiality and security9; (d) business continuity management</w:t>
             </w:r>
             <w:r>
               <w:rPr>
@@ -9636,15 +9808,32 @@
                 <w:szCs w:val="18"/>
                 <w:vertAlign w:val="superscript"/>
               </w:rPr>
-              <w:t xml:space="preserve">13</w:t>
-            </w:r>
-            <w:r>
-              <w:rPr>
-                <w:rFonts w:asciiTheme="majorHAnsi" w:hAnsiTheme="majorHAnsi" w:cstheme="majorHAnsi"/>
-                <w:sz w:val="18"/>
-                <w:szCs w:val="18"/>
-              </w:rPr>
-              <w:t xml:space="preserve">; (j) applicable laws — Agreements should include choice-of-law provisions, agreement covenants and jurisdictional covenants that provide for adjudication of disputes between the parties under the laws of a specific jurisdiction.</w:t>
+              <w:t xml:space="preserve">10</w:t>
+            </w:r>
+            <w:r>
+              <w:rPr>
+                <w:rFonts w:asciiTheme="majorHAnsi" w:hAnsiTheme="majorHAnsi" w:cstheme="majorHAnsi"/>
+                <w:sz w:val="18"/>
+                <w:szCs w:val="18"/>
+              </w:rPr>
+              <w:t xml:space="preserve">; (e) monitoring and control</w:t>
+            </w:r>
+            <w:r>
+              <w:rPr>
+                <w:rFonts w:asciiTheme="majorHAnsi" w:hAnsiTheme="majorHAnsi" w:cstheme="majorHAnsi"/>
+                <w:sz w:val="18"/>
+                <w:szCs w:val="18"/>
+                <w:vertAlign w:val="superscript"/>
+              </w:rPr>
+              <w:t xml:space="preserve">11</w:t>
+            </w:r>
+            <w:r>
+              <w:rPr>
+                <w:rFonts w:asciiTheme="majorHAnsi" w:hAnsiTheme="majorHAnsi" w:cstheme="majorHAnsi"/>
+                <w:sz w:val="18"/>
+                <w:szCs w:val="18"/>
+              </w:rPr>
+              <w:t xml:space="preserve">; (f) audit and inspection12; (g) notification of adverse developments — A Bank should specify in its outsourcing agreement the type of events and the circumstances under which the service provider should report to the Bank in order for the Bank to take prompt risk mitigation measures and notify MAS of such developments under paragraph 2.2; (h) dispute resolution — A Bank should specify in its outsourcing agreement the resolution process, events of default, and the indemnities, remedies and recourse of the respective parties in the agreement. The Bank should ensure that its contractual rights can be exercised in the event of a breach of the outsourcing agreement by the service provider; (i) default termination and early exit13; (j) applicable laws — Agreements should include choice-of-law provisions, agreement covenants and jurisdictional covenants that provide for adjudication of disputes between the parties under the laws of a specific jurisdiction.</w:t>
             </w:r>
           </w:p>
           <w:p>
@@ -9688,17 +9877,26 @@
                 <w:rFonts w:asciiTheme="majorHAnsi" w:hAnsiTheme="majorHAnsi" w:cstheme="majorHAnsi"/>
                 <w:sz w:val="16"/>
                 <w:szCs w:val="16"/>
-                <w:vertAlign w:val="superscript"/>
-              </w:rPr>
-              <w:t xml:space="preserve">12</w:t>
-            </w:r>
-            <w:r>
+              </w:rPr>
+              <w:t xml:space="preserve">10 – Refer to paragraph 3.7.</w:t>
+            </w:r>
+          </w:p>
+          <w:p>
+            <w:pPr>
+              <w:pStyle w:val="BodyText"/>
               <w:rPr>
                 <w:rFonts w:asciiTheme="majorHAnsi" w:hAnsiTheme="majorHAnsi" w:cstheme="majorHAnsi"/>
                 <w:sz w:val="16"/>
                 <w:szCs w:val="16"/>
               </w:rPr>
-              <w:t xml:space="preserve"> – The provisions of the outsourcing agreement for a MOORS that relate to audit and inspection should include the requirements set out in paragraph 7.1(d) of the Notices. Refer also to paragraph 3.9.</w:t>
+            </w:pPr>
+            <w:r>
+              <w:rPr>
+                <w:rFonts w:asciiTheme="majorHAnsi" w:hAnsiTheme="majorHAnsi" w:cstheme="majorHAnsi"/>
+                <w:sz w:val="16"/>
+                <w:szCs w:val="16"/>
+              </w:rPr>
+              <w:t xml:space="preserve">11 – Refer to paragraph 3.8.</w:t>
             </w:r>
           </w:p>
           <w:p>
@@ -9717,7 +9915,7 @@
                 <w:szCs w:val="16"/>
                 <w:vertAlign w:val="superscript"/>
               </w:rPr>
-              <w:t xml:space="preserve">13</w:t>
+              <w:t xml:space="preserve">12</w:t>
             </w:r>
             <w:r>
               <w:rPr>
@@ -9725,611 +9923,7 @@
                 <w:sz w:val="16"/>
                 <w:szCs w:val="16"/>
               </w:rPr>
-              <w:t xml:space="preserve"> – Refer to paragraphs 3.4.3 to 3.4.8.</w:t>
-            </w:r>
-          </w:p>
-        </w:tc>
-        <w:tc>
-          <w:tcPr>
-            <w:tcW w:w="5731" w:type="dxa"/>
-          </w:tcPr>
-          <w:p>
-            <w:pPr>
-              <w:pStyle w:val="BodyText"/>
-              <w:rPr>
-                <w:rFonts w:asciiTheme="majorHAnsi" w:hAnsiTheme="majorHAnsi" w:cstheme="majorHAnsi"/>
-                <w:sz w:val="18"/>
-                <w:szCs w:val="18"/>
-              </w:rPr>
-            </w:pPr>
-            <w:r>
-              <w:rPr>
-                <w:rFonts w:asciiTheme="majorHAnsi" w:hAnsiTheme="majorHAnsi" w:cstheme="majorHAnsi"/>
-                <w:highlight w:val="yellow"/>
-                <w:sz w:val="18"/>
-                <w:szCs w:val="18"/>
-              </w:rPr>
-              <w:t xml:space="preserve">[5.5.2] </w:t>
-            </w:r>
-            <w:r>
-              <w:rPr>
-                <w:rFonts w:asciiTheme="majorHAnsi" w:hAnsiTheme="majorHAnsi" w:cstheme="majorHAnsi"/>
-                <w:sz w:val="18"/>
-                <w:szCs w:val="18"/>
-              </w:rPr>
-              <w:t xml:space="preserve">An institution should ensure that every outsourcing agreement addresses the risks identified at the risk evaluation and due diligence stages. Each outsourcing agreement should allow for timely renegotiation and renewal to enable the institution to retain an appropriate level of control over the outsourcing arrangement and the right to intervene with appropriate measures to meet its legal and regulatory obligations. It should at the very least, have provisions to address the following aspects of outsourcing:</w:t>
-            </w:r>
-          </w:p>
-          <w:p>
-            <w:pPr>
-              <w:pStyle w:val="BodyText"/>
-              <w:rPr>
-                <w:rFonts w:asciiTheme="majorHAnsi" w:hAnsiTheme="majorHAnsi" w:cstheme="majorHAnsi"/>
-                <w:sz w:val="18"/>
-                <w:szCs w:val="18"/>
-              </w:rPr>
-            </w:pPr>
-            <w:r>
-              <w:rPr>
-                <w:rFonts w:asciiTheme="majorHAnsi" w:hAnsiTheme="majorHAnsi" w:cstheme="majorHAnsi"/>
-                <w:sz w:val="18"/>
-                <w:szCs w:val="18"/>
-              </w:rPr>
-              <w:t xml:space="preserve">(a) scope of the outsourcing arrangement;</w:t>
-            </w:r>
-          </w:p>
-          <w:p>
-            <w:pPr>
-              <w:pStyle w:val="BodyText"/>
-              <w:rPr>
-                <w:rFonts w:asciiTheme="majorHAnsi" w:hAnsiTheme="majorHAnsi" w:cstheme="majorHAnsi"/>
-                <w:sz w:val="18"/>
-                <w:szCs w:val="18"/>
-              </w:rPr>
-            </w:pPr>
-            <w:r>
-              <w:rPr>
-                <w:rFonts w:asciiTheme="majorHAnsi" w:hAnsiTheme="majorHAnsi" w:cstheme="majorHAnsi"/>
-                <w:sz w:val="18"/>
-                <w:szCs w:val="18"/>
-              </w:rPr>
-              <w:t xml:space="preserve">(b) performance, operational, internal control and risk management standards;</w:t>
-            </w:r>
-          </w:p>
-          <w:p>
-            <w:pPr>
-              <w:pStyle w:val="BodyText"/>
-              <w:rPr>
-                <w:rFonts w:asciiTheme="majorHAnsi" w:hAnsiTheme="majorHAnsi" w:cstheme="majorHAnsi"/>
-                <w:sz w:val="18"/>
-                <w:szCs w:val="18"/>
-              </w:rPr>
-            </w:pPr>
-            <w:r>
-              <w:rPr>
-                <w:rFonts w:asciiTheme="majorHAnsi" w:hAnsiTheme="majorHAnsi" w:cstheme="majorHAnsi"/>
-                <w:sz w:val="18"/>
-                <w:szCs w:val="18"/>
-              </w:rPr>
-              <w:t xml:space="preserve">(c) confidentiality and security</w:t>
-            </w:r>
-            <w:r>
-              <w:rPr>
-                <w:rFonts w:asciiTheme="majorHAnsi" w:hAnsiTheme="majorHAnsi" w:cstheme="majorHAnsi"/>
-                <w:sz w:val="18"/>
-                <w:szCs w:val="18"/>
-                <w:vertAlign w:val="superscript"/>
-              </w:rPr>
-              <w:t xml:space="preserve">9</w:t>
-            </w:r>
-            <w:r>
-              <w:rPr>
-                <w:rFonts w:asciiTheme="majorHAnsi" w:hAnsiTheme="majorHAnsi" w:cstheme="majorHAnsi"/>
-                <w:sz w:val="18"/>
-                <w:szCs w:val="18"/>
-              </w:rPr>
-              <w:t xml:space="preserve">;</w:t>
-            </w:r>
-          </w:p>
-          <w:p>
-            <w:pPr>
-              <w:pStyle w:val="BodyText"/>
-              <w:rPr>
-                <w:rFonts w:asciiTheme="majorHAnsi" w:hAnsiTheme="majorHAnsi" w:cstheme="majorHAnsi"/>
-                <w:sz w:val="18"/>
-                <w:szCs w:val="18"/>
-              </w:rPr>
-            </w:pPr>
-            <w:r>
-              <w:rPr>
-                <w:rFonts w:asciiTheme="majorHAnsi" w:hAnsiTheme="majorHAnsi" w:cstheme="majorHAnsi"/>
-                <w:sz w:val="18"/>
-                <w:szCs w:val="18"/>
-              </w:rPr>
-              <w:t xml:space="preserve">(d) business continuity management</w:t>
-            </w:r>
-            <w:r>
-              <w:rPr>
-                <w:rFonts w:asciiTheme="majorHAnsi" w:hAnsiTheme="majorHAnsi" w:cstheme="majorHAnsi"/>
-                <w:sz w:val="18"/>
-                <w:szCs w:val="18"/>
-                <w:vertAlign w:val="superscript"/>
-              </w:rPr>
-              <w:t xml:space="preserve">10</w:t>
-            </w:r>
-            <w:r>
-              <w:rPr>
-                <w:rFonts w:asciiTheme="majorHAnsi" w:hAnsiTheme="majorHAnsi" w:cstheme="majorHAnsi"/>
-                <w:sz w:val="18"/>
-                <w:szCs w:val="18"/>
-              </w:rPr>
-              <w:t xml:space="preserve">;</w:t>
-            </w:r>
-          </w:p>
-          <w:p>
-            <w:pPr>
-              <w:pStyle w:val="BodyText"/>
-              <w:rPr>
-                <w:rFonts w:asciiTheme="majorHAnsi" w:hAnsiTheme="majorHAnsi" w:cstheme="majorHAnsi"/>
-                <w:sz w:val="18"/>
-                <w:szCs w:val="18"/>
-              </w:rPr>
-            </w:pPr>
-            <w:r>
-              <w:rPr>
-                <w:rFonts w:asciiTheme="majorHAnsi" w:hAnsiTheme="majorHAnsi" w:cstheme="majorHAnsi"/>
-                <w:sz w:val="18"/>
-                <w:szCs w:val="18"/>
-              </w:rPr>
-              <w:t xml:space="preserve">(e) monitoring and control</w:t>
-            </w:r>
-            <w:r>
-              <w:rPr>
-                <w:rFonts w:asciiTheme="majorHAnsi" w:hAnsiTheme="majorHAnsi" w:cstheme="majorHAnsi"/>
-                <w:sz w:val="18"/>
-                <w:szCs w:val="18"/>
-                <w:vertAlign w:val="superscript"/>
-              </w:rPr>
-              <w:t xml:space="preserve">11</w:t>
-            </w:r>
-            <w:r>
-              <w:rPr>
-                <w:rFonts w:asciiTheme="majorHAnsi" w:hAnsiTheme="majorHAnsi" w:cstheme="majorHAnsi"/>
-                <w:sz w:val="18"/>
-                <w:szCs w:val="18"/>
-              </w:rPr>
-              <w:t xml:space="preserve">;</w:t>
-            </w:r>
-          </w:p>
-          <w:p>
-            <w:pPr>
-              <w:pStyle w:val="BodyText"/>
-              <w:rPr>
-                <w:rFonts w:asciiTheme="majorHAnsi" w:hAnsiTheme="majorHAnsi" w:cstheme="majorHAnsi"/>
-                <w:sz w:val="18"/>
-                <w:szCs w:val="18"/>
-              </w:rPr>
-            </w:pPr>
-            <w:r>
-              <w:rPr>
-                <w:rFonts w:asciiTheme="majorHAnsi" w:hAnsiTheme="majorHAnsi" w:cstheme="majorHAnsi"/>
-                <w:sz w:val="18"/>
-                <w:szCs w:val="18"/>
-              </w:rPr>
-              <w:t xml:space="preserve">(f) audit and inspection</w:t>
-            </w:r>
-            <w:r>
-              <w:rPr>
-                <w:rFonts w:asciiTheme="majorHAnsi" w:hAnsiTheme="majorHAnsi" w:cstheme="majorHAnsi"/>
-                <w:sz w:val="18"/>
-                <w:szCs w:val="18"/>
-                <w:vertAlign w:val="superscript"/>
-              </w:rPr>
-              <w:t xml:space="preserve">12</w:t>
-            </w:r>
-            <w:r>
-              <w:rPr>
-                <w:rFonts w:asciiTheme="majorHAnsi" w:hAnsiTheme="majorHAnsi" w:cstheme="majorHAnsi"/>
-                <w:sz w:val="18"/>
-                <w:szCs w:val="18"/>
-              </w:rPr>
-              <w:t xml:space="preserve">;</w:t>
-            </w:r>
-          </w:p>
-          <w:p>
-            <w:pPr>
-              <w:pStyle w:val="BodyText"/>
-              <w:rPr>
-                <w:rFonts w:asciiTheme="majorHAnsi" w:hAnsiTheme="majorHAnsi" w:cstheme="majorHAnsi"/>
-                <w:sz w:val="18"/>
-                <w:szCs w:val="18"/>
-              </w:rPr>
-            </w:pPr>
-            <w:r>
-              <w:rPr>
-                <w:rFonts w:asciiTheme="majorHAnsi" w:hAnsiTheme="majorHAnsi" w:cstheme="majorHAnsi"/>
-                <w:sz w:val="18"/>
-                <w:szCs w:val="18"/>
-              </w:rPr>
-              <w:t xml:space="preserve">(g) notification of adverse developments – An institution should specify in its outsourcing agreement the type of events and the circumstances under which the service provider should report to the institution in order for an institution to take prompt risk mitigation measures and notify MAS of such developments under paragraph 4.2.1;</w:t>
-            </w:r>
-          </w:p>
-          <w:p>
-            <w:pPr>
-              <w:pStyle w:val="BodyText"/>
-              <w:rPr>
-                <w:rFonts w:asciiTheme="majorHAnsi" w:hAnsiTheme="majorHAnsi" w:cstheme="majorHAnsi"/>
-                <w:sz w:val="18"/>
-                <w:szCs w:val="18"/>
-              </w:rPr>
-            </w:pPr>
-            <w:r>
-              <w:rPr>
-                <w:rFonts w:asciiTheme="majorHAnsi" w:hAnsiTheme="majorHAnsi" w:cstheme="majorHAnsi"/>
-                <w:sz w:val="18"/>
-                <w:szCs w:val="18"/>
-              </w:rPr>
-              <w:t xml:space="preserve">(h) dispute resolution – An institution should specify in its outsourcing agreement the resolution process, events of default, and the indemnities, remedies and recourse of the respective parties in the agreement. The institution should ensure that its contractual rights can be exercised in the event of a breach of the outsourcing agreement by the service provider;</w:t>
-            </w:r>
-          </w:p>
-          <w:p>
-            <w:pPr>
-              <w:pStyle w:val="BodyText"/>
-              <w:rPr>
-                <w:rFonts w:asciiTheme="majorHAnsi" w:hAnsiTheme="majorHAnsi" w:cstheme="majorHAnsi"/>
-                <w:sz w:val="18"/>
-                <w:szCs w:val="18"/>
-              </w:rPr>
-            </w:pPr>
-            <w:r>
-              <w:rPr>
-                <w:rFonts w:asciiTheme="majorHAnsi" w:hAnsiTheme="majorHAnsi" w:cstheme="majorHAnsi"/>
-                <w:sz w:val="18"/>
-                <w:szCs w:val="18"/>
-              </w:rPr>
-              <w:t xml:space="preserve">(i) default termination and early exit – An institution should, have the right to terminate the outsourcing agreement in the event of default, or under circumstances where: </w:t>
-            </w:r>
-            <w:r>
-              <w:rPr>
-                <w:rFonts w:asciiTheme="majorHAnsi" w:hAnsiTheme="majorHAnsi" w:cstheme="majorHAnsi"/>
-                <w:highlight w:val="yellow"/>
-                <w:sz w:val="18"/>
-                <w:szCs w:val="18"/>
-              </w:rPr>
-              <w:t xml:space="preserve">(i) the service provider undergoes a change in ownership; (ii) the service provider becomes insolvent or goes into liquidation; (iii) the service provider goes into receivership or judicial management whether in Singapore or elsewhere; (iv) there has been a breach of security or confidentiality; or (v) there is a demonstrable deterioration in the ability of the service provider to perform the contracted service.</w:t>
-            </w:r>
-            <w:r>
-              <w:rPr>
-                <w:rFonts w:asciiTheme="majorHAnsi" w:hAnsiTheme="majorHAnsi" w:cstheme="majorHAnsi"/>
-                <w:sz w:val="18"/>
-                <w:szCs w:val="18"/>
-              </w:rPr>
-              <w:t xml:space="preserve"> The minimum period to execute a termination provision should be specified in the outsourcing agreement. Other provisions should also be put in place to ensure a smooth transition when the agreement is terminated or being amended. Such provisions may facilitate transferability of the outsourced services to a bridge-institution</w:t>
-            </w:r>
-            <w:r>
-              <w:rPr>
-                <w:rFonts w:asciiTheme="majorHAnsi" w:hAnsiTheme="majorHAnsi" w:cstheme="majorHAnsi"/>
-                <w:sz w:val="18"/>
-                <w:szCs w:val="18"/>
-                <w:vertAlign w:val="superscript"/>
-              </w:rPr>
-              <w:t xml:space="preserve">13</w:t>
-            </w:r>
-            <w:r>
-              <w:rPr>
-                <w:rFonts w:asciiTheme="majorHAnsi" w:hAnsiTheme="majorHAnsi" w:cstheme="majorHAnsi"/>
-                <w:sz w:val="18"/>
-                <w:szCs w:val="18"/>
-              </w:rPr>
-              <w:t xml:space="preserve"> or a third party. Where the outsourcing agreement involves an intra-group entity, the agreement should be legally enforceable against the intra-group entity providing the outsourced service;</w:t>
-            </w:r>
-          </w:p>
-          <w:p>
-            <w:pPr>
-              <w:pStyle w:val="BodyText"/>
-              <w:rPr>
-                <w:rFonts w:asciiTheme="majorHAnsi" w:hAnsiTheme="majorHAnsi" w:cstheme="majorHAnsi"/>
-                <w:sz w:val="18"/>
-                <w:szCs w:val="18"/>
-              </w:rPr>
-            </w:pPr>
-            <w:r>
-              <w:rPr>
-                <w:rFonts w:asciiTheme="majorHAnsi" w:hAnsiTheme="majorHAnsi" w:cstheme="majorHAnsi"/>
-                <w:highlight w:val="yellow"/>
-                <w:sz w:val="18"/>
-                <w:szCs w:val="18"/>
-              </w:rPr>
-              <w:t xml:space="preserve">(j) sub-contracting – An institution should retain the ability to monitor and control its outsourcing arrangements when a service provider uses a sub-contractor. An outsourcing agreement should contain clauses setting out the rules and limitations on sub-contracting. An institution should include clauses making the service provider contractually liable for the performance and risk management practices of its sub-contractor and for the sub-contractor’s compliance with the provisions in its agreement with the service provider, including the prudent practices set out in these Guidelines. The institution should ensure that the sub-contracting of any part of material outsourcing arrangements is subject to the institution’s prior approval;</w:t>
-            </w:r>
-          </w:p>
-          <w:p>
-            <w:pPr>
-              <w:pStyle w:val="BodyText"/>
-              <w:rPr>
-                <w:rFonts w:asciiTheme="majorHAnsi" w:hAnsiTheme="majorHAnsi" w:cstheme="majorHAnsi"/>
-                <w:sz w:val="18"/>
-                <w:szCs w:val="18"/>
-              </w:rPr>
-            </w:pPr>
-            <w:r>
-              <w:rPr>
-                <w:rFonts w:asciiTheme="majorHAnsi" w:hAnsiTheme="majorHAnsi" w:cstheme="majorHAnsi"/>
-                <w:sz w:val="18"/>
-                <w:szCs w:val="18"/>
-              </w:rPr>
-              <w:t xml:space="preserve">(k) applicable laws – Agreements should include choice-of-law provisions, agreement covenants and jurisdictional covenants that provide for adjudication of disputes between the parties under the laws of a specific jurisdiction.</w:t>
-            </w:r>
-          </w:p>
-        </w:tc>
-        <w:tc>
-          <w:tcPr>
-            <w:tcW w:w="2189" w:type="dxa"/>
-          </w:tcPr>
-          <w:p>
-            <w:pPr>
-              <w:pStyle w:val="BodyText"/>
-              <w:rPr>
-                <w:rFonts w:asciiTheme="majorHAnsi" w:hAnsiTheme="majorHAnsi" w:cstheme="majorHAnsi"/>
-                <w:sz w:val="18"/>
-                <w:szCs w:val="18"/>
-              </w:rPr>
-            </w:pPr>
-            <w:r>
-              <w:rPr>
-                <w:rFonts w:asciiTheme="majorHAnsi" w:hAnsiTheme="majorHAnsi" w:cstheme="majorHAnsi"/>
-                <w:sz w:val="18"/>
-                <w:szCs w:val="18"/>
-              </w:rPr>
-              <w:t xml:space="preserve">3.4.2 of the Bank Guidelines corresponds to 5.5.2 of the FI Guidelines, with the following differences:</w:t>
-            </w:r>
-          </w:p>
-          <w:p>
-            <w:pPr>
-              <w:pStyle w:val="BodyText"/>
-              <w:rPr>
-                <w:rFonts w:asciiTheme="majorHAnsi" w:hAnsiTheme="majorHAnsi" w:cstheme="majorHAnsi"/>
-                <w:sz w:val="18"/>
-                <w:szCs w:val="18"/>
-              </w:rPr>
-            </w:pPr>
-            <w:r>
-              <w:rPr>
-                <w:rFonts w:asciiTheme="majorHAnsi" w:hAnsiTheme="majorHAnsi" w:cstheme="majorHAnsi"/>
-                <w:sz w:val="18"/>
-                <w:szCs w:val="18"/>
-              </w:rPr>
-              <w:t xml:space="preserve">1. The FI Guidelines add item (j) on sub-contracting; the Bank Guidelines deal with sub-contracting separately in section 3.5.</w:t>
-            </w:r>
-          </w:p>
-          <w:p>
-            <w:pPr>
-              <w:pStyle w:val="BodyText"/>
-              <w:rPr>
-                <w:rFonts w:asciiTheme="majorHAnsi" w:hAnsiTheme="majorHAnsi" w:cstheme="majorHAnsi"/>
-                <w:sz w:val="18"/>
-                <w:szCs w:val="18"/>
-              </w:rPr>
-            </w:pPr>
-            <w:r>
-              <w:rPr>
-                <w:rFonts w:asciiTheme="majorHAnsi" w:hAnsiTheme="majorHAnsi" w:cstheme="majorHAnsi"/>
-                <w:sz w:val="18"/>
-                <w:szCs w:val="18"/>
-              </w:rPr>
-              <w:t xml:space="preserve">2. Footnotes 9 and 12 of the Bank Guidelines require MOORS agreements to include the requirements of paragraphs 7.1(a)–(c) and 7.1(d) of the Notices; there is no FI equivalent.</w:t>
-            </w:r>
-          </w:p>
-          <w:p>
-            <w:pPr>
-              <w:pStyle w:val="BodyText"/>
-              <w:rPr>
-                <w:rFonts w:asciiTheme="majorHAnsi" w:hAnsiTheme="majorHAnsi" w:cstheme="majorHAnsi"/>
-                <w:sz w:val="18"/>
-                <w:szCs w:val="18"/>
-              </w:rPr>
-            </w:pPr>
-            <w:r>
-              <w:rPr>
-                <w:rFonts w:asciiTheme="majorHAnsi" w:hAnsiTheme="majorHAnsi" w:cstheme="majorHAnsi"/>
-                <w:sz w:val="18"/>
-                <w:szCs w:val="18"/>
-              </w:rPr>
-              <w:t xml:space="preserve">3. The FI Guidelines set out the termination and sub-contracting content in full within 5.5.2 itself (items (i) and (j)); the Bank Guidelines elaborate in 3.4.3–3.4.8 and 3.5.</w:t>
-            </w:r>
-          </w:p>
-        </w:tc>
-      </w:tr>
-      <w:tr>
-        <w:tc>
-          <w:tcPr>
-            <w:tcW w:w="625" w:type="dxa"/>
-          </w:tcPr>
-          <w:p>
-            <w:pPr>
-              <w:pStyle w:val="BodyText"/>
-              <w:rPr>
-                <w:rFonts w:asciiTheme="majorHAnsi" w:hAnsiTheme="majorHAnsi" w:cstheme="majorHAnsi"/>
-                <w:sz w:val="18"/>
-                <w:szCs w:val="18"/>
-              </w:rPr>
-            </w:pPr>
-            <w:r>
-              <w:rPr>
-                <w:rFonts w:asciiTheme="majorHAnsi" w:hAnsiTheme="majorHAnsi" w:cstheme="majorHAnsi"/>
-                <w:sz w:val="18"/>
-                <w:szCs w:val="18"/>
-              </w:rPr>
-              <w:t>3.4.3</w:t>
-            </w:r>
-          </w:p>
-        </w:tc>
-        <w:tc>
-          <w:tcPr>
-            <w:tcW w:w="5670" w:type="dxa"/>
-          </w:tcPr>
-          <w:p>
-            <w:pPr>
-              <w:pStyle w:val="BodyText"/>
-              <w:rPr>
-                <w:rFonts w:asciiTheme="majorHAnsi" w:hAnsiTheme="majorHAnsi" w:cstheme="majorHAnsi"/>
-                <w:sz w:val="18"/>
-                <w:szCs w:val="18"/>
-              </w:rPr>
-            </w:pPr>
-            <w:r>
-              <w:rPr>
-                <w:rFonts w:asciiTheme="majorHAnsi" w:hAnsiTheme="majorHAnsi" w:cstheme="majorHAnsi"/>
-                <w:sz w:val="18"/>
-                <w:szCs w:val="18"/>
-              </w:rPr>
-              <w:t xml:space="preserve">A Bank should have the right to terminate the outsourcing agreement in the event of default, or under any of the following circumstances: </w:t>
-            </w:r>
-            <w:r>
-              <w:rPr>
-                <w:rFonts w:asciiTheme="majorHAnsi" w:hAnsiTheme="majorHAnsi" w:cstheme="majorHAnsi"/>
-                <w:highlight w:val="yellow"/>
-                <w:sz w:val="18"/>
-                <w:szCs w:val="18"/>
-              </w:rPr>
-              <w:t xml:space="preserve">(a) by giving reasonable notice to the service provider; (b) if the service provider or a sub-contractor, as the case may be, failed to safeguard the confidentiality or integrity of customer information of the Bank; or (c) if there has been a demonstrable deterioration in the ability of the service provider or a sub-contractor to safeguard the confidentiality of customer information.</w:t>
-            </w:r>
-          </w:p>
-        </w:tc>
-        <w:tc>
-          <w:tcPr>
-            <w:tcW w:w="5731" w:type="dxa"/>
-          </w:tcPr>
-          <w:p>
-            <w:pPr>
-              <w:pStyle w:val="BodyText"/>
-              <w:rPr>
-                <w:rFonts w:asciiTheme="majorHAnsi" w:hAnsiTheme="majorHAnsi" w:cstheme="majorHAnsi"/>
-                <w:sz w:val="18"/>
-                <w:szCs w:val="18"/>
-              </w:rPr>
-            </w:pPr>
-            <w:r>
-              <w:rPr>
-                <w:rFonts w:asciiTheme="majorHAnsi" w:hAnsiTheme="majorHAnsi" w:cstheme="majorHAnsi"/>
-                <w:highlight w:val="yellow"/>
-                <w:sz w:val="18"/>
-                <w:szCs w:val="18"/>
-              </w:rPr>
-              <w:t xml:space="preserve">[5.5.2(i)]</w:t>
-            </w:r>
-            <w:r>
-              <w:rPr>
-                <w:rFonts w:asciiTheme="majorHAnsi" w:hAnsiTheme="majorHAnsi" w:cstheme="majorHAnsi"/>
-                <w:sz w:val="18"/>
-                <w:szCs w:val="18"/>
-              </w:rPr>
-              <w:t xml:space="preserve"> An institution should, have the right to terminate the outsourcing agreement in the event of default, or under circumstances where: </w:t>
-            </w:r>
-            <w:r>
-              <w:rPr>
-                <w:rFonts w:asciiTheme="majorHAnsi" w:hAnsiTheme="majorHAnsi" w:cstheme="majorHAnsi"/>
-                <w:highlight w:val="yellow"/>
-                <w:sz w:val="18"/>
-                <w:szCs w:val="18"/>
-              </w:rPr>
-              <w:t xml:space="preserve">(i) the service provider undergoes a change in ownership; (ii) the service provider becomes insolvent or goes into liquidation; (iii) the service provider goes into receivership or judicial management whether in Singapore or elsewhere; (iv) there has been a breach of security or confidentiality; or (v) there is a demonstrable deterioration in the ability of the service provider to perform the contracted service.</w:t>
-            </w:r>
-            <w:r>
-              <w:rPr>
-                <w:rFonts w:asciiTheme="majorHAnsi" w:hAnsiTheme="majorHAnsi" w:cstheme="majorHAnsi"/>
-                <w:sz w:val="18"/>
-                <w:szCs w:val="18"/>
-              </w:rPr>
-              <w:t xml:space="preserve"> (The termination mechanics that follow in 5.5.2(i) are set out at row 3.4.4.)</w:t>
-            </w:r>
-          </w:p>
-        </w:tc>
-        <w:tc>
-          <w:tcPr>
-            <w:tcW w:w="2189" w:type="dxa"/>
-          </w:tcPr>
-          <w:p>
-            <w:pPr>
-              <w:pStyle w:val="BodyText"/>
-              <w:rPr>
-                <w:rFonts w:asciiTheme="majorHAnsi" w:hAnsiTheme="majorHAnsi" w:cstheme="majorHAnsi"/>
-                <w:sz w:val="18"/>
-                <w:szCs w:val="18"/>
-              </w:rPr>
-            </w:pPr>
-            <w:r>
-              <w:rPr>
-                <w:rFonts w:asciiTheme="majorHAnsi" w:hAnsiTheme="majorHAnsi" w:cstheme="majorHAnsi"/>
-                <w:sz w:val="18"/>
-                <w:szCs w:val="18"/>
-              </w:rPr>
-              <w:t xml:space="preserve">Found in 5.5.2(i) of the FI Guidelines (quoted at 3.4.2 above). The termination triggers differ: the FI Guidelines allow termination on change in ownership, insolvency or liquidation, receivership or judicial management, breach of security or confidentiality, or deterioration in ability to perform the contracted service; the Bank Guidelines focus instead on failure to safeguard the confidentiality or integrity of customer information (including by sub-contractors) and add termination by reasonable notice. The Bank Guidelines do not set out the corporate-event triggers; the binding contractual requirements for Banks are in paragraph 7.1 of the Notices.</w:t>
-            </w:r>
-          </w:p>
-        </w:tc>
-      </w:tr>
-      <w:tr>
-        <w:tc>
-          <w:tcPr>
-            <w:tcW w:w="625" w:type="dxa"/>
-          </w:tcPr>
-          <w:p>
-            <w:pPr>
-              <w:pStyle w:val="BodyText"/>
-              <w:rPr>
-                <w:rFonts w:asciiTheme="majorHAnsi" w:hAnsiTheme="majorHAnsi" w:cstheme="majorHAnsi"/>
-                <w:sz w:val="18"/>
-                <w:szCs w:val="18"/>
-              </w:rPr>
-            </w:pPr>
-            <w:r>
-              <w:rPr>
-                <w:rFonts w:asciiTheme="majorHAnsi" w:hAnsiTheme="majorHAnsi" w:cstheme="majorHAnsi"/>
-                <w:sz w:val="18"/>
-                <w:szCs w:val="18"/>
-              </w:rPr>
-              <w:t>3.4.4</w:t>
-            </w:r>
-          </w:p>
-        </w:tc>
-        <w:tc>
-          <w:tcPr>
-            <w:tcW w:w="5670" w:type="dxa"/>
-          </w:tcPr>
-          <w:p>
-            <w:pPr>
-              <w:pStyle w:val="BodyText"/>
-              <w:rPr>
-                <w:rFonts w:asciiTheme="majorHAnsi" w:hAnsiTheme="majorHAnsi" w:cstheme="majorHAnsi"/>
-                <w:sz w:val="18"/>
-                <w:szCs w:val="18"/>
-              </w:rPr>
-            </w:pPr>
-            <w:r>
-              <w:rPr>
-                <w:rFonts w:asciiTheme="majorHAnsi" w:hAnsiTheme="majorHAnsi" w:cstheme="majorHAnsi"/>
-                <w:sz w:val="18"/>
-                <w:szCs w:val="18"/>
-              </w:rPr>
-              <w:t xml:space="preserve">The minimum period to execute a termination provision should be specified in the outsourcing agreement. Other provisions should also be put in place to ensure a smooth transition when the agreement is terminated or being amended. Such provisions may facilitate transferability of the outsourced services to a bridge-institution</w:t>
-            </w:r>
-            <w:r>
-              <w:rPr>
-                <w:rFonts w:asciiTheme="majorHAnsi" w:hAnsiTheme="majorHAnsi" w:cstheme="majorHAnsi"/>
-                <w:sz w:val="18"/>
-                <w:szCs w:val="18"/>
-                <w:vertAlign w:val="superscript"/>
-              </w:rPr>
-              <w:t xml:space="preserve">14</w:t>
-            </w:r>
-            <w:r>
-              <w:rPr>
-                <w:rFonts w:asciiTheme="majorHAnsi" w:hAnsiTheme="majorHAnsi" w:cstheme="majorHAnsi"/>
-                <w:sz w:val="18"/>
-                <w:szCs w:val="18"/>
-              </w:rPr>
-              <w:t xml:space="preserve"> or a third party. Where the outsourcing agreement involves an intra-group entity, the agreement should be legally enforceable against the intra-group entity providing the outsourced service.</w:t>
+              <w:t xml:space="preserve"> – The provisions of the outsourcing agreement for a MOORS that relate to audit and inspection should include the requirements set out in paragraph 7.1(d) of the Notices. Refer also to paragraph 3.9.</w:t>
             </w:r>
           </w:p>
           <w:p>
@@ -10348,7 +9942,7 @@
                 <w:szCs w:val="16"/>
                 <w:vertAlign w:val="superscript"/>
               </w:rPr>
-              <w:t xml:space="preserve">14</w:t>
+              <w:t xml:space="preserve">13</w:t>
             </w:r>
             <w:r>
               <w:rPr>
@@ -10356,7 +9950,7 @@
                 <w:sz w:val="16"/>
                 <w:szCs w:val="16"/>
               </w:rPr>
-              <w:t xml:space="preserve"> – “bridge-institution” means an institution, whether incorporated in Singapore or outside Singapore, to temporarily take over and maintain certain assets, liabilities and operations of a distressed financial institution, as part of a resolution Authority’s exercise of a resolution.</w:t>
+              <w:t xml:space="preserve"> – Refer to paragraphs 3.4.3 to 3.4.8.</w:t>
             </w:r>
           </w:p>
         </w:tc>
@@ -10380,6 +9974,473 @@
                 <w:sz w:val="18"/>
                 <w:szCs w:val="18"/>
               </w:rPr>
+              <w:t xml:space="preserve">[5.5.2] </w:t>
+            </w:r>
+            <w:r>
+              <w:rPr>
+                <w:rFonts w:asciiTheme="majorHAnsi" w:hAnsiTheme="majorHAnsi" w:cstheme="majorHAnsi"/>
+                <w:sz w:val="18"/>
+                <w:szCs w:val="18"/>
+              </w:rPr>
+              <w:t xml:space="preserve">An institution should ensure that every outsourcing agreement addresses the risks identified at the risk evaluation and due diligence stages. Each outsourcing agreement should allow for timely renegotiation and renewal to enable the institution to retain an appropriate level of control over the outsourcing arrangement and the right to intervene with appropriate measures to meet its legal and regulatory obligations. It should at the very least, have provisions to address the following aspects of outsourcing:</w:t>
+            </w:r>
+          </w:p>
+          <w:p>
+            <w:pPr>
+              <w:pStyle w:val="BodyText"/>
+              <w:rPr>
+                <w:rFonts w:asciiTheme="majorHAnsi" w:hAnsiTheme="majorHAnsi" w:cstheme="majorHAnsi"/>
+                <w:sz w:val="18"/>
+                <w:szCs w:val="18"/>
+              </w:rPr>
+            </w:pPr>
+            <w:r>
+              <w:rPr>
+                <w:rFonts w:asciiTheme="majorHAnsi" w:hAnsiTheme="majorHAnsi" w:cstheme="majorHAnsi"/>
+                <w:sz w:val="18"/>
+                <w:szCs w:val="18"/>
+              </w:rPr>
+              <w:t xml:space="preserve">(a) scope of the outsourcing arrangement;</w:t>
+            </w:r>
+          </w:p>
+          <w:p>
+            <w:pPr>
+              <w:pStyle w:val="BodyText"/>
+              <w:rPr>
+                <w:rFonts w:asciiTheme="majorHAnsi" w:hAnsiTheme="majorHAnsi" w:cstheme="majorHAnsi"/>
+                <w:sz w:val="18"/>
+                <w:szCs w:val="18"/>
+              </w:rPr>
+            </w:pPr>
+            <w:r>
+              <w:rPr>
+                <w:rFonts w:asciiTheme="majorHAnsi" w:hAnsiTheme="majorHAnsi" w:cstheme="majorHAnsi"/>
+                <w:sz w:val="18"/>
+                <w:szCs w:val="18"/>
+              </w:rPr>
+              <w:t xml:space="preserve">(b) performance, operational, internal control and risk management standards;</w:t>
+            </w:r>
+          </w:p>
+          <w:p>
+            <w:pPr>
+              <w:pStyle w:val="BodyText"/>
+              <w:rPr>
+                <w:rFonts w:asciiTheme="majorHAnsi" w:hAnsiTheme="majorHAnsi" w:cstheme="majorHAnsi"/>
+                <w:sz w:val="18"/>
+                <w:szCs w:val="18"/>
+              </w:rPr>
+            </w:pPr>
+            <w:r>
+              <w:rPr>
+                <w:rFonts w:asciiTheme="majorHAnsi" w:hAnsiTheme="majorHAnsi" w:cstheme="majorHAnsi"/>
+                <w:sz w:val="18"/>
+                <w:szCs w:val="18"/>
+              </w:rPr>
+              <w:t xml:space="preserve">(c) confidentiality and security</w:t>
+            </w:r>
+            <w:r>
+              <w:rPr>
+                <w:rFonts w:asciiTheme="majorHAnsi" w:hAnsiTheme="majorHAnsi" w:cstheme="majorHAnsi"/>
+                <w:sz w:val="18"/>
+                <w:szCs w:val="18"/>
+                <w:vertAlign w:val="superscript"/>
+              </w:rPr>
+              <w:t xml:space="preserve">9</w:t>
+            </w:r>
+            <w:r>
+              <w:rPr>
+                <w:rFonts w:asciiTheme="majorHAnsi" w:hAnsiTheme="majorHAnsi" w:cstheme="majorHAnsi"/>
+                <w:sz w:val="18"/>
+                <w:szCs w:val="18"/>
+              </w:rPr>
+              <w:t xml:space="preserve">;</w:t>
+            </w:r>
+          </w:p>
+          <w:p>
+            <w:pPr>
+              <w:pStyle w:val="BodyText"/>
+              <w:rPr>
+                <w:rFonts w:asciiTheme="majorHAnsi" w:hAnsiTheme="majorHAnsi" w:cstheme="majorHAnsi"/>
+                <w:sz w:val="18"/>
+                <w:szCs w:val="18"/>
+              </w:rPr>
+            </w:pPr>
+            <w:r>
+              <w:rPr>
+                <w:rFonts w:asciiTheme="majorHAnsi" w:hAnsiTheme="majorHAnsi" w:cstheme="majorHAnsi"/>
+                <w:sz w:val="18"/>
+                <w:szCs w:val="18"/>
+              </w:rPr>
+              <w:t xml:space="preserve">(d) business continuity management</w:t>
+            </w:r>
+            <w:r>
+              <w:rPr>
+                <w:rFonts w:asciiTheme="majorHAnsi" w:hAnsiTheme="majorHAnsi" w:cstheme="majorHAnsi"/>
+                <w:sz w:val="18"/>
+                <w:szCs w:val="18"/>
+                <w:vertAlign w:val="superscript"/>
+              </w:rPr>
+              <w:t xml:space="preserve">10</w:t>
+            </w:r>
+            <w:r>
+              <w:rPr>
+                <w:rFonts w:asciiTheme="majorHAnsi" w:hAnsiTheme="majorHAnsi" w:cstheme="majorHAnsi"/>
+                <w:sz w:val="18"/>
+                <w:szCs w:val="18"/>
+              </w:rPr>
+              <w:t xml:space="preserve">;</w:t>
+            </w:r>
+          </w:p>
+          <w:p>
+            <w:pPr>
+              <w:pStyle w:val="BodyText"/>
+              <w:rPr>
+                <w:rFonts w:asciiTheme="majorHAnsi" w:hAnsiTheme="majorHAnsi" w:cstheme="majorHAnsi"/>
+                <w:sz w:val="18"/>
+                <w:szCs w:val="18"/>
+              </w:rPr>
+            </w:pPr>
+            <w:r>
+              <w:rPr>
+                <w:rFonts w:asciiTheme="majorHAnsi" w:hAnsiTheme="majorHAnsi" w:cstheme="majorHAnsi"/>
+                <w:sz w:val="18"/>
+                <w:szCs w:val="18"/>
+              </w:rPr>
+              <w:t xml:space="preserve">(e) monitoring and control</w:t>
+            </w:r>
+            <w:r>
+              <w:rPr>
+                <w:rFonts w:asciiTheme="majorHAnsi" w:hAnsiTheme="majorHAnsi" w:cstheme="majorHAnsi"/>
+                <w:sz w:val="18"/>
+                <w:szCs w:val="18"/>
+                <w:vertAlign w:val="superscript"/>
+              </w:rPr>
+              <w:t xml:space="preserve">11</w:t>
+            </w:r>
+            <w:r>
+              <w:rPr>
+                <w:rFonts w:asciiTheme="majorHAnsi" w:hAnsiTheme="majorHAnsi" w:cstheme="majorHAnsi"/>
+                <w:sz w:val="18"/>
+                <w:szCs w:val="18"/>
+              </w:rPr>
+              <w:t xml:space="preserve">;</w:t>
+            </w:r>
+          </w:p>
+          <w:p>
+            <w:pPr>
+              <w:pStyle w:val="BodyText"/>
+              <w:rPr>
+                <w:rFonts w:asciiTheme="majorHAnsi" w:hAnsiTheme="majorHAnsi" w:cstheme="majorHAnsi"/>
+                <w:sz w:val="18"/>
+                <w:szCs w:val="18"/>
+              </w:rPr>
+            </w:pPr>
+            <w:r>
+              <w:rPr>
+                <w:rFonts w:asciiTheme="majorHAnsi" w:hAnsiTheme="majorHAnsi" w:cstheme="majorHAnsi"/>
+                <w:sz w:val="18"/>
+                <w:szCs w:val="18"/>
+              </w:rPr>
+              <w:t xml:space="preserve">(f) audit and inspection</w:t>
+            </w:r>
+            <w:r>
+              <w:rPr>
+                <w:rFonts w:asciiTheme="majorHAnsi" w:hAnsiTheme="majorHAnsi" w:cstheme="majorHAnsi"/>
+                <w:sz w:val="18"/>
+                <w:szCs w:val="18"/>
+                <w:vertAlign w:val="superscript"/>
+              </w:rPr>
+              <w:t xml:space="preserve">12</w:t>
+            </w:r>
+            <w:r>
+              <w:rPr>
+                <w:rFonts w:asciiTheme="majorHAnsi" w:hAnsiTheme="majorHAnsi" w:cstheme="majorHAnsi"/>
+                <w:sz w:val="18"/>
+                <w:szCs w:val="18"/>
+              </w:rPr>
+              <w:t xml:space="preserve">;</w:t>
+            </w:r>
+          </w:p>
+          <w:p>
+            <w:pPr>
+              <w:pStyle w:val="BodyText"/>
+              <w:rPr>
+                <w:rFonts w:asciiTheme="majorHAnsi" w:hAnsiTheme="majorHAnsi" w:cstheme="majorHAnsi"/>
+                <w:sz w:val="18"/>
+                <w:szCs w:val="18"/>
+              </w:rPr>
+            </w:pPr>
+            <w:r>
+              <w:rPr>
+                <w:rFonts w:asciiTheme="majorHAnsi" w:hAnsiTheme="majorHAnsi" w:cstheme="majorHAnsi"/>
+                <w:sz w:val="18"/>
+                <w:szCs w:val="18"/>
+              </w:rPr>
+              <w:t xml:space="preserve">(g) notification of adverse developments – An institution should specify in its outsourcing agreement the type of events and the circumstances under which the service provider should report to the institution in order for an institution to take prompt risk mitigation measures and notify MAS of such developments under paragraph 4.2.1;</w:t>
+            </w:r>
+          </w:p>
+          <w:p>
+            <w:pPr>
+              <w:pStyle w:val="BodyText"/>
+              <w:rPr>
+                <w:rFonts w:asciiTheme="majorHAnsi" w:hAnsiTheme="majorHAnsi" w:cstheme="majorHAnsi"/>
+                <w:sz w:val="18"/>
+                <w:szCs w:val="18"/>
+              </w:rPr>
+            </w:pPr>
+            <w:r>
+              <w:rPr>
+                <w:rFonts w:asciiTheme="majorHAnsi" w:hAnsiTheme="majorHAnsi" w:cstheme="majorHAnsi"/>
+                <w:sz w:val="18"/>
+                <w:szCs w:val="18"/>
+              </w:rPr>
+              <w:t xml:space="preserve">(h) dispute resolution – An institution should specify in its outsourcing agreement the resolution process, events of default, and the indemnities, remedies and recourse of the respective parties in the agreement. The institution should ensure that its contractual rights can be exercised in the event of a breach of the outsourcing agreement by the service provider;</w:t>
+            </w:r>
+          </w:p>
+          <w:p>
+            <w:pPr>
+              <w:pStyle w:val="BodyText"/>
+              <w:rPr>
+                <w:rFonts w:asciiTheme="majorHAnsi" w:hAnsiTheme="majorHAnsi" w:cstheme="majorHAnsi"/>
+                <w:sz w:val="18"/>
+                <w:szCs w:val="18"/>
+              </w:rPr>
+            </w:pPr>
+            <w:r>
+              <w:rPr>
+                <w:rFonts w:asciiTheme="majorHAnsi" w:hAnsiTheme="majorHAnsi" w:cstheme="majorHAnsi"/>
+                <w:sz w:val="18"/>
+                <w:szCs w:val="18"/>
+              </w:rPr>
+              <w:t xml:space="preserve">(i) default termination and early exit – An institution should, have the right to terminate the outsourcing agreement in the event of default, or under circumstances where: </w:t>
+            </w:r>
+            <w:r>
+              <w:rPr>
+                <w:rFonts w:asciiTheme="majorHAnsi" w:hAnsiTheme="majorHAnsi" w:cstheme="majorHAnsi"/>
+                <w:highlight w:val="yellow"/>
+                <w:sz w:val="18"/>
+                <w:szCs w:val="18"/>
+              </w:rPr>
+              <w:t xml:space="preserve">(i) the service provider undergoes a change in ownership; (ii) the service provider becomes insolvent or goes into liquidation; (iii) the service provider goes into receivership or judicial management whether in Singapore or elsewhere; (iv) there has been a breach of security or confidentiality; or (v) there is a demonstrable deterioration in the ability of the service provider to perform the contracted service.</w:t>
+            </w:r>
+            <w:r>
+              <w:rPr>
+                <w:rFonts w:asciiTheme="majorHAnsi" w:hAnsiTheme="majorHAnsi" w:cstheme="majorHAnsi"/>
+                <w:sz w:val="18"/>
+                <w:szCs w:val="18"/>
+              </w:rPr>
+              <w:t xml:space="preserve"> The minimum period to execute a termination provision should be specified in the outsourcing agreement. Other provisions should also be put in place to ensure a smooth transition when the agreement is terminated or being amended. Such provisions may facilitate transferability of the outsourced services to a bridge-institution</w:t>
+            </w:r>
+            <w:r>
+              <w:rPr>
+                <w:rFonts w:asciiTheme="majorHAnsi" w:hAnsiTheme="majorHAnsi" w:cstheme="majorHAnsi"/>
+                <w:sz w:val="18"/>
+                <w:szCs w:val="18"/>
+                <w:vertAlign w:val="superscript"/>
+              </w:rPr>
+              <w:t xml:space="preserve">13</w:t>
+            </w:r>
+            <w:r>
+              <w:rPr>
+                <w:rFonts w:asciiTheme="majorHAnsi" w:hAnsiTheme="majorHAnsi" w:cstheme="majorHAnsi"/>
+                <w:sz w:val="18"/>
+                <w:szCs w:val="18"/>
+              </w:rPr>
+              <w:t xml:space="preserve"> or a third party. Where the outsourcing agreement involves an intra-group entity, the agreement should be legally enforceable against the intra-group entity providing the outsourced service;</w:t>
+            </w:r>
+          </w:p>
+          <w:p>
+            <w:pPr>
+              <w:pStyle w:val="BodyText"/>
+              <w:rPr>
+                <w:rFonts w:asciiTheme="majorHAnsi" w:hAnsiTheme="majorHAnsi" w:cstheme="majorHAnsi"/>
+                <w:sz w:val="18"/>
+                <w:szCs w:val="18"/>
+              </w:rPr>
+            </w:pPr>
+            <w:r>
+              <w:rPr>
+                <w:rFonts w:asciiTheme="majorHAnsi" w:hAnsiTheme="majorHAnsi" w:cstheme="majorHAnsi"/>
+                <w:highlight w:val="yellow"/>
+                <w:sz w:val="18"/>
+                <w:szCs w:val="18"/>
+              </w:rPr>
+              <w:t xml:space="preserve">(j) sub-contracting – An institution should retain the ability to monitor and control its outsourcing arrangements when a service provider uses a sub-contractor. An outsourcing agreement should contain clauses setting out the rules and limitations on sub-contracting. An institution should include clauses making the service provider contractually liable for the performance and risk management practices of its sub-contractor and for the sub-contractor’s compliance with the provisions in its agreement with the service provider, including the prudent practices set out in these Guidelines. The institution should ensure that the sub-contracting of any part of material outsourcing arrangements is subject to the institution’s prior approval;</w:t>
+            </w:r>
+          </w:p>
+          <w:p>
+            <w:pPr>
+              <w:pStyle w:val="BodyText"/>
+              <w:rPr>
+                <w:rFonts w:asciiTheme="majorHAnsi" w:hAnsiTheme="majorHAnsi" w:cstheme="majorHAnsi"/>
+                <w:sz w:val="18"/>
+                <w:szCs w:val="18"/>
+              </w:rPr>
+            </w:pPr>
+            <w:r>
+              <w:rPr>
+                <w:rFonts w:asciiTheme="majorHAnsi" w:hAnsiTheme="majorHAnsi" w:cstheme="majorHAnsi"/>
+                <w:sz w:val="18"/>
+                <w:szCs w:val="18"/>
+              </w:rPr>
+              <w:t xml:space="preserve">(k) applicable laws – Agreements should include choice-of-law provisions, agreement covenants and jurisdictional covenants that provide for adjudication of disputes between the parties under the laws of a specific jurisdiction.</w:t>
+            </w:r>
+          </w:p>
+        </w:tc>
+        <w:tc>
+          <w:tcPr>
+            <w:tcW w:w="2189" w:type="dxa"/>
+          </w:tcPr>
+          <w:p>
+            <w:pPr>
+              <w:pStyle w:val="BodyText"/>
+              <w:rPr>
+                <w:rFonts w:asciiTheme="majorHAnsi" w:hAnsiTheme="majorHAnsi" w:cstheme="majorHAnsi"/>
+                <w:sz w:val="18"/>
+                <w:szCs w:val="18"/>
+              </w:rPr>
+            </w:pPr>
+            <w:r>
+              <w:rPr>
+                <w:rFonts w:asciiTheme="majorHAnsi" w:hAnsiTheme="majorHAnsi" w:cstheme="majorHAnsi"/>
+                <w:sz w:val="18"/>
+                <w:szCs w:val="18"/>
+              </w:rPr>
+              <w:t xml:space="preserve">3.4.2 of the Bank Guidelines corresponds to 5.5.2 of the FI Guidelines, with the following differences:</w:t>
+            </w:r>
+          </w:p>
+          <w:p>
+            <w:pPr>
+              <w:pStyle w:val="BodyText"/>
+              <w:rPr>
+                <w:rFonts w:asciiTheme="majorHAnsi" w:hAnsiTheme="majorHAnsi" w:cstheme="majorHAnsi"/>
+                <w:sz w:val="18"/>
+                <w:szCs w:val="18"/>
+              </w:rPr>
+            </w:pPr>
+            <w:r>
+              <w:rPr>
+                <w:rFonts w:asciiTheme="majorHAnsi" w:hAnsiTheme="majorHAnsi" w:cstheme="majorHAnsi"/>
+                <w:sz w:val="18"/>
+                <w:szCs w:val="18"/>
+              </w:rPr>
+              <w:t xml:space="preserve">1. The FI Guidelines add item (j) on sub-contracting; the Bank Guidelines deal with sub-contracting separately in section 3.5.</w:t>
+            </w:r>
+          </w:p>
+          <w:p>
+            <w:pPr>
+              <w:pStyle w:val="BodyText"/>
+              <w:rPr>
+                <w:rFonts w:asciiTheme="majorHAnsi" w:hAnsiTheme="majorHAnsi" w:cstheme="majorHAnsi"/>
+                <w:sz w:val="18"/>
+                <w:szCs w:val="18"/>
+              </w:rPr>
+            </w:pPr>
+            <w:r>
+              <w:rPr>
+                <w:rFonts w:asciiTheme="majorHAnsi" w:hAnsiTheme="majorHAnsi" w:cstheme="majorHAnsi"/>
+                <w:sz w:val="18"/>
+                <w:szCs w:val="18"/>
+              </w:rPr>
+              <w:t xml:space="preserve">2. Footnotes 9 and 12 of the Bank Guidelines require MOORS agreements to include the requirements of paragraphs 7.1(a)–(c) and 7.1(d) of the Notices; there is no FI equivalent.</w:t>
+            </w:r>
+          </w:p>
+          <w:p>
+            <w:pPr>
+              <w:pStyle w:val="BodyText"/>
+              <w:rPr>
+                <w:rFonts w:asciiTheme="majorHAnsi" w:hAnsiTheme="majorHAnsi" w:cstheme="majorHAnsi"/>
+                <w:sz w:val="18"/>
+                <w:szCs w:val="18"/>
+              </w:rPr>
+            </w:pPr>
+            <w:r>
+              <w:rPr>
+                <w:rFonts w:asciiTheme="majorHAnsi" w:hAnsiTheme="majorHAnsi" w:cstheme="majorHAnsi"/>
+                <w:sz w:val="18"/>
+                <w:szCs w:val="18"/>
+              </w:rPr>
+              <w:t xml:space="preserve">3. The FI Guidelines set out the termination and sub-contracting content in full within 5.5.2 itself (items (i) and (j)); the Bank Guidelines elaborate in 3.4.3–3.4.8 and 3.5.</w:t>
+            </w:r>
+          </w:p>
+        </w:tc>
+      </w:tr>
+      <w:tr>
+        <w:tc>
+          <w:tcPr>
+            <w:tcW w:w="625" w:type="dxa"/>
+          </w:tcPr>
+          <w:p>
+            <w:pPr>
+              <w:pStyle w:val="BodyText"/>
+              <w:rPr>
+                <w:rFonts w:asciiTheme="majorHAnsi" w:hAnsiTheme="majorHAnsi" w:cstheme="majorHAnsi"/>
+                <w:sz w:val="18"/>
+                <w:szCs w:val="18"/>
+              </w:rPr>
+            </w:pPr>
+            <w:r>
+              <w:rPr>
+                <w:rFonts w:asciiTheme="majorHAnsi" w:hAnsiTheme="majorHAnsi" w:cstheme="majorHAnsi"/>
+                <w:sz w:val="18"/>
+                <w:szCs w:val="18"/>
+              </w:rPr>
+              <w:t>3.4.3</w:t>
+            </w:r>
+          </w:p>
+        </w:tc>
+        <w:tc>
+          <w:tcPr>
+            <w:tcW w:w="5670" w:type="dxa"/>
+          </w:tcPr>
+          <w:p>
+            <w:pPr>
+              <w:pStyle w:val="BodyText"/>
+              <w:rPr>
+                <w:rFonts w:asciiTheme="majorHAnsi" w:hAnsiTheme="majorHAnsi" w:cstheme="majorHAnsi"/>
+                <w:sz w:val="18"/>
+                <w:szCs w:val="18"/>
+              </w:rPr>
+            </w:pPr>
+            <w:r>
+              <w:rPr>
+                <w:rFonts w:asciiTheme="majorHAnsi" w:hAnsiTheme="majorHAnsi" w:cstheme="majorHAnsi"/>
+                <w:sz w:val="18"/>
+                <w:szCs w:val="18"/>
+              </w:rPr>
+              <w:t xml:space="preserve">A Bank should have the right to terminate the outsourcing agreement in the event of default, or under any of the following circumstances: </w:t>
+            </w:r>
+            <w:r>
+              <w:rPr>
+                <w:rFonts w:asciiTheme="majorHAnsi" w:hAnsiTheme="majorHAnsi" w:cstheme="majorHAnsi"/>
+                <w:highlight w:val="yellow"/>
+                <w:sz w:val="18"/>
+                <w:szCs w:val="18"/>
+              </w:rPr>
+              <w:t xml:space="preserve">(a) by giving reasonable notice to the service provider; (b) if the service provider or a sub-contractor, as the case may be, failed to safeguard the confidentiality or integrity of customer information of the Bank; or (c) if there has been a demonstrable deterioration in the ability of the service provider or a sub-contractor to safeguard the confidentiality of customer information.</w:t>
+            </w:r>
+          </w:p>
+        </w:tc>
+        <w:tc>
+          <w:tcPr>
+            <w:tcW w:w="5731" w:type="dxa"/>
+          </w:tcPr>
+          <w:p>
+            <w:pPr>
+              <w:pStyle w:val="BodyText"/>
+              <w:rPr>
+                <w:rFonts w:asciiTheme="majorHAnsi" w:hAnsiTheme="majorHAnsi" w:cstheme="majorHAnsi"/>
+                <w:sz w:val="18"/>
+                <w:szCs w:val="18"/>
+              </w:rPr>
+            </w:pPr>
+            <w:r>
+              <w:rPr>
+                <w:rFonts w:asciiTheme="majorHAnsi" w:hAnsiTheme="majorHAnsi" w:cstheme="majorHAnsi"/>
+                <w:highlight w:val="yellow"/>
+                <w:sz w:val="18"/>
+                <w:szCs w:val="18"/>
+              </w:rPr>
               <w:t xml:space="preserve">[5.5.2(i)]</w:t>
             </w:r>
             <w:r>
@@ -10388,7 +10449,95 @@
                 <w:sz w:val="18"/>
                 <w:szCs w:val="18"/>
               </w:rPr>
-              <w:t xml:space="preserve"> The minimum period to execute a termination provision should be specified in the outsourcing agreement. Other provisions should also be put in place to ensure a smooth transition when the agreement is terminated or being amended. Such provisions may facilitate transferability of the outsourced services to a bridge-institution</w:t>
+              <w:t xml:space="preserve"> An institution should, have the right to terminate the outsourcing agreement in the event of default, or under circumstances where: </w:t>
+            </w:r>
+            <w:r>
+              <w:rPr>
+                <w:rFonts w:asciiTheme="majorHAnsi" w:hAnsiTheme="majorHAnsi" w:cstheme="majorHAnsi"/>
+                <w:highlight w:val="yellow"/>
+                <w:sz w:val="18"/>
+                <w:szCs w:val="18"/>
+              </w:rPr>
+              <w:t xml:space="preserve">(i) the service provider undergoes a change in ownership; (ii) the service provider becomes insolvent or goes into liquidation; (iii) the service provider goes into receivership or judicial management whether in Singapore or elsewhere; (iv) there has been a breach of security or confidentiality; or (v) there is a demonstrable deterioration in the ability of the service provider to perform the contracted service.</w:t>
+            </w:r>
+            <w:r>
+              <w:rPr>
+                <w:rFonts w:asciiTheme="majorHAnsi" w:hAnsiTheme="majorHAnsi" w:cstheme="majorHAnsi"/>
+                <w:sz w:val="18"/>
+                <w:szCs w:val="18"/>
+              </w:rPr>
+              <w:t xml:space="preserve"> (The termination mechanics that follow in 5.5.2(i) are set out at row 3.4.4.)</w:t>
+            </w:r>
+          </w:p>
+        </w:tc>
+        <w:tc>
+          <w:tcPr>
+            <w:tcW w:w="2189" w:type="dxa"/>
+          </w:tcPr>
+          <w:p>
+            <w:pPr>
+              <w:pStyle w:val="BodyText"/>
+              <w:rPr>
+                <w:rFonts w:asciiTheme="majorHAnsi" w:hAnsiTheme="majorHAnsi" w:cstheme="majorHAnsi"/>
+                <w:sz w:val="18"/>
+                <w:szCs w:val="18"/>
+              </w:rPr>
+            </w:pPr>
+            <w:r>
+              <w:rPr>
+                <w:rFonts w:asciiTheme="majorHAnsi" w:hAnsiTheme="majorHAnsi" w:cstheme="majorHAnsi"/>
+                <w:sz w:val="18"/>
+                <w:szCs w:val="18"/>
+              </w:rPr>
+              <w:t xml:space="preserve">Found in 5.5.2(i) of the FI Guidelines (quoted at 3.4.2 above). The termination triggers differ: the FI Guidelines allow termination on change in ownership, insolvency or liquidation, receivership or judicial management, breach of security or confidentiality, or deterioration in ability to perform the contracted service; the Bank Guidelines focus instead on failure to safeguard the confidentiality or integrity of customer information (including by sub-contractors) and add termination by reasonable notice. The Bank Guidelines do not set out the corporate-event triggers; the binding contractual requirements for Banks are in paragraph 7.1 of the Notices.</w:t>
+            </w:r>
+          </w:p>
+        </w:tc>
+      </w:tr>
+      <w:tr>
+        <w:tc>
+          <w:tcPr>
+            <w:tcW w:w="625" w:type="dxa"/>
+          </w:tcPr>
+          <w:p>
+            <w:pPr>
+              <w:pStyle w:val="BodyText"/>
+              <w:rPr>
+                <w:rFonts w:asciiTheme="majorHAnsi" w:hAnsiTheme="majorHAnsi" w:cstheme="majorHAnsi"/>
+                <w:sz w:val="18"/>
+                <w:szCs w:val="18"/>
+              </w:rPr>
+            </w:pPr>
+            <w:r>
+              <w:rPr>
+                <w:rFonts w:asciiTheme="majorHAnsi" w:hAnsiTheme="majorHAnsi" w:cstheme="majorHAnsi"/>
+                <w:sz w:val="18"/>
+                <w:szCs w:val="18"/>
+              </w:rPr>
+              <w:t>3.4.4</w:t>
+            </w:r>
+          </w:p>
+        </w:tc>
+        <w:tc>
+          <w:tcPr>
+            <w:tcW w:w="5670" w:type="dxa"/>
+          </w:tcPr>
+          <w:p>
+            <w:pPr>
+              <w:pStyle w:val="BodyText"/>
+              <w:rPr>
+                <w:rFonts w:asciiTheme="majorHAnsi" w:hAnsiTheme="majorHAnsi" w:cstheme="majorHAnsi"/>
+                <w:sz w:val="18"/>
+                <w:szCs w:val="18"/>
+              </w:rPr>
+            </w:pPr>
+            <w:r>
+              <w:rPr>
+                <w:rFonts w:asciiTheme="majorHAnsi" w:hAnsiTheme="majorHAnsi" w:cstheme="majorHAnsi"/>
+                <w:sz w:val="18"/>
+                <w:szCs w:val="18"/>
+              </w:rPr>
+              <w:t xml:space="preserve">The minimum period to execute a termination provision should be specified in the outsourcing agreement. Other provisions should also be put in place to ensure a smooth transition when the agreement is terminated or being amended. Such provisions may facilitate transferability of the outsourced services to a bridge-institution</w:t>
             </w:r>
             <w:r>
               <w:rPr>
@@ -10397,7 +10546,7 @@
                 <w:szCs w:val="18"/>
                 <w:vertAlign w:val="superscript"/>
               </w:rPr>
-              <w:t xml:space="preserve">13</w:t>
+              <w:t xml:space="preserve">14</w:t>
             </w:r>
             <w:r>
               <w:rPr>
@@ -10424,7 +10573,7 @@
                 <w:szCs w:val="16"/>
                 <w:vertAlign w:val="superscript"/>
               </w:rPr>
-              <w:t xml:space="preserve">13</w:t>
+              <w:t xml:space="preserve">14</w:t>
             </w:r>
             <w:r>
               <w:rPr>
@@ -10438,55 +10587,7 @@
         </w:tc>
         <w:tc>
           <w:tcPr>
-            <w:tcW w:w="2189" w:type="dxa"/>
-          </w:tcPr>
-          <w:p>
-            <w:pPr>
-              <w:pStyle w:val="BodyText"/>
-              <w:rPr>
-                <w:rFonts w:asciiTheme="majorHAnsi" w:hAnsiTheme="majorHAnsi" w:cstheme="majorHAnsi"/>
-                <w:sz w:val="18"/>
-                <w:szCs w:val="18"/>
-              </w:rPr>
-            </w:pPr>
-            <w:r>
-              <w:rPr>
-                <w:rFonts w:asciiTheme="majorHAnsi" w:hAnsiTheme="majorHAnsi" w:cstheme="majorHAnsi"/>
-                <w:sz w:val="18"/>
-                <w:szCs w:val="18"/>
-              </w:rPr>
-              <w:t xml:space="preserve">Found in the closing text of 5.5.2(i) of the FI Guidelines, worded identically (“bridge-institution” is defined identically at footnote 13 of the FI Guidelines).</w:t>
-            </w:r>
-          </w:p>
-        </w:tc>
-      </w:tr>
-      <w:tr>
-        <w:tc>
-          <w:tcPr>
-            <w:tcW w:w="625" w:type="dxa"/>
-          </w:tcPr>
-          <w:p>
-            <w:pPr>
-              <w:pStyle w:val="BodyText"/>
-              <w:rPr>
-                <w:rFonts w:asciiTheme="majorHAnsi" w:hAnsiTheme="majorHAnsi" w:cstheme="majorHAnsi"/>
-                <w:sz w:val="18"/>
-                <w:szCs w:val="18"/>
-              </w:rPr>
-            </w:pPr>
-            <w:r>
-              <w:rPr>
-                <w:rFonts w:asciiTheme="majorHAnsi" w:hAnsiTheme="majorHAnsi" w:cstheme="majorHAnsi"/>
-                <w:sz w:val="18"/>
-                <w:szCs w:val="18"/>
-              </w:rPr>
-              <w:t>3.4.5</w:t>
-            </w:r>
-          </w:p>
-        </w:tc>
-        <w:tc>
-          <w:tcPr>
-            <w:tcW w:w="5670" w:type="dxa"/>
+            <w:tcW w:w="5731" w:type="dxa"/>
           </w:tcPr>
           <w:p>
             <w:pPr>
@@ -10504,32 +10605,32 @@
                 <w:sz w:val="18"/>
                 <w:szCs w:val="18"/>
               </w:rPr>
-              <w:t xml:space="preserve">For the purposes of paragraph 7.1(g) in the Notices, MAS will consider directing a Bank to terminate the contract, or to stop obtaining or receiving the MOORS15, when</w:t>
-            </w:r>
-            <w:r>
-              <w:rPr>
-                <w:rFonts w:asciiTheme="majorHAnsi" w:hAnsiTheme="majorHAnsi" w:cstheme="majorHAnsi"/>
-                <w:sz w:val="18"/>
-                <w:szCs w:val="18"/>
-              </w:rPr>
-              <w:t xml:space="preserve"> (a) circumstances referred to in paragraph 10.3 of the Notices arise and the service provider is unwilling or unable to remediate the issues; (b) the service provider is unable or unwilling to remediate issues and the Bank did not elect to terminate the outsourcing agreement of its own accord; (c) a Bank fails or is unable to demonstrate a satisfactory level of understanding of the nature and extent of risk arising from the MOORS; (d) a Bank fails or is unable to implement adequate measures to address the risks arising from its ongoing outsourced relevant services in a satisfactory and timely manner; (e) adverse developments arise from the MOORS that could impact a Bank; (f) </w:t>
-            </w:r>
-            <w:r>
-              <w:rPr>
-                <w:rFonts w:asciiTheme="majorHAnsi" w:hAnsiTheme="majorHAnsi" w:cstheme="majorHAnsi"/>
-                <w:highlight w:val="yellow"/>
-                <w:sz w:val="18"/>
-                <w:szCs w:val="18"/>
-              </w:rPr>
-              <w:t xml:space="preserve">MAS or an auditor appointed by MAS, is prevented by the service provider from auditing the books, systems and premises of the service provider for any of the purposes mentioned in section 47A(10) of the Banking Act 1970 (the “Act”)</w:t>
-            </w:r>
-            <w:r>
-              <w:rPr>
-                <w:rFonts w:asciiTheme="majorHAnsi" w:hAnsiTheme="majorHAnsi" w:cstheme="majorHAnsi"/>
-                <w:sz w:val="18"/>
-                <w:szCs w:val="18"/>
-              </w:rPr>
-              <w:t xml:space="preserve">; (g) where the sub-contracting agreement provides for the matter mentioned in paragraph 3.5.3(b)(iv), the Bank or any auditor appointed by the Bank, is prevented by the sub-contractor from auditing the books, systems and premises of the sub-contractor for any of the purposes mentioned in paragraph 3.5.3(b)(iv); or (h) where the sub-contracting agreement provides for the matter mentioned in paragraph 3.5.3(b)(v), the Bank, or any person appointed by the Bank, is prevented by the sub-contractor from obtaining any record, document, report or information relating to the sub-contracting arrangement.</w:t>
+              <w:t xml:space="preserve">[5.5.2(i)]</w:t>
+            </w:r>
+            <w:r>
+              <w:rPr>
+                <w:rFonts w:asciiTheme="majorHAnsi" w:hAnsiTheme="majorHAnsi" w:cstheme="majorHAnsi"/>
+                <w:sz w:val="18"/>
+                <w:szCs w:val="18"/>
+              </w:rPr>
+              <w:t xml:space="preserve"> The minimum period to execute a termination provision should be specified in the outsourcing agreement. Other provisions should also be put in place to ensure a smooth transition when the agreement is terminated or being amended. Such provisions may facilitate transferability of the outsourced services to a bridge-institution</w:t>
+            </w:r>
+            <w:r>
+              <w:rPr>
+                <w:rFonts w:asciiTheme="majorHAnsi" w:hAnsiTheme="majorHAnsi" w:cstheme="majorHAnsi"/>
+                <w:sz w:val="18"/>
+                <w:szCs w:val="18"/>
+                <w:vertAlign w:val="superscript"/>
+              </w:rPr>
+              <w:t xml:space="preserve">13</w:t>
+            </w:r>
+            <w:r>
+              <w:rPr>
+                <w:rFonts w:asciiTheme="majorHAnsi" w:hAnsiTheme="majorHAnsi" w:cstheme="majorHAnsi"/>
+                <w:sz w:val="18"/>
+                <w:szCs w:val="18"/>
+              </w:rPr>
+              <w:t xml:space="preserve"> or a third party. Where the outsourcing agreement involves an intra-group entity, the agreement should be legally enforceable against the intra-group entity providing the outsourced service.</w:t>
             </w:r>
           </w:p>
           <w:p>
@@ -10548,7 +10649,7 @@
                 <w:szCs w:val="16"/>
                 <w:vertAlign w:val="superscript"/>
               </w:rPr>
-              <w:t xml:space="preserve">15</w:t>
+              <w:t xml:space="preserve">13</w:t>
             </w:r>
             <w:r>
               <w:rPr>
@@ -10556,82 +10657,7 @@
                 <w:sz w:val="16"/>
                 <w:szCs w:val="16"/>
               </w:rPr>
-              <w:t xml:space="preserve"> – MAS will only direct Banks to terminate outsourcing agreements for MOORS as a last resort. Banks do not have to exercise the termination rights if they are able to work with the service provider to remediate the issues giving rise to the ground(s) for termination.</w:t>
-            </w:r>
-          </w:p>
-        </w:tc>
-        <w:tc>
-          <w:tcPr>
-            <w:tcW w:w="5731" w:type="dxa"/>
-          </w:tcPr>
-          <w:p>
-            <w:pPr>
-              <w:pStyle w:val="BodyText"/>
-              <w:rPr>
-                <w:rFonts w:asciiTheme="majorHAnsi" w:hAnsiTheme="majorHAnsi" w:cstheme="majorHAnsi"/>
-                <w:sz w:val="18"/>
-                <w:szCs w:val="18"/>
-              </w:rPr>
-            </w:pPr>
-            <w:r>
-              <w:rPr>
-                <w:rFonts w:asciiTheme="majorHAnsi" w:hAnsiTheme="majorHAnsi" w:cstheme="majorHAnsi"/>
-                <w:highlight w:val="yellow"/>
-                <w:sz w:val="18"/>
-                <w:szCs w:val="18"/>
-              </w:rPr>
-              <w:t xml:space="preserve">[4.1.3]</w:t>
-            </w:r>
-            <w:r>
-              <w:rPr>
-                <w:rFonts w:asciiTheme="majorHAnsi" w:hAnsiTheme="majorHAnsi" w:cstheme="majorHAnsi"/>
-                <w:sz w:val="18"/>
-                <w:szCs w:val="18"/>
-              </w:rPr>
-              <w:t xml:space="preserve"> MAS may require an institution to </w:t>
-            </w:r>
-            <w:r>
-              <w:rPr>
-                <w:rFonts w:asciiTheme="majorHAnsi" w:hAnsiTheme="majorHAnsi" w:cstheme="majorHAnsi"/>
-                <w:highlight w:val="yellow"/>
-                <w:sz w:val="18"/>
-                <w:szCs w:val="18"/>
-              </w:rPr>
-              <w:t xml:space="preserve">modify, make alternative arrangements or re-integrate an outsourced service into the institution</w:t>
-            </w:r>
-            <w:r>
-              <w:rPr>
-                <w:rFonts w:asciiTheme="majorHAnsi" w:hAnsiTheme="majorHAnsi" w:cstheme="majorHAnsi"/>
-                <w:sz w:val="18"/>
-                <w:szCs w:val="18"/>
-              </w:rPr>
-              <w:t xml:space="preserve"> where one of the following circumstances arises: (a) An institution fails or is unable to demonstrate a satisfactory level of understanding of the nature and extent of risk arising from the outsourcing arrangement; (b) An institution fails or is unable to implement adequate measures to address the risks arising from its outsourcing arrangements in a satisfactory and timely manner; (c) Adverse developments arise from the outsourcing arrangement that could impact an institution; </w:t>
-            </w:r>
-            <w:r>
-              <w:rPr>
-                <w:rFonts w:asciiTheme="majorHAnsi" w:hAnsiTheme="majorHAnsi" w:cstheme="majorHAnsi"/>
-                <w:highlight w:val="yellow"/>
-                <w:sz w:val="18"/>
-                <w:szCs w:val="18"/>
-              </w:rPr>
-              <w:t xml:space="preserve">(d) MAS’ supervisory powers over the institution and ability to carry out MAS’ supervisory functions in respect of the institution’s services are hindered;</w:t>
-            </w:r>
-            <w:r>
-              <w:rPr>
-                <w:rFonts w:asciiTheme="majorHAnsi" w:hAnsiTheme="majorHAnsi" w:cstheme="majorHAnsi"/>
-                <w:sz w:val="18"/>
-                <w:szCs w:val="18"/>
-              </w:rPr>
-              <w:t xml:space="preserve"> or </w:t>
-            </w:r>
-            <w:r>
-              <w:rPr>
-                <w:rFonts w:asciiTheme="majorHAnsi" w:hAnsiTheme="majorHAnsi" w:cstheme="majorHAnsi"/>
-                <w:highlight w:val="yellow"/>
-                <w:sz w:val="18"/>
-                <w:szCs w:val="18"/>
-              </w:rPr>
-              <w:t xml:space="preserve">(e) The security and confidentiality of the institution’s customer information is lowered due to changes in the control environment of the service provider.</w:t>
+              <w:t xml:space="preserve"> – “bridge-institution” means an institution, whether incorporated in Singapore or outside Singapore, to temporarily take over and maintain certain assets, liabilities and operations of a distressed financial institution, as part of a resolution Authority’s exercise of a resolution.</w:t>
             </w:r>
           </w:p>
         </w:tc>
@@ -10654,25 +10680,7 @@
                 <w:sz w:val="18"/>
                 <w:szCs w:val="18"/>
               </w:rPr>
-              <w:t xml:space="preserve">Closest counterpart is 4.1.3 of the FI Guidelines: MAS may require an institution to modify, make alternative arrangements or re-integrate an outsourced service where (a) the institution fails to demonstrate a satisfactory understanding of the risks; (b) it fails to implement adequate measures in a satisfactory and timely manner; (c) adverse developments arise; (d) MAS’ supervisory powers or functions are hindered; or (e) the security and confidentiality of customer information is lowered due to changes in the service provider’s control environment.</w:t>
-            </w:r>
-          </w:p>
-          <w:p>
-            <w:pPr>
-              <w:pStyle w:val="BodyText"/>
-              <w:rPr>
-                <w:rFonts w:asciiTheme="majorHAnsi" w:hAnsiTheme="majorHAnsi" w:cstheme="majorHAnsi"/>
-                <w:sz w:val="18"/>
-                <w:szCs w:val="18"/>
-              </w:rPr>
-            </w:pPr>
-            <w:r>
-              <w:rPr>
-                <w:rFonts w:asciiTheme="majorHAnsi" w:hAnsiTheme="majorHAnsi" w:cstheme="majorHAnsi"/>
-                <w:sz w:val="18"/>
-                <w:szCs w:val="18"/>
-              </w:rPr>
-              <w:t xml:space="preserve">The FI Guidelines do not provide for MAS-directed termination, the audit-obstruction grounds (section 47A(10) of the Banking Act), or the last-resort assurance in footnote 15.</w:t>
+              <w:t xml:space="preserve">Found in the closing text of 5.5.2(i) of the FI Guidelines, worded identically (“bridge-institution” is defined identically at footnote 13 of the FI Guidelines).</w:t>
             </w:r>
           </w:p>
         </w:tc>
@@ -10697,7 +10705,7 @@
                 <w:sz w:val="18"/>
                 <w:szCs w:val="18"/>
               </w:rPr>
-              <w:t xml:space="preserve">3.4.6</w:t>
+              <w:t>3.4.5</w:t>
             </w:r>
           </w:p>
         </w:tc>
@@ -10717,211 +10725,36 @@
             <w:r>
               <w:rPr>
                 <w:rFonts w:asciiTheme="majorHAnsi" w:hAnsiTheme="majorHAnsi" w:cstheme="majorHAnsi"/>
-                <w:sz w:val="18"/>
-                <w:szCs w:val="18"/>
-              </w:rPr>
-              <w:t xml:space="preserve">MAS will endeavour to provide the Bank reasonable notice of MAS’ intent to direct the Bank to terminate its outsourcing arrangement(s).</w:t>
-            </w:r>
-          </w:p>
-        </w:tc>
-        <w:tc>
-          <w:tcPr>
-            <w:tcW w:w="5731" w:type="dxa"/>
-          </w:tcPr>
-          <w:p>
-            <w:pPr>
-              <w:pStyle w:val="BodyText"/>
-              <w:rPr>
-                <w:rFonts w:asciiTheme="majorHAnsi" w:hAnsiTheme="majorHAnsi" w:cstheme="majorHAnsi"/>
-                <w:sz w:val="18"/>
-                <w:szCs w:val="18"/>
-              </w:rPr>
-            </w:pPr>
-            <w:r>
-              <w:rPr>
-                <w:rFonts w:asciiTheme="majorHAnsi" w:hAnsiTheme="majorHAnsi" w:cstheme="majorHAnsi"/>
-                <w:i/>
-                <w:iCs/>
-                <w:sz w:val="18"/>
-                <w:szCs w:val="18"/>
-              </w:rPr>
-              <w:t xml:space="preserve">No provision here under FI Guidelines.</w:t>
-            </w:r>
-          </w:p>
-        </w:tc>
-        <w:tc>
-          <w:tcPr>
-            <w:tcW w:w="2189" w:type="dxa"/>
-          </w:tcPr>
-          <w:p>
-            <w:pPr>
-              <w:pStyle w:val="BodyText"/>
-              <w:rPr>
-                <w:rFonts w:asciiTheme="majorHAnsi" w:hAnsiTheme="majorHAnsi" w:cstheme="majorHAnsi"/>
-                <w:sz w:val="18"/>
-                <w:szCs w:val="18"/>
-              </w:rPr>
-            </w:pPr>
-            <w:r>
-              <w:rPr>
-                <w:rFonts w:asciiTheme="majorHAnsi" w:hAnsiTheme="majorHAnsi" w:cstheme="majorHAnsi"/>
-                <w:sz w:val="18"/>
-                <w:szCs w:val="18"/>
-              </w:rPr>
-              <w:t xml:space="preserve">No equivalent under the FI Guidelines. No reasonable-notice assurance attaches to the powers in 4.1.3 of the FI Guidelines.</w:t>
-            </w:r>
-          </w:p>
-        </w:tc>
-      </w:tr>
-      <w:tr>
-        <w:tc>
-          <w:tcPr>
-            <w:tcW w:w="625" w:type="dxa"/>
-          </w:tcPr>
-          <w:p>
-            <w:pPr>
-              <w:pStyle w:val="BodyText"/>
-              <w:rPr>
-                <w:rFonts w:asciiTheme="majorHAnsi" w:hAnsiTheme="majorHAnsi" w:cstheme="majorHAnsi"/>
-                <w:sz w:val="18"/>
-                <w:szCs w:val="18"/>
-              </w:rPr>
-            </w:pPr>
-            <w:r>
-              <w:rPr>
-                <w:rFonts w:asciiTheme="majorHAnsi" w:hAnsiTheme="majorHAnsi" w:cstheme="majorHAnsi"/>
-                <w:sz w:val="18"/>
-                <w:szCs w:val="18"/>
-              </w:rPr>
-              <w:t xml:space="preserve">3.4.7</w:t>
-            </w:r>
-          </w:p>
-        </w:tc>
-        <w:tc>
-          <w:tcPr>
-            <w:tcW w:w="5670" w:type="dxa"/>
-          </w:tcPr>
-          <w:p>
-            <w:pPr>
-              <w:pStyle w:val="BodyText"/>
-              <w:rPr>
-                <w:rFonts w:asciiTheme="majorHAnsi" w:hAnsiTheme="majorHAnsi" w:cstheme="majorHAnsi"/>
-                <w:sz w:val="18"/>
-                <w:szCs w:val="18"/>
-              </w:rPr>
-            </w:pPr>
-            <w:r>
-              <w:rPr>
-                <w:rFonts w:asciiTheme="majorHAnsi" w:hAnsiTheme="majorHAnsi" w:cstheme="majorHAnsi"/>
                 <w:highlight w:val="yellow"/>
                 <w:sz w:val="18"/>
                 <w:szCs w:val="18"/>
               </w:rPr>
-              <w:t xml:space="preserve">To better protect its information, a Bank should endeavour for the requirement in paragraph 7.1(f) of the Notices on deleting, destroying or rendering unusable information upon termination to go beyond the minimally required customer information to also include non-customer information given to the service provider, except for situations where the Bank assesses that the service provider has legitimate reason(s) to retain non-customer information.</w:t>
-            </w:r>
-            <w:r>
-              <w:rPr>
-                <w:rFonts w:asciiTheme="majorHAnsi" w:hAnsiTheme="majorHAnsi" w:cstheme="majorHAnsi"/>
-                <w:sz w:val="18"/>
-                <w:szCs w:val="18"/>
-              </w:rPr>
-              <w:t xml:space="preserve"> The Bank should also ensure the minimum period to execute a termination provision is specified in the outsourcing agreement.</w:t>
-            </w:r>
-          </w:p>
-        </w:tc>
-        <w:tc>
-          <w:tcPr>
-            <w:tcW w:w="5731" w:type="dxa"/>
-          </w:tcPr>
-          <w:p>
-            <w:pPr>
-              <w:pStyle w:val="BodyText"/>
-              <w:rPr>
-                <w:rFonts w:asciiTheme="majorHAnsi" w:hAnsiTheme="majorHAnsi" w:cstheme="majorHAnsi"/>
-                <w:sz w:val="18"/>
-                <w:szCs w:val="18"/>
-              </w:rPr>
-            </w:pPr>
-            <w:r>
-              <w:rPr>
-                <w:rFonts w:asciiTheme="majorHAnsi" w:hAnsiTheme="majorHAnsi" w:cstheme="majorHAnsi"/>
-                <w:i/>
-                <w:iCs/>
-                <w:sz w:val="18"/>
-                <w:szCs w:val="18"/>
-              </w:rPr>
-              <w:t xml:space="preserve">No provision here under FI Guidelines.</w:t>
-            </w:r>
-          </w:p>
-        </w:tc>
-        <w:tc>
-          <w:tcPr>
-            <w:tcW w:w="2189" w:type="dxa"/>
-          </w:tcPr>
-          <w:p>
-            <w:pPr>
-              <w:pStyle w:val="BodyText"/>
-              <w:rPr>
-                <w:rFonts w:asciiTheme="majorHAnsi" w:hAnsiTheme="majorHAnsi" w:cstheme="majorHAnsi"/>
-                <w:sz w:val="18"/>
-                <w:szCs w:val="18"/>
-              </w:rPr>
-            </w:pPr>
-            <w:r>
-              <w:rPr>
-                <w:rFonts w:asciiTheme="majorHAnsi" w:hAnsiTheme="majorHAnsi" w:cstheme="majorHAnsi"/>
-                <w:sz w:val="18"/>
-                <w:szCs w:val="18"/>
-              </w:rPr>
-              <w:t xml:space="preserve">No equivalent under the FI Guidelines. The only FI deletion expectation is the business continuity provision in 5.7.2(c) (which corresponds to 3.7.2(c) of the Bank Guidelines).</w:t>
-            </w:r>
-          </w:p>
-        </w:tc>
-      </w:tr>
-      <w:tr>
-        <w:tc>
-          <w:tcPr>
-            <w:tcW w:w="625" w:type="dxa"/>
-          </w:tcPr>
-          <w:p>
-            <w:pPr>
-              <w:pStyle w:val="BodyText"/>
-              <w:rPr>
-                <w:rFonts w:asciiTheme="majorHAnsi" w:hAnsiTheme="majorHAnsi" w:cstheme="majorHAnsi"/>
-                <w:sz w:val="18"/>
-                <w:szCs w:val="18"/>
-              </w:rPr>
-            </w:pPr>
-            <w:r>
-              <w:rPr>
-                <w:rFonts w:asciiTheme="majorHAnsi" w:hAnsiTheme="majorHAnsi" w:cstheme="majorHAnsi"/>
-                <w:sz w:val="18"/>
-                <w:szCs w:val="18"/>
-              </w:rPr>
-              <w:t xml:space="preserve">3.4.8</w:t>
-            </w:r>
-          </w:p>
-        </w:tc>
-        <w:tc>
-          <w:tcPr>
-            <w:tcW w:w="5670" w:type="dxa"/>
-          </w:tcPr>
-          <w:p>
-            <w:pPr>
-              <w:pStyle w:val="BodyText"/>
-              <w:rPr>
-                <w:rFonts w:asciiTheme="majorHAnsi" w:hAnsiTheme="majorHAnsi" w:cstheme="majorHAnsi"/>
-                <w:sz w:val="18"/>
-                <w:szCs w:val="18"/>
-              </w:rPr>
-            </w:pPr>
-            <w:r>
-              <w:rPr>
-                <w:rFonts w:asciiTheme="majorHAnsi" w:hAnsiTheme="majorHAnsi" w:cstheme="majorHAnsi"/>
-                <w:sz w:val="18"/>
-                <w:szCs w:val="18"/>
-              </w:rPr>
-              <w:t xml:space="preserve">Each agreement should be tailored to address issues arising from country risks and potential obstacles in exercising oversight and management of the outsourcing arrangements made with a service provider outside Singapore16.</w:t>
+              <w:t xml:space="preserve">For the purposes of paragraph 7.1(g) in the Notices, MAS will consider directing a Bank to terminate the contract, or to stop obtaining or receiving the MOORS15, when</w:t>
+            </w:r>
+            <w:r>
+              <w:rPr>
+                <w:rFonts w:asciiTheme="majorHAnsi" w:hAnsiTheme="majorHAnsi" w:cstheme="majorHAnsi"/>
+                <w:sz w:val="18"/>
+                <w:szCs w:val="18"/>
+              </w:rPr>
+              <w:t xml:space="preserve"> (a) circumstances referred to in paragraph 10.3 of the Notices arise and the service provider is unwilling or unable to remediate the issues; (b) the service provider is unable or unwilling to remediate issues and the Bank did not elect to terminate the outsourcing agreement of its own accord; (c) a Bank fails or is unable to demonstrate a satisfactory level of understanding of the nature and extent of risk arising from the MOORS; (d) a Bank fails or is unable to implement adequate measures to address the risks arising from its ongoing outsourced relevant services in a satisfactory and timely manner; (e) adverse developments arise from the MOORS that could impact a Bank; (f) </w:t>
+            </w:r>
+            <w:r>
+              <w:rPr>
+                <w:rFonts w:asciiTheme="majorHAnsi" w:hAnsiTheme="majorHAnsi" w:cstheme="majorHAnsi"/>
+                <w:highlight w:val="yellow"/>
+                <w:sz w:val="18"/>
+                <w:szCs w:val="18"/>
+              </w:rPr>
+              <w:t xml:space="preserve">MAS or an auditor appointed by MAS, is prevented by the service provider from auditing the books, systems and premises of the service provider for any of the purposes mentioned in section 47A(10) of the Banking Act 1970 (the “Act”)</w:t>
+            </w:r>
+            <w:r>
+              <w:rPr>
+                <w:rFonts w:asciiTheme="majorHAnsi" w:hAnsiTheme="majorHAnsi" w:cstheme="majorHAnsi"/>
+                <w:sz w:val="18"/>
+                <w:szCs w:val="18"/>
+              </w:rPr>
+              <w:t xml:space="preserve">; (g) where the sub-contracting agreement provides for the matter mentioned in paragraph 3.5.3(b)(iv), the Bank or any auditor appointed by the Bank, is prevented by the sub-contractor from auditing the books, systems and premises of the sub-contractor for any of the purposes mentioned in paragraph 3.5.3(b)(iv); or (h) where the sub-contracting agreement provides for the matter mentioned in paragraph 3.5.3(b)(v), the Bank, or any person appointed by the Bank, is prevented by the sub-contractor from obtaining any record, document, report or information relating to the sub-contracting arrangement.</w:t>
             </w:r>
           </w:p>
           <w:p>
@@ -10940,7 +10773,7 @@
                 <w:szCs w:val="16"/>
                 <w:vertAlign w:val="superscript"/>
               </w:rPr>
-              <w:t xml:space="preserve">16</w:t>
+              <w:t xml:space="preserve">15</w:t>
             </w:r>
             <w:r>
               <w:rPr>
@@ -10948,7 +10781,7 @@
                 <w:sz w:val="16"/>
                 <w:szCs w:val="16"/>
               </w:rPr>
-              <w:t xml:space="preserve"> – Refer to paragraph 3.10.</w:t>
+              <w:t xml:space="preserve"> – MAS will only direct Banks to terminate outsourcing agreements for MOORS as a last resort. Banks do not have to exercise the termination rights if they are able to work with the service provider to remediate the issues giving rise to the ground(s) for termination.</w:t>
             </w:r>
           </w:p>
         </w:tc>
@@ -10972,15 +10805,348 @@
                 <w:sz w:val="18"/>
                 <w:szCs w:val="18"/>
               </w:rPr>
-              <w:t xml:space="preserve">[5.5.3]</w:t>
-            </w:r>
-            <w:r>
-              <w:rPr>
-                <w:rFonts w:asciiTheme="majorHAnsi" w:hAnsiTheme="majorHAnsi" w:cstheme="majorHAnsi"/>
-                <w:sz w:val="18"/>
-                <w:szCs w:val="18"/>
-              </w:rPr>
-              <w:t xml:space="preserve"> Each agreement should be tailored to address issues arising from country risks and potential obstacles in exercising oversight and management of the outsourcing arrangements made with a service provider outside Singapore14.</w:t>
+              <w:t xml:space="preserve">[4.1.3]</w:t>
+            </w:r>
+            <w:r>
+              <w:rPr>
+                <w:rFonts w:asciiTheme="majorHAnsi" w:hAnsiTheme="majorHAnsi" w:cstheme="majorHAnsi"/>
+                <w:sz w:val="18"/>
+                <w:szCs w:val="18"/>
+              </w:rPr>
+              <w:t xml:space="preserve"> MAS may require an institution to </w:t>
+            </w:r>
+            <w:r>
+              <w:rPr>
+                <w:rFonts w:asciiTheme="majorHAnsi" w:hAnsiTheme="majorHAnsi" w:cstheme="majorHAnsi"/>
+                <w:highlight w:val="yellow"/>
+                <w:sz w:val="18"/>
+                <w:szCs w:val="18"/>
+              </w:rPr>
+              <w:t xml:space="preserve">modify, make alternative arrangements or re-integrate an outsourced service into the institution</w:t>
+            </w:r>
+            <w:r>
+              <w:rPr>
+                <w:rFonts w:asciiTheme="majorHAnsi" w:hAnsiTheme="majorHAnsi" w:cstheme="majorHAnsi"/>
+                <w:sz w:val="18"/>
+                <w:szCs w:val="18"/>
+              </w:rPr>
+              <w:t xml:space="preserve"> where one of the following circumstances arises: (a) An institution fails or is unable to demonstrate a satisfactory level of understanding of the nature and extent of risk arising from the outsourcing arrangement; (b) An institution fails or is unable to implement adequate measures to address the risks arising from its outsourcing arrangements in a satisfactory and timely manner; (c) Adverse developments arise from the outsourcing arrangement that could impact an institution; </w:t>
+            </w:r>
+            <w:r>
+              <w:rPr>
+                <w:rFonts w:asciiTheme="majorHAnsi" w:hAnsiTheme="majorHAnsi" w:cstheme="majorHAnsi"/>
+                <w:highlight w:val="yellow"/>
+                <w:sz w:val="18"/>
+                <w:szCs w:val="18"/>
+              </w:rPr>
+              <w:t xml:space="preserve">(d) MAS’ supervisory powers over the institution and ability to carry out MAS’ supervisory functions in respect of the institution’s services are hindered;</w:t>
+            </w:r>
+            <w:r>
+              <w:rPr>
+                <w:rFonts w:asciiTheme="majorHAnsi" w:hAnsiTheme="majorHAnsi" w:cstheme="majorHAnsi"/>
+                <w:sz w:val="18"/>
+                <w:szCs w:val="18"/>
+              </w:rPr>
+              <w:t xml:space="preserve"> or </w:t>
+            </w:r>
+            <w:r>
+              <w:rPr>
+                <w:rFonts w:asciiTheme="majorHAnsi" w:hAnsiTheme="majorHAnsi" w:cstheme="majorHAnsi"/>
+                <w:highlight w:val="yellow"/>
+                <w:sz w:val="18"/>
+                <w:szCs w:val="18"/>
+              </w:rPr>
+              <w:t xml:space="preserve">(e) The security and confidentiality of the institution’s customer information is lowered due to changes in the control environment of the service provider.</w:t>
+            </w:r>
+          </w:p>
+        </w:tc>
+        <w:tc>
+          <w:tcPr>
+            <w:tcW w:w="2189" w:type="dxa"/>
+          </w:tcPr>
+          <w:p>
+            <w:pPr>
+              <w:pStyle w:val="BodyText"/>
+              <w:rPr>
+                <w:rFonts w:asciiTheme="majorHAnsi" w:hAnsiTheme="majorHAnsi" w:cstheme="majorHAnsi"/>
+                <w:sz w:val="18"/>
+                <w:szCs w:val="18"/>
+              </w:rPr>
+            </w:pPr>
+            <w:r>
+              <w:rPr>
+                <w:rFonts w:asciiTheme="majorHAnsi" w:hAnsiTheme="majorHAnsi" w:cstheme="majorHAnsi"/>
+                <w:sz w:val="18"/>
+                <w:szCs w:val="18"/>
+              </w:rPr>
+              <w:t xml:space="preserve">Closest counterpart is 4.1.3 of the FI Guidelines: MAS may require an institution to modify, make alternative arrangements or re-integrate an outsourced service where (a) the institution fails to demonstrate a satisfactory understanding of the risks; (b) it fails to implement adequate measures in a satisfactory and timely manner; (c) adverse developments arise; (d) MAS’ supervisory powers or functions are hindered; or (e) the security and confidentiality of customer information is lowered due to changes in the service provider’s control environment.</w:t>
+            </w:r>
+          </w:p>
+          <w:p>
+            <w:pPr>
+              <w:pStyle w:val="BodyText"/>
+              <w:rPr>
+                <w:rFonts w:asciiTheme="majorHAnsi" w:hAnsiTheme="majorHAnsi" w:cstheme="majorHAnsi"/>
+                <w:sz w:val="18"/>
+                <w:szCs w:val="18"/>
+              </w:rPr>
+            </w:pPr>
+            <w:r>
+              <w:rPr>
+                <w:rFonts w:asciiTheme="majorHAnsi" w:hAnsiTheme="majorHAnsi" w:cstheme="majorHAnsi"/>
+                <w:sz w:val="18"/>
+                <w:szCs w:val="18"/>
+              </w:rPr>
+              <w:t xml:space="preserve">The FI Guidelines do not provide for MAS-directed termination, the audit-obstruction grounds (section 47A(10) of the Banking Act), or the last-resort assurance in footnote 15.</w:t>
+            </w:r>
+          </w:p>
+        </w:tc>
+      </w:tr>
+      <w:tr>
+        <w:tc>
+          <w:tcPr>
+            <w:tcW w:w="625" w:type="dxa"/>
+          </w:tcPr>
+          <w:p>
+            <w:pPr>
+              <w:pStyle w:val="BodyText"/>
+              <w:rPr>
+                <w:rFonts w:asciiTheme="majorHAnsi" w:hAnsiTheme="majorHAnsi" w:cstheme="majorHAnsi"/>
+                <w:sz w:val="18"/>
+                <w:szCs w:val="18"/>
+              </w:rPr>
+            </w:pPr>
+            <w:r>
+              <w:rPr>
+                <w:rFonts w:asciiTheme="majorHAnsi" w:hAnsiTheme="majorHAnsi" w:cstheme="majorHAnsi"/>
+                <w:sz w:val="18"/>
+                <w:szCs w:val="18"/>
+              </w:rPr>
+              <w:t xml:space="preserve">3.4.6</w:t>
+            </w:r>
+          </w:p>
+        </w:tc>
+        <w:tc>
+          <w:tcPr>
+            <w:tcW w:w="5670" w:type="dxa"/>
+          </w:tcPr>
+          <w:p>
+            <w:pPr>
+              <w:pStyle w:val="BodyText"/>
+              <w:rPr>
+                <w:rFonts w:asciiTheme="majorHAnsi" w:hAnsiTheme="majorHAnsi" w:cstheme="majorHAnsi"/>
+                <w:sz w:val="18"/>
+                <w:szCs w:val="18"/>
+              </w:rPr>
+            </w:pPr>
+            <w:r>
+              <w:rPr>
+                <w:rFonts w:asciiTheme="majorHAnsi" w:hAnsiTheme="majorHAnsi" w:cstheme="majorHAnsi"/>
+                <w:sz w:val="18"/>
+                <w:szCs w:val="18"/>
+              </w:rPr>
+              <w:t xml:space="preserve">MAS will endeavour to provide the Bank reasonable notice of MAS’ intent to direct the Bank to terminate its outsourcing arrangement(s).</w:t>
+            </w:r>
+          </w:p>
+        </w:tc>
+        <w:tc>
+          <w:tcPr>
+            <w:tcW w:w="5731" w:type="dxa"/>
+          </w:tcPr>
+          <w:p>
+            <w:pPr>
+              <w:pStyle w:val="BodyText"/>
+              <w:rPr>
+                <w:rFonts w:asciiTheme="majorHAnsi" w:hAnsiTheme="majorHAnsi" w:cstheme="majorHAnsi"/>
+                <w:sz w:val="18"/>
+                <w:szCs w:val="18"/>
+              </w:rPr>
+            </w:pPr>
+            <w:r>
+              <w:rPr>
+                <w:rFonts w:asciiTheme="majorHAnsi" w:hAnsiTheme="majorHAnsi" w:cstheme="majorHAnsi"/>
+                <w:i/>
+                <w:iCs/>
+                <w:sz w:val="18"/>
+                <w:szCs w:val="18"/>
+              </w:rPr>
+              <w:t xml:space="preserve">No provision here under FI Guidelines.</w:t>
+            </w:r>
+          </w:p>
+        </w:tc>
+        <w:tc>
+          <w:tcPr>
+            <w:tcW w:w="2189" w:type="dxa"/>
+          </w:tcPr>
+          <w:p>
+            <w:pPr>
+              <w:pStyle w:val="BodyText"/>
+              <w:rPr>
+                <w:rFonts w:asciiTheme="majorHAnsi" w:hAnsiTheme="majorHAnsi" w:cstheme="majorHAnsi"/>
+                <w:sz w:val="18"/>
+                <w:szCs w:val="18"/>
+              </w:rPr>
+            </w:pPr>
+            <w:r>
+              <w:rPr>
+                <w:rFonts w:asciiTheme="majorHAnsi" w:hAnsiTheme="majorHAnsi" w:cstheme="majorHAnsi"/>
+                <w:sz w:val="18"/>
+                <w:szCs w:val="18"/>
+              </w:rPr>
+              <w:t xml:space="preserve">No equivalent under the FI Guidelines. No reasonable-notice assurance attaches to the powers in 4.1.3 of the FI Guidelines.</w:t>
+            </w:r>
+          </w:p>
+        </w:tc>
+      </w:tr>
+      <w:tr>
+        <w:tc>
+          <w:tcPr>
+            <w:tcW w:w="625" w:type="dxa"/>
+          </w:tcPr>
+          <w:p>
+            <w:pPr>
+              <w:pStyle w:val="BodyText"/>
+              <w:rPr>
+                <w:rFonts w:asciiTheme="majorHAnsi" w:hAnsiTheme="majorHAnsi" w:cstheme="majorHAnsi"/>
+                <w:sz w:val="18"/>
+                <w:szCs w:val="18"/>
+              </w:rPr>
+            </w:pPr>
+            <w:r>
+              <w:rPr>
+                <w:rFonts w:asciiTheme="majorHAnsi" w:hAnsiTheme="majorHAnsi" w:cstheme="majorHAnsi"/>
+                <w:sz w:val="18"/>
+                <w:szCs w:val="18"/>
+              </w:rPr>
+              <w:t xml:space="preserve">3.4.7</w:t>
+            </w:r>
+          </w:p>
+        </w:tc>
+        <w:tc>
+          <w:tcPr>
+            <w:tcW w:w="5670" w:type="dxa"/>
+          </w:tcPr>
+          <w:p>
+            <w:pPr>
+              <w:pStyle w:val="BodyText"/>
+              <w:rPr>
+                <w:rFonts w:asciiTheme="majorHAnsi" w:hAnsiTheme="majorHAnsi" w:cstheme="majorHAnsi"/>
+                <w:sz w:val="18"/>
+                <w:szCs w:val="18"/>
+              </w:rPr>
+            </w:pPr>
+            <w:r>
+              <w:rPr>
+                <w:rFonts w:asciiTheme="majorHAnsi" w:hAnsiTheme="majorHAnsi" w:cstheme="majorHAnsi"/>
+                <w:highlight w:val="yellow"/>
+                <w:sz w:val="18"/>
+                <w:szCs w:val="18"/>
+              </w:rPr>
+              <w:t xml:space="preserve">To better protect its information, a Bank should endeavour for the requirement in paragraph 7.1(f) of the Notices on deleting, destroying or rendering unusable information upon termination to go beyond the minimally required customer information to also include non-customer information given to the service provider, except for situations where the Bank assesses that the service provider has legitimate reason(s) to retain non-customer information.</w:t>
+            </w:r>
+            <w:r>
+              <w:rPr>
+                <w:rFonts w:asciiTheme="majorHAnsi" w:hAnsiTheme="majorHAnsi" w:cstheme="majorHAnsi"/>
+                <w:sz w:val="18"/>
+                <w:szCs w:val="18"/>
+              </w:rPr>
+              <w:t xml:space="preserve"> The Bank should also ensure the minimum period to execute a termination provision is specified in the outsourcing agreement.</w:t>
+            </w:r>
+          </w:p>
+        </w:tc>
+        <w:tc>
+          <w:tcPr>
+            <w:tcW w:w="5731" w:type="dxa"/>
+          </w:tcPr>
+          <w:p>
+            <w:pPr>
+              <w:pStyle w:val="BodyText"/>
+              <w:rPr>
+                <w:rFonts w:asciiTheme="majorHAnsi" w:hAnsiTheme="majorHAnsi" w:cstheme="majorHAnsi"/>
+                <w:sz w:val="18"/>
+                <w:szCs w:val="18"/>
+              </w:rPr>
+            </w:pPr>
+            <w:r>
+              <w:rPr>
+                <w:rFonts w:asciiTheme="majorHAnsi" w:hAnsiTheme="majorHAnsi" w:cstheme="majorHAnsi"/>
+                <w:i/>
+                <w:iCs/>
+                <w:sz w:val="18"/>
+                <w:szCs w:val="18"/>
+              </w:rPr>
+              <w:t xml:space="preserve">No provision here under FI Guidelines.</w:t>
+            </w:r>
+          </w:p>
+        </w:tc>
+        <w:tc>
+          <w:tcPr>
+            <w:tcW w:w="2189" w:type="dxa"/>
+          </w:tcPr>
+          <w:p>
+            <w:pPr>
+              <w:pStyle w:val="BodyText"/>
+              <w:rPr>
+                <w:rFonts w:asciiTheme="majorHAnsi" w:hAnsiTheme="majorHAnsi" w:cstheme="majorHAnsi"/>
+                <w:sz w:val="18"/>
+                <w:szCs w:val="18"/>
+              </w:rPr>
+            </w:pPr>
+            <w:r>
+              <w:rPr>
+                <w:rFonts w:asciiTheme="majorHAnsi" w:hAnsiTheme="majorHAnsi" w:cstheme="majorHAnsi"/>
+                <w:sz w:val="18"/>
+                <w:szCs w:val="18"/>
+              </w:rPr>
+              <w:t xml:space="preserve">No equivalent under the FI Guidelines. The only FI deletion expectation is the business continuity provision in 5.7.2(c) (which corresponds to 3.7.2(c) of the Bank Guidelines).</w:t>
+            </w:r>
+          </w:p>
+        </w:tc>
+      </w:tr>
+      <w:tr>
+        <w:tc>
+          <w:tcPr>
+            <w:tcW w:w="625" w:type="dxa"/>
+          </w:tcPr>
+          <w:p>
+            <w:pPr>
+              <w:pStyle w:val="BodyText"/>
+              <w:rPr>
+                <w:rFonts w:asciiTheme="majorHAnsi" w:hAnsiTheme="majorHAnsi" w:cstheme="majorHAnsi"/>
+                <w:sz w:val="18"/>
+                <w:szCs w:val="18"/>
+              </w:rPr>
+            </w:pPr>
+            <w:r>
+              <w:rPr>
+                <w:rFonts w:asciiTheme="majorHAnsi" w:hAnsiTheme="majorHAnsi" w:cstheme="majorHAnsi"/>
+                <w:sz w:val="18"/>
+                <w:szCs w:val="18"/>
+              </w:rPr>
+              <w:t xml:space="preserve">3.4.8</w:t>
+            </w:r>
+          </w:p>
+        </w:tc>
+        <w:tc>
+          <w:tcPr>
+            <w:tcW w:w="5670" w:type="dxa"/>
+          </w:tcPr>
+          <w:p>
+            <w:pPr>
+              <w:pStyle w:val="BodyText"/>
+              <w:rPr>
+                <w:rFonts w:asciiTheme="majorHAnsi" w:hAnsiTheme="majorHAnsi" w:cstheme="majorHAnsi"/>
+                <w:sz w:val="18"/>
+                <w:szCs w:val="18"/>
+              </w:rPr>
+            </w:pPr>
+            <w:r>
+              <w:rPr>
+                <w:rFonts w:asciiTheme="majorHAnsi" w:hAnsiTheme="majorHAnsi" w:cstheme="majorHAnsi"/>
+                <w:sz w:val="18"/>
+                <w:szCs w:val="18"/>
+              </w:rPr>
+              <w:t xml:space="preserve">Each agreement should be tailored to address issues arising from country risks and potential obstacles in exercising oversight and management of the outsourcing arrangements made with a service provider outside Singapore16.</w:t>
             </w:r>
           </w:p>
           <w:p>
@@ -10999,6 +11165,65 @@
                 <w:szCs w:val="16"/>
                 <w:vertAlign w:val="superscript"/>
               </w:rPr>
+              <w:t xml:space="preserve">16</w:t>
+            </w:r>
+            <w:r>
+              <w:rPr>
+                <w:rFonts w:asciiTheme="majorHAnsi" w:hAnsiTheme="majorHAnsi" w:cstheme="majorHAnsi"/>
+                <w:sz w:val="16"/>
+                <w:szCs w:val="16"/>
+              </w:rPr>
+              <w:t xml:space="preserve"> – Refer to paragraph 3.10.</w:t>
+            </w:r>
+          </w:p>
+        </w:tc>
+        <w:tc>
+          <w:tcPr>
+            <w:tcW w:w="5731" w:type="dxa"/>
+          </w:tcPr>
+          <w:p>
+            <w:pPr>
+              <w:pStyle w:val="BodyText"/>
+              <w:rPr>
+                <w:rFonts w:asciiTheme="majorHAnsi" w:hAnsiTheme="majorHAnsi" w:cstheme="majorHAnsi"/>
+                <w:sz w:val="18"/>
+                <w:szCs w:val="18"/>
+              </w:rPr>
+            </w:pPr>
+            <w:r>
+              <w:rPr>
+                <w:rFonts w:asciiTheme="majorHAnsi" w:hAnsiTheme="majorHAnsi" w:cstheme="majorHAnsi"/>
+                <w:highlight w:val="yellow"/>
+                <w:sz w:val="18"/>
+                <w:szCs w:val="18"/>
+              </w:rPr>
+              <w:t xml:space="preserve">[5.5.3]</w:t>
+            </w:r>
+            <w:r>
+              <w:rPr>
+                <w:rFonts w:asciiTheme="majorHAnsi" w:hAnsiTheme="majorHAnsi" w:cstheme="majorHAnsi"/>
+                <w:sz w:val="18"/>
+                <w:szCs w:val="18"/>
+              </w:rPr>
+              <w:t xml:space="preserve"> Each agreement should be tailored to address issues arising from country risks and potential obstacles in exercising oversight and management of the outsourcing arrangements made with a service provider outside Singapore14.</w:t>
+            </w:r>
+          </w:p>
+          <w:p>
+            <w:pPr>
+              <w:pStyle w:val="BodyText"/>
+              <w:rPr>
+                <w:rFonts w:asciiTheme="majorHAnsi" w:hAnsiTheme="majorHAnsi" w:cstheme="majorHAnsi"/>
+                <w:sz w:val="16"/>
+                <w:szCs w:val="16"/>
+              </w:rPr>
+            </w:pPr>
+            <w:r>
+              <w:rPr>
+                <w:rFonts w:asciiTheme="majorHAnsi" w:hAnsiTheme="majorHAnsi" w:cstheme="majorHAnsi"/>
+                <w:sz w:val="16"/>
+                <w:szCs w:val="16"/>
+                <w:vertAlign w:val="superscript"/>
+              </w:rPr>
               <w:t xml:space="preserve">14</w:t>
             </w:r>
             <w:r>
@@ -13201,7 +13426,7 @@
                 <w:sz w:val="18"/>
                 <w:szCs w:val="18"/>
               </w:rPr>
-              <w:t xml:space="preserve">1. The FI Guidelines add item (d): periodic reviews of all material outsourcing arrangements at least annually. There is no Bank counterpart; Banks’ periodic-review obligations arise under the Notices (see 3.3.6 above).</w:t>
+              <w:t xml:space="preserve">1. The FI Guidelines add item (d): periodic reviews of all material outsourcing arrangements at least annually. The Bank Guidelines require periodic reviews at Annex 1(3), but set no fixed annual minimum.</w:t>
             </w:r>
           </w:p>
           <w:p>
@@ -15763,7 +15988,7 @@
                 <w:sz w:val="18"/>
                 <w:szCs w:val="18"/>
               </w:rPr>
-              <w:t xml:space="preserve">Annex 1</w:t>
+              <w:t xml:space="preserve">Annex 1 ↔ Annex 3</w:t>
             </w:r>
           </w:p>
         </w:tc>
@@ -15810,7 +16035,15 @@
                 <w:sz w:val="18"/>
                 <w:szCs w:val="18"/>
               </w:rPr>
-              <w:t xml:space="preserve">1. Services wholly provided by Government Technology Agency (GovTech) or agents appointed by GovTech. The full list of services can be found at https://api.singpass.gov.sg/singpass-api-products. 2. Services that are not for the conduct of any financial business of the institution and where the service provider does not receive, handle or have access to the institution’s confidential information or customer information. Examples of such services include cleaning, gardening and pantry services including the maintenance of vending machines.</w:t>
+              <w:t xml:space="preserve">[FI Annex 3]</w:t>
+            </w:r>
+            <w:r>
+              <w:rPr>
+                <w:rFonts w:asciiTheme="majorHAnsi" w:hAnsiTheme="majorHAnsi" w:cstheme="majorHAnsi"/>
+                <w:sz w:val="18"/>
+                <w:szCs w:val="18"/>
+              </w:rPr>
+              <w:t xml:space="preserve"> Worded identically to Bank Annex 1 (Material Outsourcing), with “institution” for “Bank”.</w:t>
             </w:r>
           </w:p>
         </w:tc>
@@ -15833,25 +16066,7 @@
                 <w:sz w:val="18"/>
                 <w:szCs w:val="18"/>
               </w:rPr>
-              <w:t xml:space="preserve">Annex 1 of the Bank Guidelines (Material Outsourcing) is found in Annex 3 of the FI Guidelines, worded identically.</w:t>
-            </w:r>
-          </w:p>
-          <w:p>
-            <w:pPr>
-              <w:pStyle w:val="BodyText"/>
-              <w:rPr>
-                <w:rFonts w:asciiTheme="majorHAnsi" w:hAnsiTheme="majorHAnsi" w:cstheme="majorHAnsi"/>
-                <w:sz w:val="18"/>
-                <w:szCs w:val="18"/>
-              </w:rPr>
-            </w:pPr>
-            <w:r>
-              <w:rPr>
-                <w:rFonts w:asciiTheme="majorHAnsi" w:hAnsiTheme="majorHAnsi" w:cstheme="majorHAnsi"/>
-                <w:sz w:val="18"/>
-                <w:szCs w:val="18"/>
-              </w:rPr>
-              <w:t xml:space="preserve">Annex 1 of the FI Guidelines (Exempted Outsourced Services) has no counterpart in the Bank Guidelines; the Bank exemption list is Annex D of the Notices.</w:t>
+              <w:t xml:space="preserve">Materiality. Bank Annex 1 corresponds to FI Annex 3, worded identically.</w:t>
             </w:r>
           </w:p>
         </w:tc>
@@ -15876,7 +16091,7 @@
                 <w:sz w:val="18"/>
                 <w:szCs w:val="18"/>
               </w:rPr>
-              <w:t xml:space="preserve">Annex 2</w:t>
+              <w:t xml:space="preserve">Annex 2 ↔ Annex 5</w:t>
             </w:r>
           </w:p>
         </w:tc>
@@ -16011,26 +16226,15 @@
                 <w:sz w:val="18"/>
                 <w:szCs w:val="18"/>
               </w:rPr>
-              <w:t xml:space="preserve">1. The following are examples of some services that, when performed by a third party, would be regarded as outsourcing arrangements for the purposes of these Guidelines although they are not exhaustive: (a) application processing (e.g. loan origination, credit cards); (b) white-labelling arrangements such as for trading and hedging facilities; (c) middle and back office operations (e.g. electronic funds transfer, payroll processing, custody operations, quality control, purchasing, maintaining the register of participants of a collective investment scheme (CIS) and sending of accounts and reports to CIS participants, order processing, trade settlement and risk management); (d) business continuity and disaster recovery functions and activities; (e) claims administration (e.g. loan negotiations, loan processing, collateral management, collection of bad loans); (f) document processing (e.g. cheques, credit card and bill payments, bank statements, other corporate payments, customer statement printing); (g) information systems hosting (e.g. software-as-a-service, platform-as-a-service, infrastructure-as-a-service); (h) information systems management and maintenance (e.g. data entry and processing, data centres, data centre facilities management, end-user support, local area networks management, help desks, information technology security operations); (i) investment management (e.g. discretionary portfolio management, cash management); (j) management of policy issuance and claims operations by managing agents; (k) manpower management (e.g. benefits and compensation administration, staff appointment, training and development); (l) marketing and research (e.g. product development, data warehousing and mining, media relations, call centres, telemarketing); (m) professional services related to the business activities of the institution (e.g. accounting, internal audit, actuarial, compliance); (n) support services related to archival, storage and destruction of data and records; and (o) calculation of financial benchmarks.</w:t>
-            </w:r>
-          </w:p>
-          <w:p>
-            <w:pPr>
-              <w:pStyle w:val="BodyText"/>
-              <w:rPr>
-                <w:rFonts w:asciiTheme="majorHAnsi" w:hAnsiTheme="majorHAnsi" w:cstheme="majorHAnsi"/>
-                <w:sz w:val="18"/>
-                <w:szCs w:val="18"/>
-              </w:rPr>
-            </w:pPr>
-            <w:r>
-              <w:rPr>
-                <w:rFonts w:asciiTheme="majorHAnsi" w:hAnsiTheme="majorHAnsi" w:cstheme="majorHAnsi"/>
-                <w:highlight w:val="yellow"/>
-                <w:sz w:val="18"/>
-                <w:szCs w:val="18"/>
-              </w:rPr>
-              <w:t xml:space="preserve">2. The following arrangements would generally not be considered outsourcing arrangements: (a) Arrangements in which certain industry characteristics require the use of third-party providers — (i) maintenance of custody account with specified custodians as required under Regulation 27 of the Securities and Futures (Licensing and Conduct of Business) Regulations; (ii) telecommunication services and public utilities (e.g. electricity, SMS gateway services); (iii) postal services; (iv) market information services (e.g. Bloomberg, Moody’s, Standard &amp; Poor’s); (v) common network infrastructure (e.g. Visa, MasterCard, MEPS+); (vi) clearing and settlement arrangements between clearing houses and settlement institutions and their members, and similar arrangements between members and non-members; (vii) global financial messaging infrastructure which are subject to oversight by relevant regulators (e.g. SWIFT); and (viii) correspondent banking services. (b) Introducer arrangements and arrangements that pertain to principal-agent relationships — (i) sale of insurance policies by agents, and ancillary services relating to those sales; (ii) acceptance of business by underwriting agents; and (iii) introducer arrangements (where the institution does not have any contractual relationship with customers). (c) Arrangements that the institution is not legally or administratively able to provide — (i) statutory audit and independent audit assessments; (ii) discrete advisory services (e.g. legal opinions, independent appraisals, trustees in bankruptcy, loss adjuster); and independent consulting (e.g. consultancy services for areas which the institution does not have the internal expertise to conduct)</w:t>
+              <w:t xml:space="preserve">[FI Annex 5]</w:t>
+            </w:r>
+            <w:r>
+              <w:rPr>
+                <w:rFonts w:asciiTheme="majorHAnsi" w:hAnsiTheme="majorHAnsi" w:cstheme="majorHAnsi"/>
+                <w:sz w:val="18"/>
+                <w:szCs w:val="18"/>
+              </w:rPr>
+              <w:t xml:space="preserve"> Worded identically to Bank Annex 2 (Cloud Computing), with “institutions” for “Banks”.</w:t>
             </w:r>
           </w:p>
         </w:tc>
@@ -16053,25 +16257,7 @@
                 <w:sz w:val="18"/>
                 <w:szCs w:val="18"/>
               </w:rPr>
-              <w:t xml:space="preserve">Annex 2 of the Bank Guidelines (Cloud Computing) is found in Annex 5 of the FI Guidelines, worded identically.</w:t>
-            </w:r>
-          </w:p>
-          <w:p>
-            <w:pPr>
-              <w:pStyle w:val="BodyText"/>
-              <w:rPr>
-                <w:rFonts w:asciiTheme="majorHAnsi" w:hAnsiTheme="majorHAnsi" w:cstheme="majorHAnsi"/>
-                <w:sz w:val="18"/>
-                <w:szCs w:val="18"/>
-              </w:rPr>
-            </w:pPr>
-            <w:r>
-              <w:rPr>
-                <w:rFonts w:asciiTheme="majorHAnsi" w:hAnsiTheme="majorHAnsi" w:cstheme="majorHAnsi"/>
-                <w:sz w:val="18"/>
-                <w:szCs w:val="18"/>
-              </w:rPr>
-              <w:t xml:space="preserve">Annex 2 of the FI Guidelines (Examples of Outsourcing Arrangements) has no counterpart in the Bank Guidelines; for Banks the equivalent lists appear, in binding form, as Annexes A, B and C of Notice 658.</w:t>
+              <w:t xml:space="preserve">Cloud computing. Bank Annex 2 corresponds to FI Annex 5, worded identically.</w:t>
             </w:r>
           </w:p>
         </w:tc>
@@ -16096,7 +16282,7 @@
                 <w:sz w:val="18"/>
                 <w:szCs w:val="18"/>
               </w:rPr>
-              <w:t xml:space="preserve">Annex 3</w:t>
+              <w:t xml:space="preserve">Annex 3 (Bank)</w:t>
             </w:r>
           </w:p>
         </w:tc>
@@ -16130,6 +16316,396 @@
               </w:rPr>
               <w:t xml:space="preserve">1. Non-Outsourced Relevant Services — not subject to Notices and Guidelines; should still be subject to adequate risk management and sound internal controls. 2. Non-Ongoing ORS — not subject to Notices and Guidelines except where the ORS involves disclosure of customer information, in which case Section C of the Notices and the outsourcing-register requirement apply; still subject to adequate risk management and sound internal controls. 3. Non-material Ongoing ORS — subject to the register requirement in the Notices, and Section C where customer information is disclosed; the Bank should implement the Guidelines commensurate with the nature of risks. 4. Material Ongoing ORS (MOORS) — subject to the Notices and the Guidelines.</w:t>
             </w:r>
+          </w:p>
+        </w:tc>
+        <w:tc>
+          <w:tcPr>
+            <w:tcW w:w="5731" w:type="dxa"/>
+          </w:tcPr>
+          <w:p>
+            <w:pPr>
+              <w:pStyle w:val="BodyText"/>
+              <w:rPr>
+                <w:rFonts w:asciiTheme="majorHAnsi" w:hAnsiTheme="majorHAnsi" w:cstheme="majorHAnsi"/>
+                <w:sz w:val="18"/>
+                <w:szCs w:val="18"/>
+              </w:rPr>
+            </w:pPr>
+            <w:r>
+              <w:rPr>
+                <w:rFonts w:asciiTheme="majorHAnsi" w:hAnsiTheme="majorHAnsi" w:cstheme="majorHAnsi"/>
+                <w:i/>
+                <w:iCs/>
+                <w:sz w:val="18"/>
+                <w:szCs w:val="18"/>
+              </w:rPr>
+              <w:t xml:space="preserve">No provision here under the FI Guidelines.</w:t>
+            </w:r>
+          </w:p>
+        </w:tc>
+        <w:tc>
+          <w:tcPr>
+            <w:tcW w:w="2189" w:type="dxa"/>
+          </w:tcPr>
+          <w:p>
+            <w:pPr>
+              <w:pStyle w:val="BodyText"/>
+              <w:rPr>
+                <w:rFonts w:asciiTheme="majorHAnsi" w:hAnsiTheme="majorHAnsi" w:cstheme="majorHAnsi"/>
+                <w:sz w:val="18"/>
+                <w:szCs w:val="18"/>
+              </w:rPr>
+            </w:pPr>
+            <w:r>
+              <w:rPr>
+                <w:rFonts w:asciiTheme="majorHAnsi" w:hAnsiTheme="majorHAnsi" w:cstheme="majorHAnsi"/>
+                <w:sz w:val="18"/>
+                <w:szCs w:val="18"/>
+              </w:rPr>
+              <w:t xml:space="preserve">Applicability of the Notices and Guidelines to categories of relevant services (s 47A(12) Banking Act). No FI counterpart.</w:t>
+            </w:r>
+          </w:p>
+        </w:tc>
+      </w:tr>
+      <w:tr>
+        <w:tc>
+          <w:tcPr>
+            <w:tcW w:w="625" w:type="dxa"/>
+          </w:tcPr>
+          <w:p>
+            <w:pPr>
+              <w:pStyle w:val="BodyText"/>
+              <w:rPr>
+                <w:rFonts w:asciiTheme="majorHAnsi" w:hAnsiTheme="majorHAnsi" w:cstheme="majorHAnsi"/>
+                <w:sz w:val="18"/>
+                <w:szCs w:val="18"/>
+              </w:rPr>
+            </w:pPr>
+            <w:r>
+              <w:rPr>
+                <w:rFonts w:asciiTheme="majorHAnsi" w:hAnsiTheme="majorHAnsi" w:cstheme="majorHAnsi"/>
+                <w:sz w:val="18"/>
+                <w:szCs w:val="18"/>
+              </w:rPr>
+              <w:t xml:space="preserve">Annex 1 (FI)</w:t>
+            </w:r>
+          </w:p>
+        </w:tc>
+        <w:tc>
+          <w:tcPr>
+            <w:tcW w:w="5670" w:type="dxa"/>
+          </w:tcPr>
+          <w:p>
+            <w:pPr>
+              <w:pStyle w:val="BodyText"/>
+              <w:rPr>
+                <w:rFonts w:asciiTheme="majorHAnsi" w:hAnsiTheme="majorHAnsi" w:cstheme="majorHAnsi"/>
+                <w:sz w:val="18"/>
+                <w:szCs w:val="18"/>
+              </w:rPr>
+            </w:pPr>
+            <w:r>
+              <w:rPr>
+                <w:rFonts w:asciiTheme="majorHAnsi" w:hAnsiTheme="majorHAnsi" w:cstheme="majorHAnsi"/>
+                <w:i/>
+                <w:iCs/>
+                <w:sz w:val="18"/>
+                <w:szCs w:val="18"/>
+              </w:rPr>
+              <w:t xml:space="preserve">No provision here under the Bank Guidelines.</w:t>
+            </w:r>
+          </w:p>
+        </w:tc>
+        <w:tc>
+          <w:tcPr>
+            <w:tcW w:w="5731" w:type="dxa"/>
+          </w:tcPr>
+          <w:p>
+            <w:pPr>
+              <w:pStyle w:val="BodyText"/>
+              <w:rPr>
+                <w:rFonts w:asciiTheme="majorHAnsi" w:hAnsiTheme="majorHAnsi" w:cstheme="majorHAnsi"/>
+                <w:sz w:val="18"/>
+                <w:szCs w:val="18"/>
+              </w:rPr>
+            </w:pPr>
+            <w:r>
+              <w:rPr>
+                <w:rFonts w:asciiTheme="majorHAnsi" w:hAnsiTheme="majorHAnsi" w:cstheme="majorHAnsi"/>
+                <w:highlight w:val="yellow"/>
+                <w:sz w:val="18"/>
+                <w:szCs w:val="18"/>
+              </w:rPr>
+              <w:t xml:space="preserve">1. Services wholly provided by Government Technology Agency (GovTech) or agents appointed by GovTech. The full list of services can be found at https://api.singpass.gov.sg/singpass-api-products. 2. Services that are not for the conduct of any financial business of the institution and where the service provider does not receive, handle or have access to the institution’s confidential information or customer information. Examples of such services include cleaning, gardening and pantry services including the maintenance of vending machines.</w:t>
+            </w:r>
+          </w:p>
+        </w:tc>
+        <w:tc>
+          <w:tcPr>
+            <w:tcW w:w="2189" w:type="dxa"/>
+          </w:tcPr>
+          <w:p>
+            <w:pPr>
+              <w:pStyle w:val="BodyText"/>
+              <w:rPr>
+                <w:rFonts w:asciiTheme="majorHAnsi" w:hAnsiTheme="majorHAnsi" w:cstheme="majorHAnsi"/>
+                <w:sz w:val="18"/>
+                <w:szCs w:val="18"/>
+              </w:rPr>
+            </w:pPr>
+            <w:r>
+              <w:rPr>
+                <w:rFonts w:asciiTheme="majorHAnsi" w:hAnsiTheme="majorHAnsi" w:cstheme="majorHAnsi"/>
+                <w:sz w:val="18"/>
+                <w:szCs w:val="18"/>
+              </w:rPr>
+              <w:t xml:space="preserve">Exempted outsourced services. Bank and merchant-bank exemptions are in Annex D of Notice 658/1121.</w:t>
+            </w:r>
+          </w:p>
+        </w:tc>
+      </w:tr>
+      <w:tr>
+        <w:tc>
+          <w:tcPr>
+            <w:tcW w:w="625" w:type="dxa"/>
+          </w:tcPr>
+          <w:p>
+            <w:pPr>
+              <w:pStyle w:val="BodyText"/>
+              <w:rPr>
+                <w:rFonts w:asciiTheme="majorHAnsi" w:hAnsiTheme="majorHAnsi" w:cstheme="majorHAnsi"/>
+                <w:sz w:val="18"/>
+                <w:szCs w:val="18"/>
+              </w:rPr>
+            </w:pPr>
+            <w:r>
+              <w:rPr>
+                <w:rFonts w:asciiTheme="majorHAnsi" w:hAnsiTheme="majorHAnsi" w:cstheme="majorHAnsi"/>
+                <w:sz w:val="18"/>
+                <w:szCs w:val="18"/>
+              </w:rPr>
+              <w:t xml:space="preserve">Annex 2 (FI)</w:t>
+            </w:r>
+          </w:p>
+        </w:tc>
+        <w:tc>
+          <w:tcPr>
+            <w:tcW w:w="5670" w:type="dxa"/>
+          </w:tcPr>
+          <w:p>
+            <w:pPr>
+              <w:pStyle w:val="BodyText"/>
+              <w:rPr>
+                <w:rFonts w:asciiTheme="majorHAnsi" w:hAnsiTheme="majorHAnsi" w:cstheme="majorHAnsi"/>
+                <w:sz w:val="18"/>
+                <w:szCs w:val="18"/>
+              </w:rPr>
+            </w:pPr>
+            <w:r>
+              <w:rPr>
+                <w:rFonts w:asciiTheme="majorHAnsi" w:hAnsiTheme="majorHAnsi" w:cstheme="majorHAnsi"/>
+                <w:i/>
+                <w:iCs/>
+                <w:sz w:val="18"/>
+                <w:szCs w:val="18"/>
+              </w:rPr>
+              <w:t xml:space="preserve">No provision here under the Bank Guidelines.</w:t>
+            </w:r>
+          </w:p>
+        </w:tc>
+        <w:tc>
+          <w:tcPr>
+            <w:tcW w:w="5731" w:type="dxa"/>
+          </w:tcPr>
+          <w:p>
+            <w:pPr>
+              <w:pStyle w:val="BodyText"/>
+              <w:rPr>
+                <w:rFonts w:asciiTheme="majorHAnsi" w:hAnsiTheme="majorHAnsi" w:cstheme="majorHAnsi"/>
+                <w:sz w:val="18"/>
+                <w:szCs w:val="18"/>
+              </w:rPr>
+            </w:pPr>
+            <w:r>
+              <w:rPr>
+                <w:rFonts w:asciiTheme="majorHAnsi" w:hAnsiTheme="majorHAnsi" w:cstheme="majorHAnsi"/>
+                <w:highlight w:val="yellow"/>
+                <w:sz w:val="18"/>
+                <w:szCs w:val="18"/>
+              </w:rPr>
+              <w:t xml:space="preserve">1. The following are examples of some services that, when performed by a third party, would be regarded as outsourcing arrangements for the purposes of these Guidelines although they are not exhaustive: (a) application processing (e.g. loan origination, credit cards); (b) white-labelling arrangements such as for trading and hedging facilities; (c) middle and back office operations (e.g. electronic funds transfer, payroll processing, custody operations, quality control, purchasing, maintaining the register of participants of a collective investment scheme (CIS) and sending of accounts and reports to CIS participants, order processing, trade settlement and risk management); (d) business continuity and disaster recovery functions and activities; (e) claims administration (e.g. loan negotiations, loan processing, collateral management, collection of bad loans); (f) document processing (e.g. cheques, credit card and bill payments, bank statements, other corporate payments, customer statement printing); (g) information systems hosting (e.g. software-as-a-service, platform-as-a-service, infrastructure-as-a-service); (h) information systems management and maintenance (e.g. data entry and processing, data centres, data centre facilities management, end-user support, local area networks management, help desks, information technology security operations); (i) investment management (e.g. discretionary portfolio management, cash management); (j) management of policy issuance and claims operations by managing agents; (k) manpower management (e.g. benefits and compensation administration, staff appointment, training and development); (l) marketing and research (e.g. product development, data warehousing and mining, media relations, call centres, telemarketing); (m) professional services related to the business activities of the institution (e.g. accounting, internal audit, actuarial, compliance); (n) support services related to archival, storage and destruction of data and records; and (o) calculation of financial benchmarks.</w:t>
+            </w:r>
+          </w:p>
+          <w:p>
+            <w:pPr>
+              <w:pStyle w:val="BodyText"/>
+              <w:rPr>
+                <w:rFonts w:asciiTheme="majorHAnsi" w:hAnsiTheme="majorHAnsi" w:cstheme="majorHAnsi"/>
+                <w:sz w:val="18"/>
+                <w:szCs w:val="18"/>
+              </w:rPr>
+            </w:pPr>
+            <w:r>
+              <w:rPr>
+                <w:rFonts w:asciiTheme="majorHAnsi" w:hAnsiTheme="majorHAnsi" w:cstheme="majorHAnsi"/>
+                <w:highlight w:val="yellow"/>
+                <w:sz w:val="18"/>
+                <w:szCs w:val="18"/>
+              </w:rPr>
+              <w:t xml:space="preserve">2. The following arrangements would generally not be considered outsourcing arrangements: (a) Arrangements in which certain industry characteristics require the use of third-party providers — (i) maintenance of custody account with specified custodians as required under Regulation 27 of the Securities and Futures (Licensing and Conduct of Business) Regulations; (ii) telecommunication services and public utilities (e.g. electricity, SMS gateway services); (iii) postal services; (iv) market information services (e.g. Bloomberg, Moody’s, Standard &amp; Poor’s); (v) common network infrastructure (e.g. Visa, MasterCard, MEPS+); (vi) clearing and settlement arrangements between clearing houses and settlement institutions and their members, and similar arrangements between members and non-members; (vii) global financial messaging infrastructure which are subject to oversight by relevant regulators (e.g. SWIFT); and (viii) correspondent banking services. (b) Introducer arrangements and arrangements that pertain to principal-agent relationships — (i) sale of insurance policies by agents, and ancillary services relating to those sales; (ii) acceptance of business by underwriting agents; and (iii) introducer arrangements (where the institution does not have any contractual relationship with customers). (c) Arrangements that the institution is not legally or administratively able to provide — (i) statutory audit and independent audit assessments; (ii) discrete advisory services (e.g. legal opinions, independent appraisals, trustees in bankruptcy, loss adjuster); and independent consulting (e.g. consultancy services for areas which the institution does not have the internal expertise to conduct)</w:t>
+            </w:r>
+          </w:p>
+        </w:tc>
+        <w:tc>
+          <w:tcPr>
+            <w:tcW w:w="2189" w:type="dxa"/>
+          </w:tcPr>
+          <w:p>
+            <w:pPr>
+              <w:pStyle w:val="BodyText"/>
+              <w:rPr>
+                <w:rFonts w:asciiTheme="majorHAnsi" w:hAnsiTheme="majorHAnsi" w:cstheme="majorHAnsi"/>
+                <w:sz w:val="18"/>
+                <w:szCs w:val="18"/>
+              </w:rPr>
+            </w:pPr>
+            <w:r>
+              <w:rPr>
+                <w:rFonts w:asciiTheme="majorHAnsi" w:hAnsiTheme="majorHAnsi" w:cstheme="majorHAnsi"/>
+                <w:sz w:val="18"/>
+                <w:szCs w:val="18"/>
+              </w:rPr>
+              <w:t xml:space="preserve">Examples of outsourcing arrangements. For Banks the equivalent lists are Annexes A–C of Notice 658.</w:t>
+            </w:r>
+          </w:p>
+        </w:tc>
+      </w:tr>
+      <w:tr>
+        <w:tc>
+          <w:tcPr>
+            <w:tcW w:w="625" w:type="dxa"/>
+          </w:tcPr>
+          <w:p>
+            <w:pPr>
+              <w:pStyle w:val="BodyText"/>
+              <w:rPr>
+                <w:rFonts w:asciiTheme="majorHAnsi" w:hAnsiTheme="majorHAnsi" w:cstheme="majorHAnsi"/>
+                <w:sz w:val="18"/>
+                <w:szCs w:val="18"/>
+              </w:rPr>
+            </w:pPr>
+            <w:r>
+              <w:rPr>
+                <w:rFonts w:asciiTheme="majorHAnsi" w:hAnsiTheme="majorHAnsi" w:cstheme="majorHAnsi"/>
+                <w:sz w:val="18"/>
+                <w:szCs w:val="18"/>
+              </w:rPr>
+              <w:t xml:space="preserve">Annex 4 (FI)</w:t>
+            </w:r>
+          </w:p>
+        </w:tc>
+        <w:tc>
+          <w:tcPr>
+            <w:tcW w:w="5670" w:type="dxa"/>
+          </w:tcPr>
+          <w:p>
+            <w:pPr>
+              <w:pStyle w:val="BodyText"/>
+              <w:rPr>
+                <w:rFonts w:asciiTheme="majorHAnsi" w:hAnsiTheme="majorHAnsi" w:cstheme="majorHAnsi"/>
+                <w:sz w:val="18"/>
+                <w:szCs w:val="18"/>
+              </w:rPr>
+            </w:pPr>
+            <w:r>
+              <w:rPr>
+                <w:rFonts w:asciiTheme="majorHAnsi" w:hAnsiTheme="majorHAnsi" w:cstheme="majorHAnsi"/>
+                <w:i/>
+                <w:iCs/>
+                <w:sz w:val="18"/>
+                <w:szCs w:val="18"/>
+              </w:rPr>
+              <w:t xml:space="preserve">No provision here under the Bank Guidelines.</w:t>
+            </w:r>
+          </w:p>
+        </w:tc>
+        <w:tc>
+          <w:tcPr>
+            <w:tcW w:w="5731" w:type="dxa"/>
+          </w:tcPr>
+          <w:p>
+            <w:pPr>
+              <w:pStyle w:val="BodyText"/>
+              <w:rPr>
+                <w:rFonts w:asciiTheme="majorHAnsi" w:hAnsiTheme="majorHAnsi" w:cstheme="majorHAnsi"/>
+                <w:sz w:val="18"/>
+                <w:szCs w:val="18"/>
+              </w:rPr>
+            </w:pPr>
+            <w:r>
+              <w:rPr>
+                <w:rFonts w:asciiTheme="majorHAnsi" w:hAnsiTheme="majorHAnsi" w:cstheme="majorHAnsi"/>
+                <w:highlight w:val="yellow"/>
+                <w:sz w:val="18"/>
+                <w:szCs w:val="18"/>
+              </w:rPr>
+              <w:t xml:space="preserve">1. An institution should maintain an updated register of all existing outsourcing arrangements in the format as per the template available from MAS website.</w:t>
+            </w:r>
+          </w:p>
+        </w:tc>
+        <w:tc>
+          <w:tcPr>
+            <w:tcW w:w="2189" w:type="dxa"/>
+          </w:tcPr>
+          <w:p>
+            <w:pPr>
+              <w:pStyle w:val="BodyText"/>
+              <w:rPr>
+                <w:rFonts w:asciiTheme="majorHAnsi" w:hAnsiTheme="majorHAnsi" w:cstheme="majorHAnsi"/>
+                <w:sz w:val="18"/>
+                <w:szCs w:val="18"/>
+              </w:rPr>
+            </w:pPr>
+            <w:r>
+              <w:rPr>
+                <w:rFonts w:asciiTheme="majorHAnsi" w:hAnsiTheme="majorHAnsi" w:cstheme="majorHAnsi"/>
+                <w:sz w:val="18"/>
+                <w:szCs w:val="18"/>
+              </w:rPr>
+              <w:t xml:space="preserve">Register of outsourcing arrangements. Banks submit registers via the template link at Bank footnote 21.</w:t>
+            </w:r>
+          </w:p>
+        </w:tc>
+      </w:tr>
+      <w:tr>
+        <w:tc>
+          <w:tcPr>
+            <w:tcW w:w="625" w:type="dxa"/>
+          </w:tcPr>
+          <w:p>
+            <w:pPr>
+              <w:pStyle w:val="BodyText"/>
+              <w:rPr>
+                <w:rFonts w:asciiTheme="majorHAnsi" w:hAnsiTheme="majorHAnsi" w:cstheme="majorHAnsi"/>
+                <w:sz w:val="18"/>
+                <w:szCs w:val="18"/>
+              </w:rPr>
+            </w:pPr>
+          </w:p>
+        </w:tc>
+        <w:tc>
+          <w:tcPr>
+            <w:tcW w:w="5670" w:type="dxa"/>
+          </w:tcPr>
+          <w:p>
+            <w:pPr>
+              <w:pStyle w:val="BodyText"/>
+              <w:rPr>
+                <w:rFonts w:asciiTheme="majorHAnsi" w:hAnsiTheme="majorHAnsi" w:cstheme="majorHAnsi"/>
+                <w:sz w:val="18"/>
+                <w:szCs w:val="18"/>
+              </w:rPr>
+            </w:pPr>
           </w:p>
         </w:tc>
         <w:tc>
@@ -16153,7 +16729,7 @@
                 <w:sz w:val="18"/>
                 <w:szCs w:val="18"/>
               </w:rPr>
-              <w:t xml:space="preserve">Material Outsourcing</w:t>
+              <w:t xml:space="preserve">FI provisions without a corresponding Bank Guideline provision in the same form</w:t>
             </w:r>
           </w:p>
         </w:tc>
@@ -16176,25 +16752,7 @@
                 <w:sz w:val="18"/>
                 <w:szCs w:val="18"/>
               </w:rPr>
-              <w:t xml:space="preserve">Annex 3 of the FI Guidelines corresponds verbatim to Annex 1 of the Bank Guidelines (quoted above).</w:t>
-            </w:r>
-          </w:p>
-          <w:p>
-            <w:pPr>
-              <w:pStyle w:val="BodyText"/>
-              <w:rPr>
-                <w:rFonts w:asciiTheme="majorHAnsi" w:hAnsiTheme="majorHAnsi" w:cstheme="majorHAnsi"/>
-                <w:sz w:val="18"/>
-                <w:szCs w:val="18"/>
-              </w:rPr>
-            </w:pPr>
-            <w:r>
-              <w:rPr>
-                <w:rFonts w:asciiTheme="majorHAnsi" w:hAnsiTheme="majorHAnsi" w:cstheme="majorHAnsi"/>
-                <w:sz w:val="18"/>
-                <w:szCs w:val="18"/>
-              </w:rPr>
-              <w:t xml:space="preserve">Annex 3 of the Bank Guidelines (applicability of the Notices and Guidelines to categories of relevant services) has no counterpart in the FI Guidelines; the taxonomy only exists because of the Notices and section 47A of the Banking Act.</w:t>
+              <w:t xml:space="preserve">These provisions of the FI Guidelines have no comparable provision in the Bank Guidelines.</w:t>
             </w:r>
           </w:p>
         </w:tc>
@@ -16219,7 +16777,7 @@
                 <w:sz w:val="18"/>
                 <w:szCs w:val="18"/>
               </w:rPr>
-              <w:t xml:space="preserve">Annex 4</w:t>
+              <w:t xml:space="preserve">1.3</w:t>
             </w:r>
           </w:p>
         </w:tc>
@@ -16268,7 +16826,33 @@
                 <w:sz w:val="18"/>
                 <w:szCs w:val="18"/>
               </w:rPr>
-              <w:t xml:space="preserve">1. An institution should maintain an updated register of all existing outsourcing arrangements in the format as per the template available from MAS website.</w:t>
+              <w:t xml:space="preserve">[1.3]</w:t>
+            </w:r>
+            <w:r>
+              <w:rPr>
+                <w:rFonts w:asciiTheme="majorHAnsi" w:hAnsiTheme="majorHAnsi" w:cstheme="majorHAnsi"/>
+                <w:sz w:val="18"/>
+                <w:szCs w:val="18"/>
+              </w:rPr>
+              <w:t xml:space="preserve"> The relevant expectations for banks and merchant banks are set out in a separate set of guidelines for banks and merchant banks, as that set of guidelines makes reference to definitions in MAS Notices 658 and 1121 that apply only to banks and merchant banks3.</w:t>
+            </w:r>
+          </w:p>
+          <w:p>
+            <w:pPr>
+              <w:pStyle w:val="BodyText"/>
+              <w:rPr>
+                <w:rFonts w:asciiTheme="majorHAnsi" w:hAnsiTheme="majorHAnsi" w:cstheme="majorHAnsi"/>
+                <w:sz w:val="16"/>
+                <w:szCs w:val="16"/>
+              </w:rPr>
+            </w:pPr>
+            <w:r>
+              <w:rPr>
+                <w:rFonts w:asciiTheme="majorHAnsi" w:hAnsiTheme="majorHAnsi" w:cstheme="majorHAnsi"/>
+                <w:sz w:val="16"/>
+                <w:szCs w:val="16"/>
+              </w:rPr>
+              <w:t xml:space="preserve">3 – This refers to the “Guidelines on Outsourcing (Banks)” at this link.</w:t>
             </w:r>
           </w:p>
         </w:tc>
@@ -16291,7 +16875,7 @@
                 <w:sz w:val="18"/>
                 <w:szCs w:val="18"/>
               </w:rPr>
-              <w:t xml:space="preserve">Annex 4 of the FI Guidelines has no counterpart in the Bank Guidelines; Banks submit registers per the template link at footnote 21, with register requirements otherwise in the Notices.</w:t>
+              <w:t xml:space="preserve">Explains why banks and merchant banks are excluded from the FI Guidelines. No Bank Guideline counterpart (FI footnote 3 points readers to the Bank Guidelines).</w:t>
             </w:r>
           </w:p>
         </w:tc>
@@ -16316,7 +16900,7 @@
                 <w:sz w:val="18"/>
                 <w:szCs w:val="18"/>
               </w:rPr>
-              <w:t xml:space="preserve">Annex 5</w:t>
+              <w:t xml:space="preserve">2.3</w:t>
             </w:r>
           </w:p>
         </w:tc>
@@ -16361,12 +16945,19 @@
             <w:r>
               <w:rPr>
                 <w:rFonts w:asciiTheme="majorHAnsi" w:hAnsiTheme="majorHAnsi" w:cstheme="majorHAnsi"/>
-                <w:b/>
-                <w:bCs/>
-                <w:sz w:val="18"/>
-                <w:szCs w:val="18"/>
-              </w:rPr>
-              <w:t xml:space="preserve">Cloud Computing</w:t>
+                <w:sz w:val="18"/>
+                <w:szCs w:val="18"/>
+              </w:rPr>
+              <w:t xml:space="preserve">An institution incorporated in Singapore should also consider the impact of outsourcing arrangements by its branches and any corporation under its control, including those located outside Singapore, on its consolidated operations. </w:t>
+            </w:r>
+            <w:r>
+              <w:rPr>
+                <w:rFonts w:asciiTheme="majorHAnsi" w:hAnsiTheme="majorHAnsi" w:cstheme="majorHAnsi"/>
+                <w:highlight w:val="yellow"/>
+                <w:sz w:val="18"/>
+                <w:szCs w:val="18"/>
+              </w:rPr>
+              <w:t xml:space="preserve">Institutions incorporated in Singapore should ensure that these Guidelines are observed by branches and corporations under their control by applying a group-wide outsourcing risk management framework that complies with the Guidelines.</w:t>
             </w:r>
           </w:p>
         </w:tc>
@@ -16389,7 +16980,7 @@
                 <w:sz w:val="18"/>
                 <w:szCs w:val="18"/>
               </w:rPr>
-              <w:t xml:space="preserve">Annex 5 of the FI Guidelines corresponds verbatim to Annex 2 of the Bank Guidelines (quoted above).</w:t>
+              <w:t xml:space="preserve">Group-wide observance duty. The Bank Guidelines address group arrangements at 3.11.1 and Annex 1, but not in this affirmative form.</w:t>
             </w:r>
           </w:p>
         </w:tc>
@@ -16408,6 +16999,14 @@
                 <w:szCs w:val="18"/>
               </w:rPr>
             </w:pPr>
+            <w:r>
+              <w:rPr>
+                <w:rFonts w:asciiTheme="majorHAnsi" w:hAnsiTheme="majorHAnsi" w:cstheme="majorHAnsi"/>
+                <w:sz w:val="18"/>
+                <w:szCs w:val="18"/>
+              </w:rPr>
+              <w:t xml:space="preserve">5.1.1</w:t>
+            </w:r>
           </w:p>
         </w:tc>
         <w:tc>
@@ -16423,6 +17022,16 @@
                 <w:szCs w:val="18"/>
               </w:rPr>
             </w:pPr>
+            <w:r>
+              <w:rPr>
+                <w:rFonts w:asciiTheme="majorHAnsi" w:hAnsiTheme="majorHAnsi" w:cstheme="majorHAnsi"/>
+                <w:i/>
+                <w:iCs/>
+                <w:sz w:val="18"/>
+                <w:szCs w:val="18"/>
+              </w:rPr>
+              <w:t xml:space="preserve">No provision here under the Bank Guidelines.</w:t>
+            </w:r>
           </w:p>
         </w:tc>
         <w:tc>
@@ -16441,12 +17050,11 @@
             <w:r>
               <w:rPr>
                 <w:rFonts w:asciiTheme="majorHAnsi" w:hAnsiTheme="majorHAnsi" w:cstheme="majorHAnsi"/>
-                <w:b/>
-                <w:bCs/>
-                <w:sz w:val="18"/>
-                <w:szCs w:val="18"/>
-              </w:rPr>
-              <w:t xml:space="preserve">FI Guidelines with no counterpart in the Bank Guidelines</w:t>
+                <w:highlight w:val="yellow"/>
+                <w:sz w:val="18"/>
+                <w:szCs w:val="18"/>
+              </w:rPr>
+              <w:t xml:space="preserve">In supervising an institution, MAS will review its implementation of these Guidelines, the quality of its board and senior management oversight and governance, internal controls and risk management with regard to managing outsourcing risks.</w:t>
             </w:r>
           </w:p>
         </w:tc>
@@ -16469,7 +17077,7 @@
                 <w:sz w:val="18"/>
                 <w:szCs w:val="18"/>
               </w:rPr>
-              <w:t xml:space="preserve">These provisions of the FI Guidelines have no comparable provision in the Bank Guidelines.</w:t>
+              <w:t xml:space="preserve">Supervisory overview; the same idea is folded into Bank 2.1 — there is no separate Bank provision in this form.</w:t>
             </w:r>
           </w:p>
         </w:tc>
@@ -16494,7 +17102,7 @@
                 <w:sz w:val="18"/>
                 <w:szCs w:val="18"/>
               </w:rPr>
-              <w:t xml:space="preserve">2.3</w:t>
+              <w:t xml:space="preserve">Section 3</w:t>
             </w:r>
           </w:p>
         </w:tc>
@@ -16539,19 +17147,19 @@
             <w:r>
               <w:rPr>
                 <w:rFonts w:asciiTheme="majorHAnsi" w:hAnsiTheme="majorHAnsi" w:cstheme="majorHAnsi"/>
-                <w:sz w:val="18"/>
-                <w:szCs w:val="18"/>
-              </w:rPr>
-              <w:t xml:space="preserve">An institution incorporated in Singapore should also consider the impact of outsourcing arrangements by its branches and any corporation under its control, including those located outside Singapore, on its consolidated operations. </w:t>
-            </w:r>
-            <w:r>
-              <w:rPr>
-                <w:rFonts w:asciiTheme="majorHAnsi" w:hAnsiTheme="majorHAnsi" w:cstheme="majorHAnsi"/>
                 <w:highlight w:val="yellow"/>
                 <w:sz w:val="18"/>
                 <w:szCs w:val="18"/>
               </w:rPr>
-              <w:t xml:space="preserve">Institutions incorporated in Singapore should ensure that these Guidelines are observed by branches and corporations under their control by applying a group-wide outsourcing risk management framework that complies with the Guidelines.</w:t>
+              <w:t xml:space="preserve">Definitions</w:t>
+            </w:r>
+            <w:r>
+              <w:rPr>
+                <w:rFonts w:asciiTheme="majorHAnsi" w:hAnsiTheme="majorHAnsi" w:cstheme="majorHAnsi"/>
+                <w:sz w:val="18"/>
+                <w:szCs w:val="18"/>
+              </w:rPr>
+              <w:t xml:space="preserve"> – the FI Guidelines contain a full glossary; the full text appears at row 3.1 above. The Bank Guidelines rely on the definitions in Notices 658 and 1121.</w:t>
             </w:r>
           </w:p>
         </w:tc>
@@ -16574,7 +17182,7 @@
                 <w:sz w:val="18"/>
                 <w:szCs w:val="18"/>
               </w:rPr>
-              <w:t xml:space="preserve">Group-wide observance duty for Singapore-incorporated institutions.</w:t>
+              <w:t xml:space="preserve">No Definitions section in the Bank Guidelines.</w:t>
             </w:r>
           </w:p>
         </w:tc>
@@ -16599,7 +17207,7 @@
                 <w:sz w:val="18"/>
                 <w:szCs w:val="18"/>
               </w:rPr>
-              <w:t xml:space="preserve">5.1.1</w:t>
+              <w:t xml:space="preserve">5.2.5</w:t>
             </w:r>
           </w:p>
         </w:tc>
@@ -16648,7 +17256,15 @@
                 <w:sz w:val="18"/>
                 <w:szCs w:val="18"/>
               </w:rPr>
-              <w:t xml:space="preserve">In supervising an institution, MAS will review its implementation of these Guidelines, the quality of its board and senior management oversight and governance, internal controls and risk management with regard to managing outsourcing risks.</w:t>
+              <w:t xml:space="preserve">For an institution incorporated or established outside Singapore, the functions of the board described in paragraph 5.2.2 may be delegated to and performed by a management committee or body beyond local management that is charged to functionally oversee and supervise the local office (e.g. a regional risk management committee).</w:t>
+            </w:r>
+            <w:r>
+              <w:rPr>
+                <w:rFonts w:asciiTheme="majorHAnsi" w:hAnsiTheme="majorHAnsi" w:cstheme="majorHAnsi"/>
+                <w:sz w:val="18"/>
+                <w:szCs w:val="18"/>
+              </w:rPr>
+              <w:t xml:space="preserve"> (opening sentence)</w:t>
             </w:r>
           </w:p>
         </w:tc>
@@ -16671,7 +17287,7 @@
                 <w:sz w:val="18"/>
                 <w:szCs w:val="18"/>
               </w:rPr>
-              <w:t xml:space="preserve">Supervisory overview; folded into 2.1 of the Bank Guidelines.</w:t>
+              <w:t xml:space="preserve">Delegation of board functions for foreign-incorporated institutions.</w:t>
             </w:r>
           </w:p>
         </w:tc>
@@ -16696,7 +17312,7 @@
                 <w:sz w:val="18"/>
                 <w:szCs w:val="18"/>
               </w:rPr>
-              <w:t xml:space="preserve">Section 3</w:t>
+              <w:t xml:space="preserve">5.8.2(d)</w:t>
             </w:r>
           </w:p>
         </w:tc>
@@ -16745,15 +17361,7 @@
                 <w:sz w:val="18"/>
                 <w:szCs w:val="18"/>
               </w:rPr>
-              <w:t xml:space="preserve">Definitions</w:t>
-            </w:r>
-            <w:r>
-              <w:rPr>
-                <w:rFonts w:asciiTheme="majorHAnsi" w:hAnsiTheme="majorHAnsi" w:cstheme="majorHAnsi"/>
-                <w:sz w:val="18"/>
-                <w:szCs w:val="18"/>
-              </w:rPr>
-              <w:t xml:space="preserve"> – the FI Guidelines contain a full glossary; the full text appears at row 3.1 above. The Bank Guidelines rely on the definitions in Notices 658 and 1121.</w:t>
+              <w:t xml:space="preserve">Periodic reviews, at least on an annual basis, on all material outsourcing arrangements … to ensure that the institution’s outsourcing risk management policies and procedures, and these Guidelines, are effectively implemented …</w:t>
             </w:r>
           </w:p>
         </w:tc>
@@ -16776,7 +17384,7 @@
                 <w:sz w:val="18"/>
                 <w:szCs w:val="18"/>
               </w:rPr>
-              <w:t xml:space="preserve">No Definitions section in the Bank Guidelines.</w:t>
+              <w:t xml:space="preserve">Bank Annex 1(3) requires periodic reviews of outsourcing arrangements but sets no fixed minimum; FI 5.8.2(d) requires periodic reviews of all material outsourcing arrangements at least annually.</w:t>
             </w:r>
           </w:p>
         </w:tc>
@@ -16801,7 +17409,7 @@
                 <w:sz w:val="18"/>
                 <w:szCs w:val="18"/>
               </w:rPr>
-              <w:t xml:space="preserve">5.2.5</w:t>
+              <w:t xml:space="preserve">5.9.2(b)</w:t>
             </w:r>
           </w:p>
         </w:tc>
@@ -16850,15 +17458,7 @@
                 <w:sz w:val="18"/>
                 <w:szCs w:val="18"/>
               </w:rPr>
-              <w:t xml:space="preserve">For an institution incorporated or established outside Singapore, the functions of the board described in paragraph 5.2.2 may be delegated to and performed by a management committee or body beyond local management that is charged to functionally oversee and supervise the local office (e.g. a regional risk management committee).</w:t>
-            </w:r>
-            <w:r>
-              <w:rPr>
-                <w:rFonts w:asciiTheme="majorHAnsi" w:hAnsiTheme="majorHAnsi" w:cstheme="majorHAnsi"/>
-                <w:sz w:val="18"/>
-                <w:szCs w:val="18"/>
-              </w:rPr>
-              <w:t xml:space="preserve"> (opening sentence)</w:t>
+              <w:t xml:space="preserve">allow MAS, or any agent appointed by MAS … to exercise the contractual rights of the institution to access and inspect the service provider and its sub-contractors, and access any report and finding …</w:t>
             </w:r>
           </w:p>
         </w:tc>
@@ -16881,7 +17481,7 @@
                 <w:sz w:val="18"/>
                 <w:szCs w:val="18"/>
               </w:rPr>
-              <w:t xml:space="preserve">Delegation of board functions for foreign-incorporated institutions.</w:t>
+              <w:t xml:space="preserve">Contractual MAS access; for Banks this is statutory (s 47A(10) Banking Act).</w:t>
             </w:r>
           </w:p>
         </w:tc>
@@ -16906,7 +17506,7 @@
                 <w:sz w:val="18"/>
                 <w:szCs w:val="18"/>
               </w:rPr>
-              <w:t xml:space="preserve">5.8.2(d)</w:t>
+              <w:t xml:space="preserve">5.9.3</w:t>
             </w:r>
           </w:p>
         </w:tc>
@@ -16955,7 +17555,7 @@
                 <w:sz w:val="18"/>
                 <w:szCs w:val="18"/>
               </w:rPr>
-              <w:t xml:space="preserve">Periodic reviews, at least on an annual basis, on all material outsourcing arrangements … to ensure that the institution’s outsourcing risk management policies and procedures, and these Guidelines, are effectively implemented …</w:t>
+              <w:t xml:space="preserve">clauses that require the service provider to comply … with any request from MAS or the institution … to submit any reports on the security and control environment … to MAS …</w:t>
             </w:r>
           </w:p>
         </w:tc>
@@ -16978,7 +17578,7 @@
                 <w:sz w:val="18"/>
                 <w:szCs w:val="18"/>
               </w:rPr>
-              <w:t xml:space="preserve">Annual review; periodic-review obligations for Banks are in the Notices.</w:t>
+              <w:t xml:space="preserve">Service provider reports to MAS.</w:t>
             </w:r>
           </w:p>
         </w:tc>
@@ -17003,7 +17603,7 @@
                 <w:sz w:val="18"/>
                 <w:szCs w:val="18"/>
               </w:rPr>
-              <w:t xml:space="preserve">5.9.2(b)</w:t>
+              <w:t xml:space="preserve">5.10.2(b)–(c)</w:t>
             </w:r>
           </w:p>
         </w:tc>
@@ -17052,7 +17652,7 @@
                 <w:sz w:val="18"/>
                 <w:szCs w:val="18"/>
               </w:rPr>
-              <w:t xml:space="preserve">allow MAS, or any agent appointed by MAS … to exercise the contractual rights of the institution to access and inspect the service provider and its sub-contractors, and access any report and finding …</w:t>
+              <w:t xml:space="preserve">written confirmation to MAS that the agreements provide MAS the rights of inspection and access in 5.9; and notification to MAS if an overseas authority seeks access to customer information, or if the access rights of the institution and MAS are restricted or denied.</w:t>
             </w:r>
           </w:p>
         </w:tc>
@@ -17075,511 +17675,7 @@
                 <w:sz w:val="18"/>
                 <w:szCs w:val="18"/>
               </w:rPr>
-              <w:t xml:space="preserve">Contractual MAS access; for Banks this is statutory (s 47A(10) Banking Act).</w:t>
-            </w:r>
-          </w:p>
-        </w:tc>
-      </w:tr>
-      <w:tr>
-        <w:tc>
-          <w:tcPr>
-            <w:tcW w:w="625" w:type="dxa"/>
-          </w:tcPr>
-          <w:p>
-            <w:pPr>
-              <w:pStyle w:val="BodyText"/>
-              <w:rPr>
-                <w:rFonts w:asciiTheme="majorHAnsi" w:hAnsiTheme="majorHAnsi" w:cstheme="majorHAnsi"/>
-                <w:sz w:val="18"/>
-                <w:szCs w:val="18"/>
-              </w:rPr>
-            </w:pPr>
-            <w:r>
-              <w:rPr>
-                <w:rFonts w:asciiTheme="majorHAnsi" w:hAnsiTheme="majorHAnsi" w:cstheme="majorHAnsi"/>
-                <w:sz w:val="18"/>
-                <w:szCs w:val="18"/>
-              </w:rPr>
-              <w:t xml:space="preserve">5.9.3</w:t>
-            </w:r>
-          </w:p>
-        </w:tc>
-        <w:tc>
-          <w:tcPr>
-            <w:tcW w:w="5670" w:type="dxa"/>
-          </w:tcPr>
-          <w:p>
-            <w:pPr>
-              <w:pStyle w:val="BodyText"/>
-              <w:rPr>
-                <w:rFonts w:asciiTheme="majorHAnsi" w:hAnsiTheme="majorHAnsi" w:cstheme="majorHAnsi"/>
-                <w:sz w:val="18"/>
-                <w:szCs w:val="18"/>
-              </w:rPr>
-            </w:pPr>
-            <w:r>
-              <w:rPr>
-                <w:rFonts w:asciiTheme="majorHAnsi" w:hAnsiTheme="majorHAnsi" w:cstheme="majorHAnsi"/>
-                <w:i/>
-                <w:iCs/>
-                <w:sz w:val="18"/>
-                <w:szCs w:val="18"/>
-              </w:rPr>
-              <w:t xml:space="preserve">No provision here under the Bank Guidelines.</w:t>
-            </w:r>
-          </w:p>
-        </w:tc>
-        <w:tc>
-          <w:tcPr>
-            <w:tcW w:w="5731" w:type="dxa"/>
-          </w:tcPr>
-          <w:p>
-            <w:pPr>
-              <w:pStyle w:val="BodyText"/>
-              <w:rPr>
-                <w:rFonts w:asciiTheme="majorHAnsi" w:hAnsiTheme="majorHAnsi" w:cstheme="majorHAnsi"/>
-                <w:sz w:val="18"/>
-                <w:szCs w:val="18"/>
-              </w:rPr>
-            </w:pPr>
-            <w:r>
-              <w:rPr>
-                <w:rFonts w:asciiTheme="majorHAnsi" w:hAnsiTheme="majorHAnsi" w:cstheme="majorHAnsi"/>
-                <w:highlight w:val="yellow"/>
-                <w:sz w:val="18"/>
-                <w:szCs w:val="18"/>
-              </w:rPr>
-              <w:t xml:space="preserve">clauses that require the service provider to comply … with any request from MAS or the institution … to submit any reports on the security and control environment … to MAS …</w:t>
-            </w:r>
-          </w:p>
-        </w:tc>
-        <w:tc>
-          <w:tcPr>
-            <w:tcW w:w="2189" w:type="dxa"/>
-          </w:tcPr>
-          <w:p>
-            <w:pPr>
-              <w:pStyle w:val="BodyText"/>
-              <w:rPr>
-                <w:rFonts w:asciiTheme="majorHAnsi" w:hAnsiTheme="majorHAnsi" w:cstheme="majorHAnsi"/>
-                <w:sz w:val="18"/>
-                <w:szCs w:val="18"/>
-              </w:rPr>
-            </w:pPr>
-            <w:r>
-              <w:rPr>
-                <w:rFonts w:asciiTheme="majorHAnsi" w:hAnsiTheme="majorHAnsi" w:cstheme="majorHAnsi"/>
-                <w:sz w:val="18"/>
-                <w:szCs w:val="18"/>
-              </w:rPr>
-              <w:t xml:space="preserve">Service provider reports to MAS.</w:t>
-            </w:r>
-          </w:p>
-        </w:tc>
-      </w:tr>
-      <w:tr>
-        <w:tc>
-          <w:tcPr>
-            <w:tcW w:w="625" w:type="dxa"/>
-          </w:tcPr>
-          <w:p>
-            <w:pPr>
-              <w:pStyle w:val="BodyText"/>
-              <w:rPr>
-                <w:rFonts w:asciiTheme="majorHAnsi" w:hAnsiTheme="majorHAnsi" w:cstheme="majorHAnsi"/>
-                <w:sz w:val="18"/>
-                <w:szCs w:val="18"/>
-              </w:rPr>
-            </w:pPr>
-            <w:r>
-              <w:rPr>
-                <w:rFonts w:asciiTheme="majorHAnsi" w:hAnsiTheme="majorHAnsi" w:cstheme="majorHAnsi"/>
-                <w:sz w:val="18"/>
-                <w:szCs w:val="18"/>
-              </w:rPr>
-              <w:t xml:space="preserve">5.10.2(b)–(c)</w:t>
-            </w:r>
-          </w:p>
-        </w:tc>
-        <w:tc>
-          <w:tcPr>
-            <w:tcW w:w="5670" w:type="dxa"/>
-          </w:tcPr>
-          <w:p>
-            <w:pPr>
-              <w:pStyle w:val="BodyText"/>
-              <w:rPr>
-                <w:rFonts w:asciiTheme="majorHAnsi" w:hAnsiTheme="majorHAnsi" w:cstheme="majorHAnsi"/>
-                <w:sz w:val="18"/>
-                <w:szCs w:val="18"/>
-              </w:rPr>
-            </w:pPr>
-            <w:r>
-              <w:rPr>
-                <w:rFonts w:asciiTheme="majorHAnsi" w:hAnsiTheme="majorHAnsi" w:cstheme="majorHAnsi"/>
-                <w:i/>
-                <w:iCs/>
-                <w:sz w:val="18"/>
-                <w:szCs w:val="18"/>
-              </w:rPr>
-              <w:t xml:space="preserve">No provision here under the Bank Guidelines.</w:t>
-            </w:r>
-          </w:p>
-        </w:tc>
-        <w:tc>
-          <w:tcPr>
-            <w:tcW w:w="5731" w:type="dxa"/>
-          </w:tcPr>
-          <w:p>
-            <w:pPr>
-              <w:pStyle w:val="BodyText"/>
-              <w:rPr>
-                <w:rFonts w:asciiTheme="majorHAnsi" w:hAnsiTheme="majorHAnsi" w:cstheme="majorHAnsi"/>
-                <w:sz w:val="18"/>
-                <w:szCs w:val="18"/>
-              </w:rPr>
-            </w:pPr>
-            <w:r>
-              <w:rPr>
-                <w:rFonts w:asciiTheme="majorHAnsi" w:hAnsiTheme="majorHAnsi" w:cstheme="majorHAnsi"/>
-                <w:highlight w:val="yellow"/>
-                <w:sz w:val="18"/>
-                <w:szCs w:val="18"/>
-              </w:rPr>
-              <w:t xml:space="preserve">written confirmation to MAS that the agreements provide MAS the rights of inspection and access in 5.9; and notification to MAS if an overseas authority seeks access to customer information, or if the access rights of the institution and MAS are restricted or denied.</w:t>
-            </w:r>
-          </w:p>
-        </w:tc>
-        <w:tc>
-          <w:tcPr>
-            <w:tcW w:w="2189" w:type="dxa"/>
-          </w:tcPr>
-          <w:p>
-            <w:pPr>
-              <w:pStyle w:val="BodyText"/>
-              <w:rPr>
-                <w:rFonts w:asciiTheme="majorHAnsi" w:hAnsiTheme="majorHAnsi" w:cstheme="majorHAnsi"/>
-                <w:sz w:val="18"/>
-                <w:szCs w:val="18"/>
-              </w:rPr>
-            </w:pPr>
-            <w:r>
-              <w:rPr>
-                <w:rFonts w:asciiTheme="majorHAnsi" w:hAnsiTheme="majorHAnsi" w:cstheme="majorHAnsi"/>
-                <w:sz w:val="18"/>
-                <w:szCs w:val="18"/>
-              </w:rPr>
               <w:t xml:space="preserve">Confirmation and notification for overseas outsourcing.</w:t>
-            </w:r>
-          </w:p>
-        </w:tc>
-      </w:tr>
-      <w:tr>
-        <w:tc>
-          <w:tcPr>
-            <w:tcW w:w="625" w:type="dxa"/>
-          </w:tcPr>
-          <w:p>
-            <w:pPr>
-              <w:pStyle w:val="BodyText"/>
-              <w:rPr>
-                <w:rFonts w:asciiTheme="majorHAnsi" w:hAnsiTheme="majorHAnsi" w:cstheme="majorHAnsi"/>
-                <w:sz w:val="18"/>
-                <w:szCs w:val="18"/>
-              </w:rPr>
-            </w:pPr>
-            <w:r>
-              <w:rPr>
-                <w:rFonts w:asciiTheme="majorHAnsi" w:hAnsiTheme="majorHAnsi" w:cstheme="majorHAnsi"/>
-                <w:sz w:val="18"/>
-                <w:szCs w:val="18"/>
-              </w:rPr>
-              <w:t xml:space="preserve">Annex 1</w:t>
-            </w:r>
-          </w:p>
-        </w:tc>
-        <w:tc>
-          <w:tcPr>
-            <w:tcW w:w="5670" w:type="dxa"/>
-          </w:tcPr>
-          <w:p>
-            <w:pPr>
-              <w:pStyle w:val="BodyText"/>
-              <w:rPr>
-                <w:rFonts w:asciiTheme="majorHAnsi" w:hAnsiTheme="majorHAnsi" w:cstheme="majorHAnsi"/>
-                <w:sz w:val="18"/>
-                <w:szCs w:val="18"/>
-              </w:rPr>
-            </w:pPr>
-            <w:r>
-              <w:rPr>
-                <w:rFonts w:asciiTheme="majorHAnsi" w:hAnsiTheme="majorHAnsi" w:cstheme="majorHAnsi"/>
-                <w:i/>
-                <w:iCs/>
-                <w:sz w:val="18"/>
-                <w:szCs w:val="18"/>
-              </w:rPr>
-              <w:t xml:space="preserve">No provision here under the Bank Guidelines.</w:t>
-            </w:r>
-          </w:p>
-        </w:tc>
-        <w:tc>
-          <w:tcPr>
-            <w:tcW w:w="5731" w:type="dxa"/>
-          </w:tcPr>
-          <w:p>
-            <w:pPr>
-              <w:pStyle w:val="BodyText"/>
-              <w:rPr>
-                <w:rFonts w:asciiTheme="majorHAnsi" w:hAnsiTheme="majorHAnsi" w:cstheme="majorHAnsi"/>
-                <w:sz w:val="18"/>
-                <w:szCs w:val="18"/>
-              </w:rPr>
-            </w:pPr>
-            <w:r>
-              <w:rPr>
-                <w:rFonts w:asciiTheme="majorHAnsi" w:hAnsiTheme="majorHAnsi" w:cstheme="majorHAnsi"/>
-                <w:highlight w:val="yellow"/>
-                <w:sz w:val="18"/>
-                <w:szCs w:val="18"/>
-              </w:rPr>
-              <w:t xml:space="preserve">1. Services wholly provided by Government Technology Agency (GovTech) or agents appointed by GovTech. The full list of services can be found at https://api.singpass.gov.sg/singpass-api-products. 2. Services that are not for the conduct of any financial business of the institution and where the service provider does not receive, handle or have access to the institution’s confidential information or customer information. Examples of such services include cleaning, gardening and pantry services including the maintenance of vending machines.</w:t>
-            </w:r>
-          </w:p>
-        </w:tc>
-        <w:tc>
-          <w:tcPr>
-            <w:tcW w:w="2189" w:type="dxa"/>
-          </w:tcPr>
-          <w:p>
-            <w:pPr>
-              <w:pStyle w:val="BodyText"/>
-              <w:rPr>
-                <w:rFonts w:asciiTheme="majorHAnsi" w:hAnsiTheme="majorHAnsi" w:cstheme="majorHAnsi"/>
-                <w:sz w:val="18"/>
-                <w:szCs w:val="18"/>
-              </w:rPr>
-            </w:pPr>
-            <w:r>
-              <w:rPr>
-                <w:rFonts w:asciiTheme="majorHAnsi" w:hAnsiTheme="majorHAnsi" w:cstheme="majorHAnsi"/>
-                <w:sz w:val="18"/>
-                <w:szCs w:val="18"/>
-              </w:rPr>
-              <w:t xml:space="preserve">Exempted outsourced services; the Bank exemption list is Annex D of the Notices.</w:t>
-            </w:r>
-          </w:p>
-        </w:tc>
-      </w:tr>
-      <w:tr>
-        <w:tc>
-          <w:tcPr>
-            <w:tcW w:w="625" w:type="dxa"/>
-          </w:tcPr>
-          <w:p>
-            <w:pPr>
-              <w:pStyle w:val="BodyText"/>
-              <w:rPr>
-                <w:rFonts w:asciiTheme="majorHAnsi" w:hAnsiTheme="majorHAnsi" w:cstheme="majorHAnsi"/>
-                <w:sz w:val="18"/>
-                <w:szCs w:val="18"/>
-              </w:rPr>
-            </w:pPr>
-            <w:r>
-              <w:rPr>
-                <w:rFonts w:asciiTheme="majorHAnsi" w:hAnsiTheme="majorHAnsi" w:cstheme="majorHAnsi"/>
-                <w:sz w:val="18"/>
-                <w:szCs w:val="18"/>
-              </w:rPr>
-              <w:t xml:space="preserve">Annex 2</w:t>
-            </w:r>
-          </w:p>
-        </w:tc>
-        <w:tc>
-          <w:tcPr>
-            <w:tcW w:w="5670" w:type="dxa"/>
-          </w:tcPr>
-          <w:p>
-            <w:pPr>
-              <w:pStyle w:val="BodyText"/>
-              <w:rPr>
-                <w:rFonts w:asciiTheme="majorHAnsi" w:hAnsiTheme="majorHAnsi" w:cstheme="majorHAnsi"/>
-                <w:sz w:val="18"/>
-                <w:szCs w:val="18"/>
-              </w:rPr>
-            </w:pPr>
-            <w:r>
-              <w:rPr>
-                <w:rFonts w:asciiTheme="majorHAnsi" w:hAnsiTheme="majorHAnsi" w:cstheme="majorHAnsi"/>
-                <w:i/>
-                <w:iCs/>
-                <w:sz w:val="18"/>
-                <w:szCs w:val="18"/>
-              </w:rPr>
-              <w:t xml:space="preserve">No provision here under the Bank Guidelines.</w:t>
-            </w:r>
-          </w:p>
-        </w:tc>
-        <w:tc>
-          <w:tcPr>
-            <w:tcW w:w="5731" w:type="dxa"/>
-          </w:tcPr>
-          <w:p>
-            <w:pPr>
-              <w:pStyle w:val="BodyText"/>
-              <w:rPr>
-                <w:rFonts w:asciiTheme="majorHAnsi" w:hAnsiTheme="majorHAnsi" w:cstheme="majorHAnsi"/>
-                <w:sz w:val="18"/>
-                <w:szCs w:val="18"/>
-              </w:rPr>
-            </w:pPr>
-            <w:r>
-              <w:rPr>
-                <w:rFonts w:asciiTheme="majorHAnsi" w:hAnsiTheme="majorHAnsi" w:cstheme="majorHAnsi"/>
-                <w:highlight w:val="yellow"/>
-                <w:sz w:val="18"/>
-                <w:szCs w:val="18"/>
-              </w:rPr>
-              <w:t xml:space="preserve">1. The following are examples of some services that, when performed by a third party, would be regarded as outsourcing arrangements for the purposes of these Guidelines although they are not exhaustive: (a) application processing (e.g. loan origination, credit cards); (b) white-labelling arrangements such as for trading and hedging facilities; (c) middle and back office operations (e.g. electronic funds transfer, payroll processing, custody operations, quality control, purchasing, maintaining the register of participants of a collective investment scheme (CIS) and sending of accounts and reports to CIS participants, order processing, trade settlement and risk management); (d) business continuity and disaster recovery functions and activities; (e) claims administration (e.g. loan negotiations, loan processing, collateral management, collection of bad loans); (f) document processing (e.g. cheques, credit card and bill payments, bank statements, other corporate payments, customer statement printing); (g) information systems hosting (e.g. software-as-a-service, platform-as-a-service, infrastructure-as-a-service); (h) information systems management and maintenance (e.g. data entry and processing, data centres, data centre facilities management, end-user support, local area networks management, help desks, information technology security operations); (i) investment management (e.g. discretionary portfolio management, cash management); (j) management of policy issuance and claims operations by managing agents; (k) manpower management (e.g. benefits and compensation administration, staff appointment, training and development); (l) marketing and research (e.g. product development, data warehousing and mining, media relations, call centres, telemarketing); (m) professional services related to the business activities of the institution (e.g. accounting, internal audit, actuarial, compliance); (n) support services related to archival, storage and destruction of data and records; and (o) calculation of financial benchmarks.</w:t>
-            </w:r>
-          </w:p>
-          <w:p>
-            <w:pPr>
-              <w:pStyle w:val="BodyText"/>
-              <w:rPr>
-                <w:rFonts w:asciiTheme="majorHAnsi" w:hAnsiTheme="majorHAnsi" w:cstheme="majorHAnsi"/>
-                <w:sz w:val="18"/>
-                <w:szCs w:val="18"/>
-              </w:rPr>
-            </w:pPr>
-            <w:r>
-              <w:rPr>
-                <w:rFonts w:asciiTheme="majorHAnsi" w:hAnsiTheme="majorHAnsi" w:cstheme="majorHAnsi"/>
-                <w:highlight w:val="yellow"/>
-                <w:sz w:val="18"/>
-                <w:szCs w:val="18"/>
-              </w:rPr>
-              <w:t xml:space="preserve">2. The following arrangements would generally not be considered outsourcing arrangements: (a) Arrangements in which certain industry characteristics require the use of third-party providers — (i) maintenance of custody account with specified custodians as required under Regulation 27 of the Securities and Futures (Licensing and Conduct of Business) Regulations; (ii) telecommunication services and public utilities (e.g. electricity, SMS gateway services); (iii) postal services; (iv) market information services (e.g. Bloomberg, Moody’s, Standard &amp; Poor’s); (v) common network infrastructure (e.g. Visa, MasterCard, MEPS+); (vi) clearing and settlement arrangements between clearing houses and settlement institutions and their members, and similar arrangements between members and non-members; (vii) global financial messaging infrastructure which are subject to oversight by relevant regulators (e.g. SWIFT); and (viii) correspondent banking services. (b) Introducer arrangements and arrangements that pertain to principal-agent relationships — (i) sale of insurance policies by agents, and ancillary services relating to those sales; (ii) acceptance of business by underwriting agents; and (iii) introducer arrangements (where the institution does not have any contractual relationship with customers). (c) Arrangements that the institution is not legally or administratively able to provide — (i) statutory audit and independent audit assessments; (ii) discrete advisory services (e.g. legal opinions, independent appraisals, trustees in bankruptcy, loss adjuster); and independent consulting (e.g. consultancy services for areas which the institution does not have the internal expertise to conduct)</w:t>
-            </w:r>
-          </w:p>
-        </w:tc>
-        <w:tc>
-          <w:tcPr>
-            <w:tcW w:w="2189" w:type="dxa"/>
-          </w:tcPr>
-          <w:p>
-            <w:pPr>
-              <w:pStyle w:val="BodyText"/>
-              <w:rPr>
-                <w:rFonts w:asciiTheme="majorHAnsi" w:hAnsiTheme="majorHAnsi" w:cstheme="majorHAnsi"/>
-                <w:sz w:val="18"/>
-                <w:szCs w:val="18"/>
-              </w:rPr>
-            </w:pPr>
-            <w:r>
-              <w:rPr>
-                <w:rFonts w:asciiTheme="majorHAnsi" w:hAnsiTheme="majorHAnsi" w:cstheme="majorHAnsi"/>
-                <w:sz w:val="18"/>
-                <w:szCs w:val="18"/>
-              </w:rPr>
-              <w:t xml:space="preserve">Examples of outsourcing arrangements; for Banks the equivalent is Annexes A–C of Notice 658.</w:t>
-            </w:r>
-          </w:p>
-        </w:tc>
-      </w:tr>
-      <w:tr>
-        <w:tc>
-          <w:tcPr>
-            <w:tcW w:w="625" w:type="dxa"/>
-          </w:tcPr>
-          <w:p>
-            <w:pPr>
-              <w:pStyle w:val="BodyText"/>
-              <w:rPr>
-                <w:rFonts w:asciiTheme="majorHAnsi" w:hAnsiTheme="majorHAnsi" w:cstheme="majorHAnsi"/>
-                <w:sz w:val="18"/>
-                <w:szCs w:val="18"/>
-              </w:rPr>
-            </w:pPr>
-            <w:r>
-              <w:rPr>
-                <w:rFonts w:asciiTheme="majorHAnsi" w:hAnsiTheme="majorHAnsi" w:cstheme="majorHAnsi"/>
-                <w:sz w:val="18"/>
-                <w:szCs w:val="18"/>
-              </w:rPr>
-              <w:t xml:space="preserve">Annex 4</w:t>
-            </w:r>
-          </w:p>
-        </w:tc>
-        <w:tc>
-          <w:tcPr>
-            <w:tcW w:w="5670" w:type="dxa"/>
-          </w:tcPr>
-          <w:p>
-            <w:pPr>
-              <w:pStyle w:val="BodyText"/>
-              <w:rPr>
-                <w:rFonts w:asciiTheme="majorHAnsi" w:hAnsiTheme="majorHAnsi" w:cstheme="majorHAnsi"/>
-                <w:sz w:val="18"/>
-                <w:szCs w:val="18"/>
-              </w:rPr>
-            </w:pPr>
-            <w:r>
-              <w:rPr>
-                <w:rFonts w:asciiTheme="majorHAnsi" w:hAnsiTheme="majorHAnsi" w:cstheme="majorHAnsi"/>
-                <w:i/>
-                <w:iCs/>
-                <w:sz w:val="18"/>
-                <w:szCs w:val="18"/>
-              </w:rPr>
-              <w:t xml:space="preserve">No provision here under the Bank Guidelines.</w:t>
-            </w:r>
-          </w:p>
-        </w:tc>
-        <w:tc>
-          <w:tcPr>
-            <w:tcW w:w="5731" w:type="dxa"/>
-          </w:tcPr>
-          <w:p>
-            <w:pPr>
-              <w:pStyle w:val="BodyText"/>
-              <w:rPr>
-                <w:rFonts w:asciiTheme="majorHAnsi" w:hAnsiTheme="majorHAnsi" w:cstheme="majorHAnsi"/>
-                <w:sz w:val="18"/>
-                <w:szCs w:val="18"/>
-              </w:rPr>
-            </w:pPr>
-            <w:r>
-              <w:rPr>
-                <w:rFonts w:asciiTheme="majorHAnsi" w:hAnsiTheme="majorHAnsi" w:cstheme="majorHAnsi"/>
-                <w:highlight w:val="yellow"/>
-                <w:sz w:val="18"/>
-                <w:szCs w:val="18"/>
-              </w:rPr>
-              <w:t xml:space="preserve">1. An institution should maintain an updated register of all existing outsourcing arrangements in the format as per the template available from MAS website.</w:t>
-            </w:r>
-          </w:p>
-        </w:tc>
-        <w:tc>
-          <w:tcPr>
-            <w:tcW w:w="2189" w:type="dxa"/>
-          </w:tcPr>
-          <w:p>
-            <w:pPr>
-              <w:pStyle w:val="BodyText"/>
-              <w:rPr>
-                <w:rFonts w:asciiTheme="majorHAnsi" w:hAnsiTheme="majorHAnsi" w:cstheme="majorHAnsi"/>
-                <w:sz w:val="18"/>
-                <w:szCs w:val="18"/>
-              </w:rPr>
-            </w:pPr>
-            <w:r>
-              <w:rPr>
-                <w:rFonts w:asciiTheme="majorHAnsi" w:hAnsiTheme="majorHAnsi" w:cstheme="majorHAnsi"/>
-                <w:sz w:val="18"/>
-                <w:szCs w:val="18"/>
-              </w:rPr>
-              <w:t xml:space="preserve">Register of outsourcing arrangements.</w:t>
             </w:r>
           </w:p>
         </w:tc>

</xml_diff>